<commit_message>
Update GharKoHisaabDocumentation.docx with exhaustive mathematical definitions, codebase algorithms, and page breaks
</commit_message>
<xml_diff>
--- a/GharKoHisaabDocumentation.docx
+++ b/GharKoHisaabDocumentation.docx
@@ -112,7 +112,7 @@
           <w:i/>
           <w:iCs/>
         </w:rPr>
-        <w:t xml:space="preserve">Model API Specifications</w:t>
+        <w:t xml:space="preserve">Database Schema Details</w:t>
       </w:r>
     </w:p>
     <w:p>
@@ -128,6 +128,94 @@
           <w:i/>
           <w:iCs/>
         </w:rPr>
+        <w:t xml:space="preserve">Core Codebase Algorithms</w:t>
+      </w:r>
+    </w:p>
+    <w:p>
+      <w:pPr>
+        <w:pStyle w:val="Compact"/>
+        <w:numPr>
+          <w:ilvl w:val="2"/>
+          <w:numId w:val="1003"/>
+        </w:numPr>
+      </w:pPr>
+      <w:r>
+        <w:t xml:space="preserve">Bikram Sambat Date Clamping &amp; Normalization Algorithm</w:t>
+      </w:r>
+    </w:p>
+    <w:p>
+      <w:pPr>
+        <w:pStyle w:val="Compact"/>
+        <w:numPr>
+          <w:ilvl w:val="2"/>
+          <w:numId w:val="1003"/>
+        </w:numPr>
+      </w:pPr>
+      <w:r>
+        <w:t xml:space="preserve">Bikram Sambat Cycle Boundary Billing Algorithm</w:t>
+      </w:r>
+    </w:p>
+    <w:p>
+      <w:pPr>
+        <w:pStyle w:val="Compact"/>
+        <w:numPr>
+          <w:ilvl w:val="2"/>
+          <w:numId w:val="1003"/>
+        </w:numPr>
+      </w:pPr>
+      <w:r>
+        <w:t xml:space="preserve">Rent Pro-Ration Math</w:t>
+      </w:r>
+    </w:p>
+    <w:p>
+      <w:pPr>
+        <w:pStyle w:val="Compact"/>
+        <w:numPr>
+          <w:ilvl w:val="2"/>
+          <w:numId w:val="1003"/>
+        </w:numPr>
+      </w:pPr>
+      <w:r>
+        <w:t xml:space="preserve">Sub-Meter Electricity Billing Algorithm</w:t>
+      </w:r>
+    </w:p>
+    <w:p>
+      <w:pPr>
+        <w:pStyle w:val="Compact"/>
+        <w:numPr>
+          <w:ilvl w:val="2"/>
+          <w:numId w:val="1003"/>
+        </w:numPr>
+      </w:pPr>
+      <w:r>
+        <w:t xml:space="preserve">Double-Confirmation Cash Flow &amp; OTP Verification Algorithm</w:t>
+      </w:r>
+    </w:p>
+    <w:p>
+      <w:pPr>
+        <w:pStyle w:val="Compact"/>
+        <w:numPr>
+          <w:ilvl w:val="2"/>
+          <w:numId w:val="1003"/>
+        </w:numPr>
+      </w:pPr>
+      <w:r>
+        <w:t xml:space="preserve">Star-Rating Aggregation &amp; Reputation Score Recalculation Algorithm</w:t>
+      </w:r>
+    </w:p>
+    <w:p>
+      <w:pPr>
+        <w:pStyle w:val="Compact"/>
+        <w:numPr>
+          <w:ilvl w:val="1"/>
+          <w:numId w:val="1002"/>
+        </w:numPr>
+      </w:pPr>
+      <w:r>
+        <w:rPr>
+          <w:i/>
+          <w:iCs/>
+        </w:rPr>
         <w:t xml:space="preserve">File-by-File Codebase Structure &amp; Explanations</w:t>
       </w:r>
     </w:p>
@@ -152,7 +240,7 @@
         <w:pStyle w:val="Compact"/>
         <w:numPr>
           <w:ilvl w:val="1"/>
-          <w:numId w:val="1003"/>
+          <w:numId w:val="1004"/>
         </w:numPr>
       </w:pPr>
       <w:r>
@@ -168,7 +256,7 @@
         <w:pStyle w:val="Compact"/>
         <w:numPr>
           <w:ilvl w:val="1"/>
-          <w:numId w:val="1003"/>
+          <w:numId w:val="1004"/>
         </w:numPr>
       </w:pPr>
       <w:r>
@@ -176,7 +264,7 @@
           <w:i/>
           <w:iCs/>
         </w:rPr>
-        <w:t xml:space="preserve">API Testing Logs</w:t>
+        <w:t xml:space="preserve">API Database logs &amp; Queries</w:t>
       </w:r>
     </w:p>
     <w:p>
@@ -184,7 +272,7 @@
         <w:pStyle w:val="Compact"/>
         <w:numPr>
           <w:ilvl w:val="1"/>
-          <w:numId w:val="1003"/>
+          <w:numId w:val="1004"/>
         </w:numPr>
       </w:pPr>
       <w:r>
@@ -375,7 +463,7 @@
         <w:pStyle w:val="Compact"/>
         <w:numPr>
           <w:ilvl w:val="0"/>
-          <w:numId w:val="1004"/>
+          <w:numId w:val="1005"/>
         </w:numPr>
       </w:pPr>
       <w:r>
@@ -387,253 +475,6 @@
       </w:r>
       <w:r>
         <w:t xml:space="preserve">: Build a React Native application integrating a local SQLite database that provides dedicated modules for property setup, sub-meter utility entry, digital agreement drafting with dual signpads, checkout settlements, and tenant-landlord reviews.</w:t>
-      </w:r>
-    </w:p>
-    <w:p>
-      <w:pPr>
-        <w:pStyle w:val="Compact"/>
-        <w:numPr>
-          <w:ilvl w:val="0"/>
-          <w:numId w:val="1004"/>
-        </w:numPr>
-      </w:pPr>
-      <w:r>
-        <w:rPr>
-          <w:b/>
-          <w:bCs/>
-        </w:rPr>
-        <w:t xml:space="preserve">Measurable</w:t>
-      </w:r>
-      <w:r>
-        <w:t xml:space="preserve">: Validate system workflows through automated Jest test suites and E2E browser verification runs, targeting 100% compilation safety and test coverage pass rates.</w:t>
-      </w:r>
-    </w:p>
-    <w:p>
-      <w:pPr>
-        <w:pStyle w:val="Compact"/>
-        <w:numPr>
-          <w:ilvl w:val="0"/>
-          <w:numId w:val="1004"/>
-        </w:numPr>
-      </w:pPr>
-      <w:r>
-        <w:rPr>
-          <w:b/>
-          <w:bCs/>
-        </w:rPr>
-        <w:t xml:space="preserve">Achievable</w:t>
-      </w:r>
-      <w:r>
-        <w:t xml:space="preserve">: Implement iterative feature phases (property wizard, billing engines, OTP verifiers, and reviews) mapping directly to custom database entities and UI screens.</w:t>
-      </w:r>
-    </w:p>
-    <w:p>
-      <w:pPr>
-        <w:pStyle w:val="Compact"/>
-        <w:numPr>
-          <w:ilvl w:val="0"/>
-          <w:numId w:val="1004"/>
-        </w:numPr>
-      </w:pPr>
-      <w:r>
-        <w:rPr>
-          <w:b/>
-          <w:bCs/>
-        </w:rPr>
-        <w:t xml:space="preserve">Relevant</w:t>
-      </w:r>
-      <w:r>
-        <w:t xml:space="preserve">: Solve local offline network dropouts by deploying a local storage connection layer (using WatermelonDB/SQLite) that preserves operation logs locally before synchronizing to Supabase cloud backends.</w:t>
-      </w:r>
-    </w:p>
-    <w:p>
-      <w:pPr>
-        <w:pStyle w:val="Compact"/>
-        <w:numPr>
-          <w:ilvl w:val="0"/>
-          <w:numId w:val="1004"/>
-        </w:numPr>
-      </w:pPr>
-      <w:r>
-        <w:rPr>
-          <w:b/>
-          <w:bCs/>
-        </w:rPr>
-        <w:t xml:space="preserve">Time-bound</w:t>
-      </w:r>
-      <w:r>
-        <w:t xml:space="preserve">: Accomplish design, development, debugging, and E2E verification of all feature modules within the designated development cycle.</w:t>
-      </w:r>
-    </w:p>
-    <w:p>
-      <w:r>
-        <w:br w:type="page"/>
-      </w:r>
-    </w:p>
-    <w:bookmarkEnd w:id="13"/>
-    <w:bookmarkEnd w:id="14"/>
-    <w:bookmarkStart w:id="25" w:name="technical-documentation"/>
-    <w:p>
-      <w:pPr>
-        <w:pStyle w:val="Heading2"/>
-      </w:pPr>
-      <w:r>
-        <w:t xml:space="preserve">3. Technical Documentation</w:t>
-      </w:r>
-    </w:p>
-    <w:bookmarkStart w:id="15" w:name="frameworks-engines-and-libraries"/>
-    <w:p>
-      <w:pPr>
-        <w:pStyle w:val="Heading3"/>
-      </w:pPr>
-      <w:r>
-        <w:t xml:space="preserve">Frameworks, Engines, and Libraries</w:t>
-      </w:r>
-    </w:p>
-    <w:p>
-      <w:pPr>
-        <w:pStyle w:val="FirstParagraph"/>
-      </w:pPr>
-      <w:r>
-        <w:t xml:space="preserve">The application leverages a robust technical stack to support mobile and web compilation:</w:t>
-      </w:r>
-      <w:r>
-        <w:t xml:space="preserve"> </w:t>
-      </w:r>
-      <w:r>
-        <w:t xml:space="preserve">*</w:t>
-      </w:r>
-      <w:r>
-        <w:t xml:space="preserve"> </w:t>
-      </w:r>
-      <w:r>
-        <w:rPr>
-          <w:b/>
-          <w:bCs/>
-        </w:rPr>
-        <w:t xml:space="preserve">React Native &amp; Expo SDK 57</w:t>
-      </w:r>
-      <w:r>
-        <w:t xml:space="preserve">: Serves as the cross-platform frontend compiling to iOS, Android, and Web viewports. Uses the high-performance Hermes JavaScript engine.</w:t>
-      </w:r>
-      <w:r>
-        <w:t xml:space="preserve"> </w:t>
-      </w:r>
-      <w:r>
-        <w:t xml:space="preserve">*</w:t>
-      </w:r>
-      <w:r>
-        <w:t xml:space="preserve"> </w:t>
-      </w:r>
-      <w:r>
-        <w:rPr>
-          <w:b/>
-          <w:bCs/>
-        </w:rPr>
-        <w:t xml:space="preserve">Drizzle ORM &amp; Expo SQLite</w:t>
-      </w:r>
-      <w:r>
-        <w:t xml:space="preserve">: Provides type-safe relational mappings over local SQLite storage.</w:t>
-      </w:r>
-      <w:r>
-        <w:t xml:space="preserve"> </w:t>
-      </w:r>
-      <w:r>
-        <w:t xml:space="preserve">*</w:t>
-      </w:r>
-      <w:r>
-        <w:t xml:space="preserve"> </w:t>
-      </w:r>
-      <w:r>
-        <w:rPr>
-          <w:b/>
-          <w:bCs/>
-        </w:rPr>
-        <w:t xml:space="preserve">nepali-date-converter</w:t>
-      </w:r>
-      <w:r>
-        <w:t xml:space="preserve">: Translates Gregorian Dates (A.D.) to Bikram Sambat (B.S.) to calculate monthly anniversaries and pro-rated billing terms.</w:t>
-      </w:r>
-      <w:r>
-        <w:t xml:space="preserve"> </w:t>
-      </w:r>
-      <w:r>
-        <w:t xml:space="preserve">*</w:t>
-      </w:r>
-      <w:r>
-        <w:t xml:space="preserve"> </w:t>
-      </w:r>
-      <w:r>
-        <w:rPr>
-          <w:b/>
-          <w:bCs/>
-        </w:rPr>
-        <w:t xml:space="preserve">Expo Image Picker &amp; Camera</w:t>
-      </w:r>
-      <w:r>
-        <w:t xml:space="preserve">: Handles KYC document collection and payment receipt uploads.</w:t>
-      </w:r>
-      <w:r>
-        <w:t xml:space="preserve"> </w:t>
-      </w:r>
-      <w:r>
-        <w:t xml:space="preserve">*</w:t>
-      </w:r>
-      <w:r>
-        <w:t xml:space="preserve"> </w:t>
-      </w:r>
-      <w:r>
-        <w:rPr>
-          <w:b/>
-          <w:bCs/>
-        </w:rPr>
-        <w:t xml:space="preserve">Jest &amp; Testing Library</w:t>
-      </w:r>
-      <w:r>
-        <w:t xml:space="preserve">: Unit and integration test frameworks verifying calculations and UI flows.</w:t>
-      </w:r>
-    </w:p>
-    <w:p>
-      <w:r>
-        <w:pict>
-          <v:rect style="width:0;height:1.5pt" o:hralign="center" o:hrstd="t" o:hr="t"/>
-        </w:pict>
-      </w:r>
-    </w:p>
-    <w:bookmarkEnd w:id="15"/>
-    <w:bookmarkStart w:id="23" w:name="model-api-specifications"/>
-    <w:p>
-      <w:pPr>
-        <w:pStyle w:val="Heading3"/>
-      </w:pPr>
-      <w:r>
-        <w:t xml:space="preserve">Model API Specifications</w:t>
-      </w:r>
-    </w:p>
-    <w:p>
-      <w:pPr>
-        <w:pStyle w:val="FirstParagraph"/>
-      </w:pPr>
-      <w:r>
-        <w:t xml:space="preserve">The system structures business logic through modular database query APIs:</w:t>
-      </w:r>
-    </w:p>
-    <w:bookmarkStart w:id="16" w:name="X39c20761057c6c164c33850f25d4fb3f83bcdce"/>
-    <w:p>
-      <w:pPr>
-        <w:pStyle w:val="Heading4"/>
-      </w:pPr>
-      <w:r>
-        <w:t xml:space="preserve">1. Property API (</w:t>
-      </w:r>
-      <w:r>
-        <w:rPr>
-          <w:rStyle w:val="VerbatimChar"/>
-        </w:rPr>
-        <w:t xml:space="preserve">src/features/property/PropertyModel.ts</w:t>
-      </w:r>
-      <w:r>
-        <w:t xml:space="preserve">)</w:t>
       </w:r>
     </w:p>
     <w:p>
@@ -646,42 +487,13 @@
       </w:pPr>
       <w:r>
         <w:rPr>
-          <w:rStyle w:val="VerbatimChar"/>
-        </w:rPr>
-        <w:t xml:space="preserve">initPropertySchema()</w:t>
-      </w:r>
-      <w:r>
-        <w:t xml:space="preserve">: Bootstraps</w:t>
-      </w:r>
-      <w:r>
-        <w:t xml:space="preserve"> </w:t>
-      </w:r>
-      <w:r>
-        <w:rPr>
-          <w:rStyle w:val="VerbatimChar"/>
-        </w:rPr>
-        <w:t xml:space="preserve">houses</w:t>
-      </w:r>
-      <w:r>
-        <w:t xml:space="preserve"> </w:t>
-      </w:r>
-      <w:r>
-        <w:t xml:space="preserve">and</w:t>
-      </w:r>
-      <w:r>
-        <w:t xml:space="preserve"> </w:t>
-      </w:r>
-      <w:r>
-        <w:rPr>
-          <w:rStyle w:val="VerbatimChar"/>
-        </w:rPr>
-        <w:t xml:space="preserve">rooms</w:t>
-      </w:r>
-      <w:r>
-        <w:t xml:space="preserve"> </w:t>
-      </w:r>
-      <w:r>
-        <w:t xml:space="preserve">tables in SQLite.</w:t>
+          <w:b/>
+          <w:bCs/>
+        </w:rPr>
+        <w:t xml:space="preserve">Measurable</w:t>
+      </w:r>
+      <w:r>
+        <w:t xml:space="preserve">: Validate system workflows through automated Jest test suites and E2E browser verification runs, targeting 100% compilation safety and test coverage pass rates.</w:t>
       </w:r>
     </w:p>
     <w:p>
@@ -694,24 +506,13 @@
       </w:pPr>
       <w:r>
         <w:rPr>
-          <w:rStyle w:val="VerbatimChar"/>
-        </w:rPr>
-        <w:t xml:space="preserve">addHouse(house)</w:t>
-      </w:r>
-      <w:r>
-        <w:t xml:space="preserve">: Saves a new house. Name defaults to</w:t>
-      </w:r>
-      <w:r>
-        <w:t xml:space="preserve"> </w:t>
-      </w:r>
-      <w:r>
-        <w:rPr>
-          <w:rStyle w:val="VerbatimChar"/>
-        </w:rPr>
-        <w:t xml:space="preserve">{HousekeeperName}'s House {Count}</w:t>
-      </w:r>
-      <w:r>
-        <w:t xml:space="preserve">.</w:t>
+          <w:b/>
+          <w:bCs/>
+        </w:rPr>
+        <w:t xml:space="preserve">Achievable</w:t>
+      </w:r>
+      <w:r>
+        <w:t xml:space="preserve">: Implement iterative feature phases (property wizard, billing engines, OTP verifiers, and reviews) mapping directly to custom database entities and UI screens.</w:t>
       </w:r>
     </w:p>
     <w:p>
@@ -724,12 +525,13 @@
       </w:pPr>
       <w:r>
         <w:rPr>
-          <w:rStyle w:val="VerbatimChar"/>
-        </w:rPr>
-        <w:t xml:space="preserve">addRoom(room)</w:t>
-      </w:r>
-      <w:r>
-        <w:t xml:space="preserve">: Adds a room record linked to a house.</w:t>
+          <w:b/>
+          <w:bCs/>
+        </w:rPr>
+        <w:t xml:space="preserve">Relevant</w:t>
+      </w:r>
+      <w:r>
+        <w:t xml:space="preserve">: Solve local offline network dropouts by deploying a local storage connection layer (using WatermelonDB/SQLite) that preserves operation logs locally before synchronizing to Supabase cloud backends.</w:t>
       </w:r>
     </w:p>
     <w:p>
@@ -742,31 +544,1707 @@
       </w:pPr>
       <w:r>
         <w:rPr>
+          <w:b/>
+          <w:bCs/>
+        </w:rPr>
+        <w:t xml:space="preserve">Time-bound</w:t>
+      </w:r>
+      <w:r>
+        <w:t xml:space="preserve">: Accomplish design, development, debugging, and E2E verification of all feature modules within the designated development cycle.</w:t>
+      </w:r>
+    </w:p>
+    <w:p>
+      <w:r>
+        <w:br w:type="page"/>
+      </w:r>
+    </w:p>
+    <w:bookmarkEnd w:id="13"/>
+    <w:bookmarkEnd w:id="14"/>
+    <w:bookmarkStart w:id="25" w:name="technical-documentation"/>
+    <w:p>
+      <w:pPr>
+        <w:pStyle w:val="Heading2"/>
+      </w:pPr>
+      <w:r>
+        <w:t xml:space="preserve">3. Technical Documentation</w:t>
+      </w:r>
+    </w:p>
+    <w:bookmarkStart w:id="15" w:name="frameworks-engines-and-libraries"/>
+    <w:p>
+      <w:pPr>
+        <w:pStyle w:val="Heading3"/>
+      </w:pPr>
+      <w:r>
+        <w:t xml:space="preserve">Frameworks, Engines, and Libraries</w:t>
+      </w:r>
+    </w:p>
+    <w:p>
+      <w:pPr>
+        <w:pStyle w:val="FirstParagraph"/>
+      </w:pPr>
+      <w:r>
+        <w:t xml:space="preserve">The application leverages a robust technical stack to support mobile and web compilation:</w:t>
+      </w:r>
+      <w:r>
+        <w:t xml:space="preserve"> </w:t>
+      </w:r>
+      <w:r>
+        <w:t xml:space="preserve">*</w:t>
+      </w:r>
+      <w:r>
+        <w:t xml:space="preserve"> </w:t>
+      </w:r>
+      <w:r>
+        <w:rPr>
+          <w:b/>
+          <w:bCs/>
+        </w:rPr>
+        <w:t xml:space="preserve">React Native &amp; Expo SDK 57</w:t>
+      </w:r>
+      <w:r>
+        <w:t xml:space="preserve">: Serves as the cross-platform frontend compiling to iOS, Android, and Web viewports. Uses the high-performance Hermes JavaScript engine.</w:t>
+      </w:r>
+      <w:r>
+        <w:t xml:space="preserve"> </w:t>
+      </w:r>
+      <w:r>
+        <w:t xml:space="preserve">*</w:t>
+      </w:r>
+      <w:r>
+        <w:t xml:space="preserve"> </w:t>
+      </w:r>
+      <w:r>
+        <w:rPr>
+          <w:b/>
+          <w:bCs/>
+        </w:rPr>
+        <w:t xml:space="preserve">Drizzle ORM &amp; Expo SQLite</w:t>
+      </w:r>
+      <w:r>
+        <w:t xml:space="preserve">: Provides type-safe relational mappings over local SQLite storage.</w:t>
+      </w:r>
+      <w:r>
+        <w:t xml:space="preserve"> </w:t>
+      </w:r>
+      <w:r>
+        <w:t xml:space="preserve">*</w:t>
+      </w:r>
+      <w:r>
+        <w:t xml:space="preserve"> </w:t>
+      </w:r>
+      <w:r>
+        <w:rPr>
+          <w:b/>
+          <w:bCs/>
+        </w:rPr>
+        <w:t xml:space="preserve">nepali-date-converter</w:t>
+      </w:r>
+      <w:r>
+        <w:t xml:space="preserve">: Translates Gregorian Dates (A.D.) to Bikram Sambat (B.S.) to calculate monthly anniversaries and pro-rated billing terms.</w:t>
+      </w:r>
+      <w:r>
+        <w:t xml:space="preserve"> </w:t>
+      </w:r>
+      <w:r>
+        <w:t xml:space="preserve">*</w:t>
+      </w:r>
+      <w:r>
+        <w:t xml:space="preserve"> </w:t>
+      </w:r>
+      <w:r>
+        <w:rPr>
+          <w:b/>
+          <w:bCs/>
+        </w:rPr>
+        <w:t xml:space="preserve">Expo Image Picker &amp; Camera</w:t>
+      </w:r>
+      <w:r>
+        <w:t xml:space="preserve">: Handles KYC document collection and payment receipt uploads.</w:t>
+      </w:r>
+      <w:r>
+        <w:t xml:space="preserve"> </w:t>
+      </w:r>
+      <w:r>
+        <w:t xml:space="preserve">*</w:t>
+      </w:r>
+      <w:r>
+        <w:t xml:space="preserve"> </w:t>
+      </w:r>
+      <w:r>
+        <w:rPr>
+          <w:b/>
+          <w:bCs/>
+        </w:rPr>
+        <w:t xml:space="preserve">Jest &amp; Testing Library</w:t>
+      </w:r>
+      <w:r>
+        <w:t xml:space="preserve">: Unit and integration test frameworks verifying calculations and UI flows.</w:t>
+      </w:r>
+    </w:p>
+    <w:p>
+      <w:r>
+        <w:pict>
+          <v:rect style="width:0;height:1.5pt" o:hralign="center" o:hrstd="t" o:hr="t"/>
+        </w:pict>
+      </w:r>
+    </w:p>
+    <w:bookmarkEnd w:id="15"/>
+    <w:bookmarkStart w:id="16" w:name="database-schema-details"/>
+    <w:p>
+      <w:pPr>
+        <w:pStyle w:val="Heading3"/>
+      </w:pPr>
+      <w:r>
+        <w:t xml:space="preserve">Database Schema Details</w:t>
+      </w:r>
+    </w:p>
+    <w:p>
+      <w:pPr>
+        <w:pStyle w:val="FirstParagraph"/>
+      </w:pPr>
+      <w:r>
+        <w:t xml:space="preserve">The application’s schema is defined using Drizzle ORM to generate migrations and enforce SQLite constraints:</w:t>
+      </w:r>
+      <w:r>
+        <w:t xml:space="preserve"> </w:t>
+      </w:r>
+      <w:r>
+        <w:t xml:space="preserve">-</w:t>
+      </w:r>
+      <w:r>
+        <w:t xml:space="preserve"> </w:t>
+      </w:r>
+      <w:r>
+        <w:rPr>
           <w:rStyle w:val="VerbatimChar"/>
-        </w:rPr>
-        <w:t xml:space="preserve">getHousesWithRooms()</w:t>
-      </w:r>
-      <w:r>
-        <w:t xml:space="preserve">: Queries houses and joins their child rooms.</w:t>
+          <w:b/>
+          <w:bCs/>
+        </w:rPr>
+        <w:t xml:space="preserve">houses</w:t>
+      </w:r>
+      <w:r>
+        <w:t xml:space="preserve">: Housekeeper properties. Columns include:</w:t>
+      </w:r>
+      <w:r>
+        <w:t xml:space="preserve"> </w:t>
+      </w:r>
+      <w:r>
+        <w:rPr>
+          <w:rStyle w:val="VerbatimChar"/>
+        </w:rPr>
+        <w:t xml:space="preserve">id</w:t>
+      </w:r>
+      <w:r>
+        <w:t xml:space="preserve"> </w:t>
+      </w:r>
+      <w:r>
+        <w:t xml:space="preserve">(primary key UUID),</w:t>
+      </w:r>
+      <w:r>
+        <w:t xml:space="preserve"> </w:t>
+      </w:r>
+      <w:r>
+        <w:rPr>
+          <w:rStyle w:val="VerbatimChar"/>
+        </w:rPr>
+        <w:t xml:space="preserve">housekeeper_name</w:t>
+      </w:r>
+      <w:r>
+        <w:t xml:space="preserve"> </w:t>
+      </w:r>
+      <w:r>
+        <w:t xml:space="preserve">(not null text),</w:t>
+      </w:r>
+      <w:r>
+        <w:t xml:space="preserve"> </w:t>
+      </w:r>
+      <w:r>
+        <w:rPr>
+          <w:rStyle w:val="VerbatimChar"/>
+        </w:rPr>
+        <w:t xml:space="preserve">name</w:t>
+      </w:r>
+      <w:r>
+        <w:t xml:space="preserve"> </w:t>
+      </w:r>
+      <w:r>
+        <w:t xml:space="preserve">(default house name), and</w:t>
+      </w:r>
+      <w:r>
+        <w:t xml:space="preserve"> </w:t>
+      </w:r>
+      <w:r>
+        <w:rPr>
+          <w:rStyle w:val="VerbatimChar"/>
+        </w:rPr>
+        <w:t xml:space="preserve">address</w:t>
+      </w:r>
+      <w:r>
+        <w:t xml:space="preserve"> </w:t>
+      </w:r>
+      <w:r>
+        <w:t xml:space="preserve">(text).</w:t>
+      </w:r>
+      <w:r>
+        <w:t xml:space="preserve"> </w:t>
+      </w:r>
+      <w:r>
+        <w:t xml:space="preserve">-</w:t>
+      </w:r>
+      <w:r>
+        <w:t xml:space="preserve"> </w:t>
+      </w:r>
+      <w:r>
+        <w:rPr>
+          <w:rStyle w:val="VerbatimChar"/>
+          <w:b/>
+          <w:bCs/>
+        </w:rPr>
+        <w:t xml:space="preserve">rooms</w:t>
+      </w:r>
+      <w:r>
+        <w:t xml:space="preserve">: Individual rooms mapped to a house. Columns include:</w:t>
+      </w:r>
+      <w:r>
+        <w:t xml:space="preserve"> </w:t>
+      </w:r>
+      <w:r>
+        <w:rPr>
+          <w:rStyle w:val="VerbatimChar"/>
+        </w:rPr>
+        <w:t xml:space="preserve">id</w:t>
+      </w:r>
+      <w:r>
+        <w:t xml:space="preserve"> </w:t>
+      </w:r>
+      <w:r>
+        <w:t xml:space="preserve">(primary key UUID),</w:t>
+      </w:r>
+      <w:r>
+        <w:t xml:space="preserve"> </w:t>
+      </w:r>
+      <w:r>
+        <w:rPr>
+          <w:rStyle w:val="VerbatimChar"/>
+        </w:rPr>
+        <w:t xml:space="preserve">house_id</w:t>
+      </w:r>
+      <w:r>
+        <w:t xml:space="preserve"> </w:t>
+      </w:r>
+      <w:r>
+        <w:t xml:space="preserve">(foreign key to houses),</w:t>
+      </w:r>
+      <w:r>
+        <w:t xml:space="preserve"> </w:t>
+      </w:r>
+      <w:r>
+        <w:rPr>
+          <w:rStyle w:val="VerbatimChar"/>
+        </w:rPr>
+        <w:t xml:space="preserve">room_number</w:t>
+      </w:r>
+      <w:r>
+        <w:t xml:space="preserve"> </w:t>
+      </w:r>
+      <w:r>
+        <w:t xml:space="preserve">(text),</w:t>
+      </w:r>
+      <w:r>
+        <w:t xml:space="preserve"> </w:t>
+      </w:r>
+      <w:r>
+        <w:rPr>
+          <w:rStyle w:val="VerbatimChar"/>
+        </w:rPr>
+        <w:t xml:space="preserve">base_rent</w:t>
+      </w:r>
+      <w:r>
+        <w:t xml:space="preserve"> </w:t>
+      </w:r>
+      <w:r>
+        <w:t xml:space="preserve">(real, defaults to 0), and</w:t>
+      </w:r>
+      <w:r>
+        <w:t xml:space="preserve"> </w:t>
+      </w:r>
+      <w:r>
+        <w:rPr>
+          <w:rStyle w:val="VerbatimChar"/>
+        </w:rPr>
+        <w:t xml:space="preserve">status</w:t>
+      </w:r>
+      <w:r>
+        <w:t xml:space="preserve"> </w:t>
+      </w:r>
+      <w:r>
+        <w:t xml:space="preserve">(text, either</w:t>
+      </w:r>
+      <w:r>
+        <w:t xml:space="preserve"> </w:t>
+      </w:r>
+      <w:r>
+        <w:rPr>
+          <w:rStyle w:val="VerbatimChar"/>
+        </w:rPr>
+        <w:t xml:space="preserve">'vacant'</w:t>
+      </w:r>
+      <w:r>
+        <w:t xml:space="preserve"> </w:t>
+      </w:r>
+      <w:r>
+        <w:t xml:space="preserve">or</w:t>
+      </w:r>
+      <w:r>
+        <w:t xml:space="preserve"> </w:t>
+      </w:r>
+      <w:r>
+        <w:rPr>
+          <w:rStyle w:val="VerbatimChar"/>
+        </w:rPr>
+        <w:t xml:space="preserve">'occupied'</w:t>
+      </w:r>
+      <w:r>
+        <w:t xml:space="preserve">).</w:t>
+      </w:r>
+      <w:r>
+        <w:t xml:space="preserve"> </w:t>
+      </w:r>
+      <w:r>
+        <w:t xml:space="preserve">-</w:t>
+      </w:r>
+      <w:r>
+        <w:t xml:space="preserve"> </w:t>
+      </w:r>
+      <w:r>
+        <w:rPr>
+          <w:rStyle w:val="VerbatimChar"/>
+          <w:b/>
+          <w:bCs/>
+        </w:rPr>
+        <w:t xml:space="preserve">room_postings</w:t>
+      </w:r>
+      <w:r>
+        <w:t xml:space="preserve">: Public listings advertised on the marketplace. Contains foreign keys to rooms, listing titles, descriptions, contact phones, and status.</w:t>
+      </w:r>
+      <w:r>
+        <w:t xml:space="preserve"> </w:t>
+      </w:r>
+      <w:r>
+        <w:t xml:space="preserve">-</w:t>
+      </w:r>
+      <w:r>
+        <w:t xml:space="preserve"> </w:t>
+      </w:r>
+      <w:r>
+        <w:rPr>
+          <w:rStyle w:val="VerbatimChar"/>
+          <w:b/>
+          <w:bCs/>
+        </w:rPr>
+        <w:t xml:space="preserve">tenants</w:t>
+      </w:r>
+      <w:r>
+        <w:t xml:space="preserve">: Tenant KYC registry. Stores phone numbers (unique), government ID links, verification types (</w:t>
+      </w:r>
+      <w:r>
+        <w:rPr>
+          <w:rStyle w:val="VerbatimChar"/>
+        </w:rPr>
+        <w:t xml:space="preserve">citizenship</w:t>
+      </w:r>
+      <w:r>
+        <w:t xml:space="preserve">,</w:t>
+      </w:r>
+      <w:r>
+        <w:t xml:space="preserve"> </w:t>
+      </w:r>
+      <w:r>
+        <w:rPr>
+          <w:rStyle w:val="VerbatimChar"/>
+        </w:rPr>
+        <w:t xml:space="preserve">license</w:t>
+      </w:r>
+      <w:r>
+        <w:t xml:space="preserve">,</w:t>
+      </w:r>
+      <w:r>
+        <w:t xml:space="preserve"> </w:t>
+      </w:r>
+      <w:r>
+        <w:rPr>
+          <w:rStyle w:val="VerbatimChar"/>
+        </w:rPr>
+        <w:t xml:space="preserve">passport</w:t>
+      </w:r>
+      <w:r>
+        <w:t xml:space="preserve">), and</w:t>
+      </w:r>
+      <w:r>
+        <w:t xml:space="preserve"> </w:t>
+      </w:r>
+      <w:r>
+        <w:rPr>
+          <w:rStyle w:val="VerbatimChar"/>
+        </w:rPr>
+        <w:t xml:space="preserve">rating</w:t>
+      </w:r>
+      <w:r>
+        <w:t xml:space="preserve"> </w:t>
+      </w:r>
+      <w:r>
+        <w:t xml:space="preserve">(real representation of tenant reputation score).</w:t>
+      </w:r>
+      <w:r>
+        <w:t xml:space="preserve"> </w:t>
+      </w:r>
+      <w:r>
+        <w:t xml:space="preserve">-</w:t>
+      </w:r>
+      <w:r>
+        <w:t xml:space="preserve"> </w:t>
+      </w:r>
+      <w:r>
+        <w:rPr>
+          <w:rStyle w:val="VerbatimChar"/>
+          <w:b/>
+          <w:bCs/>
+        </w:rPr>
+        <w:t xml:space="preserve">tenancies</w:t>
+      </w:r>
+      <w:r>
+        <w:t xml:space="preserve">: Mappings between occupied rooms and active tenants, containing security deposit amounts and checkout dates.</w:t>
+      </w:r>
+      <w:r>
+        <w:t xml:space="preserve"> </w:t>
+      </w:r>
+      <w:r>
+        <w:t xml:space="preserve">-</w:t>
+      </w:r>
+      <w:r>
+        <w:t xml:space="preserve"> </w:t>
+      </w:r>
+      <w:r>
+        <w:rPr>
+          <w:rStyle w:val="VerbatimChar"/>
+          <w:b/>
+          <w:bCs/>
+        </w:rPr>
+        <w:t xml:space="preserve">tenancy_agreements</w:t>
+      </w:r>
+      <w:r>
+        <w:t xml:space="preserve">: Stores digital lease contract terms, including rent rates, electricity sub-meter fees, and housekeeper/tenant SVG digital signatures.</w:t>
+      </w:r>
+      <w:r>
+        <w:t xml:space="preserve"> </w:t>
+      </w:r>
+      <w:r>
+        <w:t xml:space="preserve">-</w:t>
+      </w:r>
+      <w:r>
+        <w:t xml:space="preserve"> </w:t>
+      </w:r>
+      <w:r>
+        <w:rPr>
+          <w:rStyle w:val="VerbatimChar"/>
+          <w:b/>
+          <w:bCs/>
+        </w:rPr>
+        <w:t xml:space="preserve">invoices</w:t>
+      </w:r>
+      <w:r>
+        <w:t xml:space="preserve">: Generated monthly. Stores billing cycle identifiers, utility reading counts, arrears balances, and payment status.</w:t>
+      </w:r>
+      <w:r>
+        <w:t xml:space="preserve"> </w:t>
+      </w:r>
+      <w:r>
+        <w:t xml:space="preserve">-</w:t>
+      </w:r>
+      <w:r>
+        <w:t xml:space="preserve"> </w:t>
+      </w:r>
+      <w:r>
+        <w:rPr>
+          <w:rStyle w:val="VerbatimChar"/>
+          <w:b/>
+          <w:bCs/>
+        </w:rPr>
+        <w:t xml:space="preserve">meter_readings</w:t>
+      </w:r>
+      <w:r>
+        <w:t xml:space="preserve">: Sub-meter history logs capturing kilowatt-hour readings.</w:t>
+      </w:r>
+      <w:r>
+        <w:t xml:space="preserve"> </w:t>
+      </w:r>
+      <w:r>
+        <w:t xml:space="preserve">-</w:t>
+      </w:r>
+      <w:r>
+        <w:t xml:space="preserve"> </w:t>
+      </w:r>
+      <w:r>
+        <w:rPr>
+          <w:rStyle w:val="VerbatimChar"/>
+          <w:b/>
+          <w:bCs/>
+        </w:rPr>
+        <w:t xml:space="preserve">payments</w:t>
+      </w:r>
+      <w:r>
+        <w:t xml:space="preserve">: Transaction records. Captures amount paid, payment method, simulated SMS OTP verification values, and digital housekeeper signature logs for cash audits.</w:t>
+      </w:r>
+      <w:r>
+        <w:t xml:space="preserve"> </w:t>
+      </w:r>
+      <w:r>
+        <w:t xml:space="preserve">-</w:t>
+      </w:r>
+      <w:r>
+        <w:t xml:space="preserve"> </w:t>
+      </w:r>
+      <w:r>
+        <w:rPr>
+          <w:rStyle w:val="VerbatimChar"/>
+          <w:b/>
+          <w:bCs/>
+        </w:rPr>
+        <w:t xml:space="preserve">checkout_settlements</w:t>
+      </w:r>
+      <w:r>
+        <w:t xml:space="preserve">: Reconciles deposits, pro-rated rent, damage costs, and outstanding utility bills.</w:t>
+      </w:r>
+      <w:r>
+        <w:t xml:space="preserve"> </w:t>
+      </w:r>
+      <w:r>
+        <w:t xml:space="preserve">-</w:t>
+      </w:r>
+      <w:r>
+        <w:t xml:space="preserve"> </w:t>
+      </w:r>
+      <w:r>
+        <w:rPr>
+          <w:rStyle w:val="VerbatimChar"/>
+          <w:b/>
+          <w:bCs/>
+        </w:rPr>
+        <w:t xml:space="preserve">tenant_reviews</w:t>
+      </w:r>
+      <w:r>
+        <w:t xml:space="preserve">: Star ratings (1-5) and comment feeds submitted by landlords upon checkout.</w:t>
+      </w:r>
+      <w:r>
+        <w:t xml:space="preserve"> </w:t>
+      </w:r>
+      <w:r>
+        <w:t xml:space="preserve">-</w:t>
+      </w:r>
+      <w:r>
+        <w:t xml:space="preserve"> </w:t>
+      </w:r>
+      <w:r>
+        <w:rPr>
+          <w:rStyle w:val="VerbatimChar"/>
+          <w:b/>
+          <w:bCs/>
+        </w:rPr>
+        <w:t xml:space="preserve">property_reviews</w:t>
+      </w:r>
+      <w:r>
+        <w:t xml:space="preserve">: Property condition ratings and reviews submitted by tenants.</w:t>
+      </w:r>
+    </w:p>
+    <w:p>
+      <w:r>
+        <w:pict>
+          <v:rect style="width:0;height:1.5pt" o:hralign="center" o:hrstd="t" o:hr="t"/>
+        </w:pict>
       </w:r>
     </w:p>
     <w:bookmarkEnd w:id="16"/>
-    <w:bookmarkStart w:id="17" w:name="X013502873c608dc4db2a24787c94b9497e09a77"/>
+    <w:bookmarkStart w:id="23" w:name="core-codebase-algorithms"/>
+    <w:p>
+      <w:pPr>
+        <w:pStyle w:val="Heading3"/>
+      </w:pPr>
+      <w:r>
+        <w:t xml:space="preserve">Core Codebase Algorithms</w:t>
+      </w:r>
+    </w:p>
+    <w:p>
+      <w:pPr>
+        <w:pStyle w:val="FirstParagraph"/>
+      </w:pPr>
+      <w:r>
+        <w:t xml:space="preserve">The system incorporates several specialized algorithms to manage Nepali dates, anti-fraud cash transactions, and aggregation statistics:</w:t>
+      </w:r>
+    </w:p>
+    <w:bookmarkStart w:id="17" w:name="Xbb9b1fc98abe7bcc0832474e6bf16d387092b5b"/>
     <w:p>
       <w:pPr>
         <w:pStyle w:val="Heading4"/>
       </w:pPr>
       <w:r>
-        <w:t xml:space="preserve">2. Tenant API (</w:t>
+        <w:t xml:space="preserve">1. Bikram Sambat Date Clamping &amp; Normalization Algorithm</w:t>
+      </w:r>
+    </w:p>
+    <w:p>
+      <w:pPr>
+        <w:pStyle w:val="FirstParagraph"/>
+      </w:pPr>
+      <w:r>
+        <w:t xml:space="preserve">Bikram Sambat calendar months vary between 29 to 32 days depending on the year. If a tenancy begins on the 32nd day of Ashadh, constructing a billing cycle anniversary for Bhadra (which may only contain 31 days) would cause the date library to overflow the day count, rolling the date over into Ashwin 1st.</w:t>
+      </w:r>
+      <w:r>
+        <w:t xml:space="preserve"> </w:t>
+      </w:r>
+      <w:r>
+        <w:t xml:space="preserve">To solve this, the</w:t>
+      </w:r>
+      <w:r>
+        <w:t xml:space="preserve"> </w:t>
       </w:r>
       <w:r>
         <w:rPr>
           <w:rStyle w:val="VerbatimChar"/>
         </w:rPr>
-        <w:t xml:space="preserve">src/features/tenant/TenantModel.ts</w:t>
-      </w:r>
-      <w:r>
-        <w:t xml:space="preserve">)</w:t>
+        <w:t xml:space="preserve">getSafeNepaliDate</w:t>
+      </w:r>
+      <w:r>
+        <w:t xml:space="preserve"> </w:t>
+      </w:r>
+      <w:r>
+        <w:t xml:space="preserve">algorithm normalizes the construction parameter:</w:t>
+      </w:r>
+    </w:p>
+    <w:p>
+      <w:pPr>
+        <w:pStyle w:val="BodyText"/>
+      </w:pPr>
+      <m:oMathPara>
+        <m:oMathParaPr>
+          <m:jc m:val="center"/>
+        </m:oMathParaPr>
+        <m:oMath>
+          <m:r>
+            <m:rPr>
+              <m:nor/>
+              <m:sty m:val="p"/>
+            </m:rPr>
+            <m:t>Let </m:t>
+          </m:r>
+          <m:r>
+            <m:t>d</m:t>
+          </m:r>
+          <m:r>
+            <m:rPr>
+              <m:sty m:val="p"/>
+            </m:rPr>
+            <m:t>=</m:t>
+          </m:r>
+          <m:r>
+            <m:rPr>
+              <m:nor/>
+              <m:sty m:val="p"/>
+            </m:rPr>
+            <m:t>day</m:t>
+          </m:r>
+          <m:r>
+            <m:rPr>
+              <m:sty m:val="p"/>
+            </m:rPr>
+            <m:t>,</m:t>
+          </m:r>
+          <m:r>
+            <m:t>m</m:t>
+          </m:r>
+          <m:r>
+            <m:rPr>
+              <m:sty m:val="p"/>
+            </m:rPr>
+            <m:t>=</m:t>
+          </m:r>
+          <m:r>
+            <m:rPr>
+              <m:nor/>
+              <m:sty m:val="p"/>
+            </m:rPr>
+            <m:t>month</m:t>
+          </m:r>
+          <m:r>
+            <m:rPr>
+              <m:sty m:val="p"/>
+            </m:rPr>
+            <m:t>,</m:t>
+          </m:r>
+          <m:r>
+            <m:t>y</m:t>
+          </m:r>
+          <m:r>
+            <m:rPr>
+              <m:sty m:val="p"/>
+            </m:rPr>
+            <m:t>=</m:t>
+          </m:r>
+          <m:r>
+            <m:rPr>
+              <m:nor/>
+              <m:sty m:val="p"/>
+            </m:rPr>
+            <m:t>year</m:t>
+          </m:r>
+        </m:oMath>
+      </m:oMathPara>
+    </w:p>
+    <w:p>
+      <w:pPr>
+        <w:pStyle w:val="FirstParagraph"/>
+      </w:pPr>
+      <m:oMathPara>
+        <m:oMathParaPr>
+          <m:jc m:val="center"/>
+        </m:oMathParaPr>
+        <m:oMath>
+          <m:r>
+            <m:rPr>
+              <m:nor/>
+              <m:sty m:val="p"/>
+            </m:rPr>
+            <m:t>Reconstruct date </m:t>
+          </m:r>
+          <m:r>
+            <m:t>n</m:t>
+          </m:r>
+          <m:r>
+            <m:t>d</m:t>
+          </m:r>
+          <m:r>
+            <m:rPr>
+              <m:sty m:val="p"/>
+            </m:rPr>
+            <m:t>=</m:t>
+          </m:r>
+          <m:r>
+            <m:rPr>
+              <m:nor/>
+              <m:sty m:val="p"/>
+            </m:rPr>
+            <m:t>NepaliDate</m:t>
+          </m:r>
+          <m:r>
+            <m:rPr>
+              <m:sty m:val="p"/>
+            </m:rPr>
+            <m:t>(</m:t>
+          </m:r>
+          <m:r>
+            <m:t>y</m:t>
+          </m:r>
+          <m:r>
+            <m:rPr>
+              <m:sty m:val="p"/>
+            </m:rPr>
+            <m:t>,</m:t>
+          </m:r>
+          <m:r>
+            <m:t>m</m:t>
+          </m:r>
+          <m:r>
+            <m:rPr>
+              <m:sty m:val="p"/>
+            </m:rPr>
+            <m:t>,</m:t>
+          </m:r>
+          <m:r>
+            <m:t>d</m:t>
+          </m:r>
+          <m:r>
+            <m:rPr>
+              <m:sty m:val="p"/>
+            </m:rPr>
+            <m:t>)</m:t>
+          </m:r>
+        </m:oMath>
+      </m:oMathPara>
+    </w:p>
+    <w:p>
+      <w:pPr>
+        <w:pStyle w:val="FirstParagraph"/>
+      </w:pPr>
+      <m:oMathPara>
+        <m:oMathParaPr>
+          <m:jc m:val="center"/>
+        </m:oMathParaPr>
+        <m:oMath>
+          <m:r>
+            <m:rPr>
+              <m:nor/>
+              <m:sty m:val="p"/>
+            </m:rPr>
+            <m:t>While </m:t>
+          </m:r>
+          <m:r>
+            <m:t>n</m:t>
+          </m:r>
+          <m:r>
+            <m:t>d</m:t>
+          </m:r>
+          <m:r>
+            <m:rPr>
+              <m:sty m:val="p"/>
+            </m:rPr>
+            <m:t>.</m:t>
+          </m:r>
+          <m:r>
+            <m:rPr>
+              <m:nor/>
+              <m:sty m:val="p"/>
+            </m:rPr>
+            <m:t>getMonth</m:t>
+          </m:r>
+          <m:r>
+            <m:rPr>
+              <m:sty m:val="p"/>
+            </m:rPr>
+            <m:t>(</m:t>
+          </m:r>
+          <m:r>
+            <m:rPr>
+              <m:sty m:val="p"/>
+            </m:rPr>
+            <m:t>)</m:t>
+          </m:r>
+          <m:r>
+            <m:rPr>
+              <m:sty m:val="p"/>
+            </m:rPr>
+            <m:t>≠</m:t>
+          </m:r>
+          <m:r>
+            <m:t>m</m:t>
+          </m:r>
+          <m:r>
+            <m:rPr>
+              <m:nor/>
+              <m:sty m:val="p"/>
+            </m:rPr>
+            <m:t> and </m:t>
+          </m:r>
+          <m:r>
+            <m:t>d</m:t>
+          </m:r>
+          <m:r>
+            <m:rPr>
+              <m:sty m:val="p"/>
+            </m:rPr>
+            <m:t>&gt;</m:t>
+          </m:r>
+          <m:r>
+            <m:t>1</m:t>
+          </m:r>
+          <m:r>
+            <m:rPr>
+              <m:sty m:val="p"/>
+            </m:rPr>
+            <m:t>:</m:t>
+          </m:r>
+        </m:oMath>
+      </m:oMathPara>
+    </w:p>
+    <w:p>
+      <w:pPr>
+        <w:pStyle w:val="FirstParagraph"/>
+      </w:pPr>
+      <m:oMathPara>
+        <m:oMathParaPr>
+          <m:jc m:val="center"/>
+        </m:oMathParaPr>
+        <m:oMath>
+          <m:r>
+            <m:t>d</m:t>
+          </m:r>
+          <m:r>
+            <m:rPr>
+              <m:sty m:val="p"/>
+            </m:rPr>
+            <m:t>←</m:t>
+          </m:r>
+          <m:r>
+            <m:t>d</m:t>
+          </m:r>
+          <m:r>
+            <m:rPr>
+              <m:sty m:val="p"/>
+            </m:rPr>
+            <m:t>−</m:t>
+          </m:r>
+          <m:r>
+            <m:t>1</m:t>
+          </m:r>
+        </m:oMath>
+      </m:oMathPara>
+    </w:p>
+    <w:p>
+      <w:pPr>
+        <w:pStyle w:val="FirstParagraph"/>
+      </w:pPr>
+      <m:oMathPara>
+        <m:oMathParaPr>
+          <m:jc m:val="center"/>
+        </m:oMathParaPr>
+        <m:oMath>
+          <m:r>
+            <m:t>n</m:t>
+          </m:r>
+          <m:r>
+            <m:t>d</m:t>
+          </m:r>
+          <m:r>
+            <m:rPr>
+              <m:sty m:val="p"/>
+            </m:rPr>
+            <m:t>←</m:t>
+          </m:r>
+          <m:r>
+            <m:rPr>
+              <m:nor/>
+              <m:sty m:val="p"/>
+            </m:rPr>
+            <m:t>NepaliDate</m:t>
+          </m:r>
+          <m:r>
+            <m:rPr>
+              <m:sty m:val="p"/>
+            </m:rPr>
+            <m:t>(</m:t>
+          </m:r>
+          <m:r>
+            <m:t>y</m:t>
+          </m:r>
+          <m:r>
+            <m:rPr>
+              <m:sty m:val="p"/>
+            </m:rPr>
+            <m:t>,</m:t>
+          </m:r>
+          <m:r>
+            <m:t>m</m:t>
+          </m:r>
+          <m:r>
+            <m:rPr>
+              <m:sty m:val="p"/>
+            </m:rPr>
+            <m:t>,</m:t>
+          </m:r>
+          <m:r>
+            <m:t>d</m:t>
+          </m:r>
+          <m:r>
+            <m:rPr>
+              <m:sty m:val="p"/>
+            </m:rPr>
+            <m:t>)</m:t>
+          </m:r>
+        </m:oMath>
+      </m:oMathPara>
+    </w:p>
+    <w:p>
+      <w:pPr>
+        <w:pStyle w:val="FirstParagraph"/>
+      </w:pPr>
+      <m:oMathPara>
+        <m:oMathParaPr>
+          <m:jc m:val="center"/>
+        </m:oMathParaPr>
+        <m:oMath>
+          <m:r>
+            <m:rPr>
+              <m:nor/>
+              <m:sty m:val="p"/>
+            </m:rPr>
+            <m:t>Return </m:t>
+          </m:r>
+          <m:r>
+            <m:t>n</m:t>
+          </m:r>
+          <m:r>
+            <m:t>d</m:t>
+          </m:r>
+        </m:oMath>
+      </m:oMathPara>
+    </w:p>
+    <w:p>
+      <w:pPr>
+        <w:pStyle w:val="FirstParagraph"/>
+      </w:pPr>
+      <w:r>
+        <w:t xml:space="preserve">This clamps the anniversary boundary to the maximum day of that specific B.S. month (e.g. Ashadh 32nd clamps to Bhadra 31st).</w:t>
+      </w:r>
+    </w:p>
+    <w:bookmarkEnd w:id="17"/>
+    <w:bookmarkStart w:id="18" w:name="Xefc568ea28a6deb60f7e38065ce3dd0f38cf43b"/>
+    <w:p>
+      <w:pPr>
+        <w:pStyle w:val="Heading4"/>
+      </w:pPr>
+      <w:r>
+        <w:t xml:space="preserve">2. Bikram Sambat Cycle Boundary Billing Algorithm</w:t>
+      </w:r>
+    </w:p>
+    <w:p>
+      <w:pPr>
+        <w:pStyle w:val="FirstParagraph"/>
+      </w:pPr>
+      <w:r>
+        <w:t xml:space="preserve">To determine which cycle contains the checkout date:</w:t>
+      </w:r>
+      <w:r>
+        <w:t xml:space="preserve"> </w:t>
+      </w:r>
+      <w:r>
+        <w:t xml:space="preserve">1. Extract the start day of the tenancy in B.S. (e.g. the 15th).</w:t>
+      </w:r>
+      <w:r>
+        <w:t xml:space="preserve"> </w:t>
+      </w:r>
+      <w:r>
+        <w:t xml:space="preserve">2. Compare the checkout day (e.g. the 10th) against the start day:</w:t>
+      </w:r>
+      <w:r>
+        <w:t xml:space="preserve"> </w:t>
+      </w:r>
+      <w:r>
+        <w:t xml:space="preserve">* If</w:t>
+      </w:r>
+      <w:r>
+        <w:t xml:space="preserve"> </w:t>
+      </w:r>
+      <m:oMath>
+        <m:r>
+          <m:rPr>
+            <m:nor/>
+            <m:sty m:val="p"/>
+          </m:rPr>
+          <m:t>checkoutDay</m:t>
+        </m:r>
+        <m:r>
+          <m:rPr>
+            <m:sty m:val="p"/>
+          </m:rPr>
+          <m:t>≥</m:t>
+        </m:r>
+        <m:r>
+          <m:rPr>
+            <m:nor/>
+            <m:sty m:val="p"/>
+          </m:rPr>
+          <m:t>startDay</m:t>
+        </m:r>
+      </m:oMath>
+      <w:r>
+        <w:t xml:space="preserve">: The cycle start is clamped to the checkout month on the start day. The cycle end is the next month on the start day.</w:t>
+      </w:r>
+      <w:r>
+        <w:t xml:space="preserve"> </w:t>
+      </w:r>
+      <w:r>
+        <w:t xml:space="preserve">* If</w:t>
+      </w:r>
+      <w:r>
+        <w:t xml:space="preserve"> </w:t>
+      </w:r>
+      <m:oMath>
+        <m:r>
+          <m:rPr>
+            <m:nor/>
+            <m:sty m:val="p"/>
+          </m:rPr>
+          <m:t>checkoutDay</m:t>
+        </m:r>
+        <m:r>
+          <m:rPr>
+            <m:sty m:val="p"/>
+          </m:rPr>
+          <m:t>&lt;</m:t>
+        </m:r>
+        <m:r>
+          <m:rPr>
+            <m:nor/>
+            <m:sty m:val="p"/>
+          </m:rPr>
+          <m:t>startDay</m:t>
+        </m:r>
+      </m:oMath>
+      <w:r>
+        <w:t xml:space="preserve">: The cycle start is the previous month on the start day. The cycle end is the checkout month on the start day.</w:t>
+      </w:r>
+      <w:r>
+        <w:t xml:space="preserve"> </w:t>
+      </w:r>
+      <w:r>
+        <w:t xml:space="preserve">3. Convert these boundary B.S. dates to Gregorian A.D. timestamps to calculate total days.</w:t>
+      </w:r>
+    </w:p>
+    <w:bookmarkEnd w:id="18"/>
+    <w:bookmarkStart w:id="19" w:name="rent-pro-ration-math"/>
+    <w:p>
+      <w:pPr>
+        <w:pStyle w:val="Heading4"/>
+      </w:pPr>
+      <w:r>
+        <w:t xml:space="preserve">3. Rent Pro-Ration Math</w:t>
+      </w:r>
+    </w:p>
+    <w:p>
+      <w:pPr>
+        <w:pStyle w:val="FirstParagraph"/>
+      </w:pPr>
+      <w:r>
+        <w:t xml:space="preserve">Rent due is calculated proportionally based on the number of days stayed in the final cycle:</w:t>
+      </w:r>
+    </w:p>
+    <w:p>
+      <w:pPr>
+        <w:pStyle w:val="BodyText"/>
+      </w:pPr>
+      <m:oMathPara>
+        <m:oMathParaPr>
+          <m:jc m:val="center"/>
+        </m:oMathParaPr>
+        <m:oMath>
+          <m:r>
+            <m:rPr>
+              <m:nor/>
+              <m:sty m:val="p"/>
+            </m:rPr>
+            <m:t>Rent Due</m:t>
+          </m:r>
+          <m:r>
+            <m:rPr>
+              <m:sty m:val="p"/>
+            </m:rPr>
+            <m:t>=</m:t>
+          </m:r>
+          <m:d>
+            <m:dPr>
+              <m:begChr m:val="("/>
+              <m:sepChr m:val=""/>
+              <m:endChr m:val=")"/>
+              <m:grow/>
+            </m:dPr>
+            <m:e>
+              <m:f>
+                <m:fPr>
+                  <m:type m:val="bar"/>
+                </m:fPr>
+                <m:num>
+                  <m:r>
+                    <m:rPr>
+                      <m:nor/>
+                      <m:sty m:val="p"/>
+                    </m:rPr>
+                    <m:t>Days Stayed</m:t>
+                  </m:r>
+                </m:num>
+                <m:den>
+                  <m:r>
+                    <m:rPr>
+                      <m:nor/>
+                      <m:sty m:val="p"/>
+                    </m:rPr>
+                    <m:t>Total Days in Cycle</m:t>
+                  </m:r>
+                </m:den>
+              </m:f>
+            </m:e>
+          </m:d>
+          <m:r>
+            <m:rPr>
+              <m:sty m:val="p"/>
+            </m:rPr>
+            <m:t>×</m:t>
+          </m:r>
+          <m:r>
+            <m:rPr>
+              <m:nor/>
+              <m:sty m:val="p"/>
+            </m:rPr>
+            <m:t>Base Rent</m:t>
+          </m:r>
+        </m:oMath>
+      </m:oMathPara>
+    </w:p>
+    <w:p>
+      <w:pPr>
+        <w:pStyle w:val="FirstParagraph"/>
+      </w:pPr>
+      <w:r>
+        <w:t xml:space="preserve">Edge cases are clamped:</w:t>
+      </w:r>
+    </w:p>
+    <w:p>
+      <w:pPr>
+        <w:pStyle w:val="BodyText"/>
+      </w:pPr>
+      <m:oMathPara>
+        <m:oMathParaPr>
+          <m:jc m:val="center"/>
+        </m:oMathParaPr>
+        <m:oMath>
+          <m:r>
+            <m:rPr>
+              <m:nor/>
+              <m:sty m:val="p"/>
+            </m:rPr>
+            <m:t>Days Stayed</m:t>
+          </m:r>
+          <m:r>
+            <m:rPr>
+              <m:sty m:val="p"/>
+            </m:rPr>
+            <m:t>=</m:t>
+          </m:r>
+          <m:r>
+            <m:rPr>
+              <m:sty m:val="p"/>
+            </m:rPr>
+            <m:t>max</m:t>
+          </m:r>
+          <m:r>
+            <m:rPr>
+              <m:sty m:val="p"/>
+            </m:rPr>
+            <m:t>(</m:t>
+          </m:r>
+          <m:r>
+            <m:t>0</m:t>
+          </m:r>
+          <m:r>
+            <m:rPr>
+              <m:sty m:val="p"/>
+            </m:rPr>
+            <m:t>,</m:t>
+          </m:r>
+          <m:r>
+            <m:rPr>
+              <m:sty m:val="p"/>
+            </m:rPr>
+            <m:t>min</m:t>
+          </m:r>
+          <m:r>
+            <m:rPr>
+              <m:sty m:val="p"/>
+            </m:rPr>
+            <m:t>(</m:t>
+          </m:r>
+          <m:r>
+            <m:rPr>
+              <m:nor/>
+              <m:sty m:val="p"/>
+            </m:rPr>
+            <m:t>Total Days</m:t>
+          </m:r>
+          <m:r>
+            <m:rPr>
+              <m:sty m:val="p"/>
+            </m:rPr>
+            <m:t>,</m:t>
+          </m:r>
+          <m:r>
+            <m:rPr>
+              <m:nor/>
+              <m:sty m:val="p"/>
+            </m:rPr>
+            <m:t>Checkout Date</m:t>
+          </m:r>
+          <m:r>
+            <m:rPr>
+              <m:sty m:val="p"/>
+            </m:rPr>
+            <m:t>−</m:t>
+          </m:r>
+          <m:r>
+            <m:rPr>
+              <m:nor/>
+              <m:sty m:val="p"/>
+            </m:rPr>
+            <m:t>Cycle Start Date</m:t>
+          </m:r>
+          <m:r>
+            <m:rPr>
+              <m:sty m:val="p"/>
+            </m:rPr>
+            <m:t>)</m:t>
+          </m:r>
+          <m:r>
+            <m:rPr>
+              <m:sty m:val="p"/>
+            </m:rPr>
+            <m:t>)</m:t>
+          </m:r>
+        </m:oMath>
+      </m:oMathPara>
+    </w:p>
+    <w:bookmarkEnd w:id="19"/>
+    <w:bookmarkStart w:id="20" w:name="sub-meter-electricity-billing-algorithm"/>
+    <w:p>
+      <w:pPr>
+        <w:pStyle w:val="Heading4"/>
+      </w:pPr>
+      <w:r>
+        <w:t xml:space="preserve">4. Sub-Meter Electricity Billing Algorithm</w:t>
+      </w:r>
+    </w:p>
+    <w:p>
+      <w:pPr>
+        <w:pStyle w:val="FirstParagraph"/>
+      </w:pPr>
+      <w:r>
+        <w:t xml:space="preserve">Electricity sub-meters are calculated using reading differences:</w:t>
+      </w:r>
+    </w:p>
+    <w:p>
+      <w:pPr>
+        <w:pStyle w:val="BodyText"/>
+      </w:pPr>
+      <m:oMathPara>
+        <m:oMathParaPr>
+          <m:jc m:val="center"/>
+        </m:oMathParaPr>
+        <m:oMath>
+          <m:r>
+            <m:rPr>
+              <m:nor/>
+              <m:sty m:val="p"/>
+            </m:rPr>
+            <m:t>Units Consumed</m:t>
+          </m:r>
+          <m:r>
+            <m:rPr>
+              <m:sty m:val="p"/>
+            </m:rPr>
+            <m:t>=</m:t>
+          </m:r>
+          <m:r>
+            <m:rPr>
+              <m:nor/>
+              <m:sty m:val="p"/>
+            </m:rPr>
+            <m:t>Current Reading</m:t>
+          </m:r>
+          <m:r>
+            <m:rPr>
+              <m:sty m:val="p"/>
+            </m:rPr>
+            <m:t>−</m:t>
+          </m:r>
+          <m:r>
+            <m:rPr>
+              <m:nor/>
+              <m:sty m:val="p"/>
+            </m:rPr>
+            <m:t>Previous Reading</m:t>
+          </m:r>
+        </m:oMath>
+      </m:oMathPara>
+    </w:p>
+    <w:p>
+      <w:pPr>
+        <w:pStyle w:val="FirstParagraph"/>
+      </w:pPr>
+      <m:oMathPara>
+        <m:oMathParaPr>
+          <m:jc m:val="center"/>
+        </m:oMathParaPr>
+        <m:oMath>
+          <m:r>
+            <m:rPr>
+              <m:nor/>
+              <m:sty m:val="p"/>
+            </m:rPr>
+            <m:t>Validation: </m:t>
+          </m:r>
+          <m:r>
+            <m:rPr>
+              <m:nor/>
+              <m:sty m:val="p"/>
+            </m:rPr>
+            <m:t>Current Reading</m:t>
+          </m:r>
+          <m:r>
+            <m:rPr>
+              <m:sty m:val="p"/>
+            </m:rPr>
+            <m:t>≥</m:t>
+          </m:r>
+          <m:r>
+            <m:rPr>
+              <m:nor/>
+              <m:sty m:val="p"/>
+            </m:rPr>
+            <m:t>Previous Reading</m:t>
+          </m:r>
+        </m:oMath>
+      </m:oMathPara>
+    </w:p>
+    <w:p>
+      <w:pPr>
+        <w:pStyle w:val="FirstParagraph"/>
+      </w:pPr>
+      <m:oMathPara>
+        <m:oMathParaPr>
+          <m:jc m:val="center"/>
+        </m:oMathParaPr>
+        <m:oMath>
+          <m:r>
+            <m:rPr>
+              <m:nor/>
+              <m:sty m:val="p"/>
+            </m:rPr>
+            <m:t>Cost</m:t>
+          </m:r>
+          <m:r>
+            <m:rPr>
+              <m:sty m:val="p"/>
+            </m:rPr>
+            <m:t>=</m:t>
+          </m:r>
+          <m:r>
+            <m:rPr>
+              <m:nor/>
+              <m:sty m:val="p"/>
+            </m:rPr>
+            <m:t>Units Consumed</m:t>
+          </m:r>
+          <m:r>
+            <m:rPr>
+              <m:sty m:val="p"/>
+            </m:rPr>
+            <m:t>×</m:t>
+          </m:r>
+          <m:r>
+            <m:rPr>
+              <m:nor/>
+              <m:sty m:val="p"/>
+            </m:rPr>
+            <m:t>Unit Rate</m:t>
+          </m:r>
+        </m:oMath>
+      </m:oMathPara>
+    </w:p>
+    <w:p>
+      <w:pPr>
+        <w:pStyle w:val="FirstParagraph"/>
+      </w:pPr>
+      <w:r>
+        <w:t xml:space="preserve">If the current reading is less than the previous reading, the system throws a validation error and halts calculation, preventing errors from negative units.</w:t>
+      </w:r>
+    </w:p>
+    <w:bookmarkEnd w:id="20"/>
+    <w:bookmarkStart w:id="21" w:name="X2bdd0eb59b72295b4aec309eedac5efa427c34c"/>
+    <w:p>
+      <w:pPr>
+        <w:pStyle w:val="Heading4"/>
+      </w:pPr>
+      <w:r>
+        <w:t xml:space="preserve">5. Double-Confirmation Cash Flow &amp; OTP Verification Algorithm</w:t>
+      </w:r>
+    </w:p>
+    <w:p>
+      <w:pPr>
+        <w:pStyle w:val="FirstParagraph"/>
+      </w:pPr>
+      <w:r>
+        <w:t xml:space="preserve">To prevent landlords from unilaterally recording cash payments without tenant consent, the system implements a simulated SMS OTP verification flow:</w:t>
+      </w:r>
+      <w:r>
+        <w:t xml:space="preserve"> </w:t>
+      </w:r>
+      <w:r>
+        <w:t xml:space="preserve">1. When cash is selected, the housekeeper triggers an OTP request.</w:t>
+      </w:r>
+      <w:r>
+        <w:t xml:space="preserve"> </w:t>
+      </w:r>
+      <w:r>
+        <w:t xml:space="preserve">2. The controller generates a 4-digit code and mocks a network dispatch to the tenant’s phone number.</w:t>
+      </w:r>
+      <w:r>
+        <w:t xml:space="preserve"> </w:t>
+      </w:r>
+      <w:r>
+        <w:t xml:space="preserve">3. The tenant verifies the invoice details and shares the OTP verbally with the housekeeper.</w:t>
+      </w:r>
+      <w:r>
+        <w:t xml:space="preserve"> </w:t>
+      </w:r>
+      <w:r>
+        <w:t xml:space="preserve">4. Entering the matching OTP code unlocks the signature pad, allowing the housekeeper to sign off and lock the payment record.</w:t>
+      </w:r>
+    </w:p>
+    <w:bookmarkEnd w:id="21"/>
+    <w:bookmarkStart w:id="22" w:name="X0716c3c6f16b3a01918d0300e0f16728c3fcfdd"/>
+    <w:p>
+      <w:pPr>
+        <w:pStyle w:val="Heading4"/>
+      </w:pPr>
+      <w:r>
+        <w:t xml:space="preserve">6. Star-Rating Aggregation &amp; Reputation Score Recalculation Algorithm</w:t>
+      </w:r>
+    </w:p>
+    <w:p>
+      <w:pPr>
+        <w:pStyle w:val="FirstParagraph"/>
+      </w:pPr>
+      <w:r>
+        <w:t xml:space="preserve">When a review is submitted, the system recalculates the tenant’s reputation index inside a transaction:</w:t>
+      </w:r>
+    </w:p>
+    <w:p>
+      <w:pPr>
+        <w:pStyle w:val="BodyText"/>
+      </w:pPr>
+      <m:oMathPara>
+        <m:oMathParaPr>
+          <m:jc m:val="center"/>
+        </m:oMathParaPr>
+        <m:oMath>
+          <m:r>
+            <m:rPr>
+              <m:nor/>
+              <m:sty m:val="p"/>
+            </m:rPr>
+            <m:t>New Reputation</m:t>
+          </m:r>
+          <m:r>
+            <m:rPr>
+              <m:sty m:val="p"/>
+            </m:rPr>
+            <m:t>=</m:t>
+          </m:r>
+          <m:f>
+            <m:fPr>
+              <m:type m:val="bar"/>
+            </m:fPr>
+            <m:num>
+              <m:nary>
+                <m:naryPr>
+                  <m:chr m:val="∑"/>
+                  <m:limLoc m:val="undOvr"/>
+                  <m:subHide m:val="off"/>
+                  <m:supHide m:val="off"/>
+                </m:naryPr>
+                <m:sub>
+                  <m:r>
+                    <m:t>i</m:t>
+                  </m:r>
+                  <m:r>
+                    <m:rPr>
+                      <m:sty m:val="p"/>
+                    </m:rPr>
+                    <m:t>=</m:t>
+                  </m:r>
+                  <m:r>
+                    <m:t>1</m:t>
+                  </m:r>
+                </m:sub>
+                <m:sup>
+                  <m:r>
+                    <m:t>N</m:t>
+                  </m:r>
+                </m:sup>
+                <m:e>
+                  <m:sSub>
+                    <m:e>
+                      <m:r>
+                        <m:rPr>
+                          <m:nor/>
+                          <m:sty m:val="p"/>
+                        </m:rPr>
+                        <m:t>Rating</m:t>
+                      </m:r>
+                    </m:e>
+                    <m:sub>
+                      <m:r>
+                        <m:t>i</m:t>
+                      </m:r>
+                    </m:sub>
+                  </m:sSub>
+                </m:e>
+              </m:nary>
+            </m:num>
+            <m:den>
+              <m:r>
+                <m:t>N</m:t>
+              </m:r>
+            </m:den>
+          </m:f>
+        </m:oMath>
+      </m:oMathPara>
+    </w:p>
+    <w:p>
+      <w:pPr>
+        <w:pStyle w:val="FirstParagraph"/>
+      </w:pPr>
+      <w:r>
+        <w:t xml:space="preserve">Where</w:t>
+      </w:r>
+      <w:r>
+        <w:t xml:space="preserve"> </w:t>
+      </w:r>
+      <m:oMath>
+        <m:r>
+          <m:t>N</m:t>
+        </m:r>
+      </m:oMath>
+      <w:r>
+        <w:t xml:space="preserve"> </w:t>
+      </w:r>
+      <w:r>
+        <w:t xml:space="preserve">is the total reviews count. The aggregated rating is saved directly in the</w:t>
+      </w:r>
+      <w:r>
+        <w:t xml:space="preserve"> </w:t>
+      </w:r>
+      <w:r>
+        <w:rPr>
+          <w:rStyle w:val="VerbatimChar"/>
+        </w:rPr>
+        <w:t xml:space="preserve">tenants</w:t>
+      </w:r>
+      <w:r>
+        <w:t xml:space="preserve"> </w:t>
+      </w:r>
+      <w:r>
+        <w:t xml:space="preserve">table to optimize query performance for profile views.</w:t>
+      </w:r>
+    </w:p>
+    <w:p>
+      <w:r>
+        <w:pict>
+          <v:rect style="width:0;height:1.5pt" o:hralign="center" o:hrstd="t" o:hr="t"/>
+        </w:pict>
+      </w:r>
+    </w:p>
+    <w:bookmarkEnd w:id="22"/>
+    <w:bookmarkEnd w:id="23"/>
+    <w:bookmarkStart w:id="24" w:name="file-by-file-codebase-explanations"/>
+    <w:p>
+      <w:pPr>
+        <w:pStyle w:val="Heading3"/>
+      </w:pPr>
+      <w:r>
+        <w:t xml:space="preserve">File-by-File Codebase Explanations</w:t>
+      </w:r>
+    </w:p>
+    <w:p>
+      <w:pPr>
+        <w:pStyle w:val="FirstParagraph"/>
+      </w:pPr>
+      <w:r>
+        <w:t xml:space="preserve">Here is a directory map and description of the source code files:</w:t>
       </w:r>
     </w:p>
     <w:p>
@@ -780,41 +2258,13 @@
       <w:r>
         <w:rPr>
           <w:rStyle w:val="VerbatimChar"/>
-        </w:rPr>
-        <w:t xml:space="preserve">initTenantSchema()</w:t>
-      </w:r>
-      <w:r>
-        <w:t xml:space="preserve">: Bootstraps</w:t>
-      </w:r>
-      <w:r>
-        <w:t xml:space="preserve"> </w:t>
-      </w:r>
-      <w:r>
-        <w:rPr>
-          <w:rStyle w:val="VerbatimChar"/>
-        </w:rPr>
-        <w:t xml:space="preserve">tenants</w:t>
-      </w:r>
-      <w:r>
-        <w:t xml:space="preserve"> </w:t>
-      </w:r>
-      <w:r>
-        <w:t xml:space="preserve">and</w:t>
-      </w:r>
-      <w:r>
-        <w:t xml:space="preserve"> </w:t>
-      </w:r>
-      <w:r>
-        <w:rPr>
-          <w:rStyle w:val="VerbatimChar"/>
-        </w:rPr>
-        <w:t xml:space="preserve">tenancies</w:t>
-      </w:r>
-      <w:r>
-        <w:t xml:space="preserve"> </w:t>
-      </w:r>
-      <w:r>
-        <w:t xml:space="preserve">tables.</w:t>
+          <w:b/>
+          <w:bCs/>
+        </w:rPr>
+        <w:t xml:space="preserve">src/database/schema.ts</w:t>
+      </w:r>
+      <w:r>
+        <w:t xml:space="preserve">: Declares database schemas using Drizzle SQLite core (tables for houses, rooms, postings, tenants, tenancies, agreements, invoices, readings, payments, settlements, and reviews).</w:t>
       </w:r>
     </w:p>
     <w:p>
@@ -828,11 +2278,28 @@
       <w:r>
         <w:rPr>
           <w:rStyle w:val="VerbatimChar"/>
-        </w:rPr>
-        <w:t xml:space="preserve">addTenant(tenant)</w:t>
-      </w:r>
-      <w:r>
-        <w:t xml:space="preserve">: Saves tenant KYC records (Nagarikta/License/Passport details).</w:t>
+          <w:b/>
+          <w:bCs/>
+        </w:rPr>
+        <w:t xml:space="preserve">src/database/connection.ts</w:t>
+      </w:r>
+      <w:r>
+        <w:t xml:space="preserve">: Opens the database connection. Implements a web fallback engine relying on</w:t>
+      </w:r>
+      <w:r>
+        <w:t xml:space="preserve"> </w:t>
+      </w:r>
+      <w:r>
+        <w:rPr>
+          <w:rStyle w:val="VerbatimChar"/>
+        </w:rPr>
+        <w:t xml:space="preserve">localStorage</w:t>
+      </w:r>
+      <w:r>
+        <w:t xml:space="preserve"> </w:t>
+      </w:r>
+      <w:r>
+        <w:t xml:space="preserve">for browser builds.</w:t>
       </w:r>
     </w:p>
     <w:p>
@@ -846,11 +2313,13 @@
       <w:r>
         <w:rPr>
           <w:rStyle w:val="VerbatimChar"/>
-        </w:rPr>
-        <w:t xml:space="preserve">addTenancy(tenancy)</w:t>
-      </w:r>
-      <w:r>
-        <w:t xml:space="preserve">: Registers a room occupancy mapping.</w:t>
+          <w:b/>
+          <w:bCs/>
+        </w:rPr>
+        <w:t xml:space="preserve">src/database/dbIntegration.test.ts</w:t>
+      </w:r>
+      <w:r>
+        <w:t xml:space="preserve">: Performs E2E integration tests over the database tables, simulating the entire tenant lifecycle.</w:t>
       </w:r>
     </w:p>
     <w:p>
@@ -864,30 +2333,29 @@
       <w:r>
         <w:rPr>
           <w:rStyle w:val="VerbatimChar"/>
-        </w:rPr>
-        <w:t xml:space="preserve">getActiveTenancyForRoom(roomId)</w:t>
-      </w:r>
-      <w:r>
-        <w:t xml:space="preserve">: Queries active tenancies and joins tenant profile attributes.</w:t>
-      </w:r>
-    </w:p>
-    <w:bookmarkEnd w:id="17"/>
-    <w:bookmarkStart w:id="18" w:name="Xa479247de60b0a130c09d81c654af414a636fa5"/>
-    <w:p>
-      <w:pPr>
-        <w:pStyle w:val="Heading4"/>
-      </w:pPr>
-      <w:r>
-        <w:t xml:space="preserve">3. Agreement API (</w:t>
-      </w:r>
-      <w:r>
-        <w:rPr>
-          <w:rStyle w:val="VerbatimChar"/>
-        </w:rPr>
-        <w:t xml:space="preserve">src/features/agreement/AgreementModel.ts</w:t>
-      </w:r>
-      <w:r>
-        <w:t xml:space="preserve">)</w:t>
+          <w:b/>
+          <w:bCs/>
+        </w:rPr>
+        <w:t xml:space="preserve">src/constants/colors.ts</w:t>
+      </w:r>
+      <w:r>
+        <w:t xml:space="preserve">: Contains our redesigned modern</w:t>
+      </w:r>
+      <w:r>
+        <w:t xml:space="preserve"> </w:t>
+      </w:r>
+      <w:r>
+        <w:rPr>
+          <w:b/>
+          <w:bCs/>
+        </w:rPr>
+        <w:t xml:space="preserve">Indigo-Slate</w:t>
+      </w:r>
+      <w:r>
+        <w:t xml:space="preserve"> </w:t>
+      </w:r>
+      <w:r>
+        <w:t xml:space="preserve">brand color tokens.</w:t>
       </w:r>
     </w:p>
     <w:p>
@@ -895,29 +2363,19 @@
         <w:pStyle w:val="Compact"/>
         <w:numPr>
           <w:ilvl w:val="0"/>
-          <w:numId w:val="1007"/>
+          <w:numId w:val="1006"/>
         </w:numPr>
       </w:pPr>
       <w:r>
         <w:rPr>
           <w:rStyle w:val="VerbatimChar"/>
-        </w:rPr>
-        <w:t xml:space="preserve">initAgreementSchema()</w:t>
-      </w:r>
-      <w:r>
-        <w:t xml:space="preserve">: Bootstraps</w:t>
-      </w:r>
-      <w:r>
-        <w:t xml:space="preserve"> </w:t>
-      </w:r>
-      <w:r>
-        <w:rPr>
-          <w:rStyle w:val="VerbatimChar"/>
-        </w:rPr>
-        <w:t xml:space="preserve">tenancy_agreements</w:t>
-      </w:r>
-      <w:r>
-        <w:t xml:space="preserve">.</w:t>
+          <w:b/>
+          <w:bCs/>
+        </w:rPr>
+        <w:t xml:space="preserve">src/types/nepali-date-converter.d.ts</w:t>
+      </w:r>
+      <w:r>
+        <w:t xml:space="preserve">: Ambient TypeScript declaration types for the Bikram Sambat date converter library.</w:t>
       </w:r>
     </w:p>
     <w:p>
@@ -925,17 +2383,19 @@
         <w:pStyle w:val="Compact"/>
         <w:numPr>
           <w:ilvl w:val="0"/>
-          <w:numId w:val="1007"/>
+          <w:numId w:val="1006"/>
         </w:numPr>
       </w:pPr>
       <w:r>
         <w:rPr>
           <w:rStyle w:val="VerbatimChar"/>
-        </w:rPr>
-        <w:t xml:space="preserve">saveAgreement(agreement)</w:t>
-      </w:r>
-      <w:r>
-        <w:t xml:space="preserve">: Saves rent terms, electric rates, and landlord/tenant SVG signatures.</w:t>
+          <w:b/>
+          <w:bCs/>
+        </w:rPr>
+        <w:t xml:space="preserve">src/components/SignaturePad.tsx</w:t>
+      </w:r>
+      <w:r>
+        <w:t xml:space="preserve">: Signature drawing canvas component compiled using React Native SVG paths.</w:t>
       </w:r>
     </w:p>
     <w:p>
@@ -943,36 +2403,19 @@
         <w:pStyle w:val="Compact"/>
         <w:numPr>
           <w:ilvl w:val="0"/>
-          <w:numId w:val="1007"/>
+          <w:numId w:val="1006"/>
         </w:numPr>
       </w:pPr>
       <w:r>
         <w:rPr>
           <w:rStyle w:val="VerbatimChar"/>
-        </w:rPr>
-        <w:t xml:space="preserve">getAgreementForTenancy(tenancyId)</w:t>
-      </w:r>
-      <w:r>
-        <w:t xml:space="preserve">: Fetches active contracts.</w:t>
-      </w:r>
-    </w:p>
-    <w:bookmarkEnd w:id="18"/>
-    <w:bookmarkStart w:id="19" w:name="Xd1c4ea1a4608f2d1c8c61f295526e950dabc861"/>
-    <w:p>
-      <w:pPr>
-        <w:pStyle w:val="Heading4"/>
-      </w:pPr>
-      <w:r>
-        <w:t xml:space="preserve">4. Invoice &amp; Billing API (</w:t>
-      </w:r>
-      <w:r>
-        <w:rPr>
-          <w:rStyle w:val="VerbatimChar"/>
-        </w:rPr>
-        <w:t xml:space="preserve">src/features/invoice/InvoiceModel.ts</w:t>
-      </w:r>
-      <w:r>
-        <w:t xml:space="preserve">)</w:t>
+          <w:b/>
+          <w:bCs/>
+        </w:rPr>
+        <w:t xml:space="preserve">src/features/tenant/TenantModel.ts</w:t>
+      </w:r>
+      <w:r>
+        <w:t xml:space="preserve">: Database model queries and schema initializers for tenants and tenancies.</w:t>
       </w:r>
     </w:p>
     <w:p>
@@ -980,47 +2423,19 @@
         <w:pStyle w:val="Compact"/>
         <w:numPr>
           <w:ilvl w:val="0"/>
-          <w:numId w:val="1008"/>
+          <w:numId w:val="1006"/>
         </w:numPr>
       </w:pPr>
       <w:r>
         <w:rPr>
           <w:rStyle w:val="VerbatimChar"/>
-        </w:rPr>
-        <w:t xml:space="preserve">initInvoiceSchema()</w:t>
-      </w:r>
-      <w:r>
-        <w:t xml:space="preserve">: Bootstraps</w:t>
-      </w:r>
-      <w:r>
-        <w:t xml:space="preserve"> </w:t>
-      </w:r>
-      <w:r>
-        <w:rPr>
-          <w:rStyle w:val="VerbatimChar"/>
-        </w:rPr>
-        <w:t xml:space="preserve">invoices</w:t>
-      </w:r>
-      <w:r>
-        <w:t xml:space="preserve"> </w:t>
-      </w:r>
-      <w:r>
-        <w:t xml:space="preserve">and</w:t>
-      </w:r>
-      <w:r>
-        <w:t xml:space="preserve"> </w:t>
-      </w:r>
-      <w:r>
-        <w:rPr>
-          <w:rStyle w:val="VerbatimChar"/>
-        </w:rPr>
-        <w:t xml:space="preserve">meter_readings</w:t>
-      </w:r>
-      <w:r>
-        <w:t xml:space="preserve"> </w:t>
-      </w:r>
-      <w:r>
-        <w:t xml:space="preserve">tables.</w:t>
+          <w:b/>
+          <w:bCs/>
+        </w:rPr>
+        <w:t xml:space="preserve">src/features/tenant/TenantController.ts</w:t>
+      </w:r>
+      <w:r>
+        <w:t xml:space="preserve">: State machine managing tenant onboarding, KYC image selectors, and property reviews logic.</w:t>
       </w:r>
     </w:p>
     <w:p>
@@ -1028,17 +2443,19 @@
         <w:pStyle w:val="Compact"/>
         <w:numPr>
           <w:ilvl w:val="0"/>
-          <w:numId w:val="1008"/>
+          <w:numId w:val="1006"/>
         </w:numPr>
       </w:pPr>
       <w:r>
         <w:rPr>
           <w:rStyle w:val="VerbatimChar"/>
-        </w:rPr>
-        <w:t xml:space="preserve">addInvoice(invoice)</w:t>
-      </w:r>
-      <w:r>
-        <w:t xml:space="preserve">: Saves monthly bill entries.</w:t>
+          <w:b/>
+          <w:bCs/>
+        </w:rPr>
+        <w:t xml:space="preserve">src/features/tenant/TenantScreen.tsx</w:t>
+      </w:r>
+      <w:r>
+        <w:t xml:space="preserve">: Renders tenant profiles, active leases, invoices lists, and property review cards.</w:t>
       </w:r>
     </w:p>
     <w:p>
@@ -1046,17 +2463,19 @@
         <w:pStyle w:val="Compact"/>
         <w:numPr>
           <w:ilvl w:val="0"/>
-          <w:numId w:val="1008"/>
+          <w:numId w:val="1006"/>
         </w:numPr>
       </w:pPr>
       <w:r>
         <w:rPr>
           <w:rStyle w:val="VerbatimChar"/>
-        </w:rPr>
-        <w:t xml:space="preserve">calculateArrearsForTenancy(tenancyId)</w:t>
-      </w:r>
-      <w:r>
-        <w:t xml:space="preserve">: Sums unpaid balances from past cycles.</w:t>
+          <w:b/>
+          <w:bCs/>
+        </w:rPr>
+        <w:t xml:space="preserve">src/features/postings/PostingModel.ts</w:t>
+      </w:r>
+      <w:r>
+        <w:t xml:space="preserve">: Manages CRUD queries for vacant room marketplace listings.</w:t>
       </w:r>
     </w:p>
     <w:p>
@@ -1064,17 +2483,19 @@
         <w:pStyle w:val="Compact"/>
         <w:numPr>
           <w:ilvl w:val="0"/>
-          <w:numId w:val="1008"/>
+          <w:numId w:val="1006"/>
         </w:numPr>
       </w:pPr>
       <w:r>
         <w:rPr>
           <w:rStyle w:val="VerbatimChar"/>
-        </w:rPr>
-        <w:t xml:space="preserve">getLastMeterReading(tenancyId)</w:t>
-      </w:r>
-      <w:r>
-        <w:t xml:space="preserve">: Fetches the most recent electricity sub-meter log.</w:t>
+          <w:b/>
+          <w:bCs/>
+        </w:rPr>
+        <w:t xml:space="preserve">src/features/postings/PostingController.ts</w:t>
+      </w:r>
+      <w:r>
+        <w:t xml:space="preserve">: Handles logic for editing and publishing room postings.</w:t>
       </w:r>
     </w:p>
     <w:p>
@@ -1082,36 +2503,19 @@
         <w:pStyle w:val="Compact"/>
         <w:numPr>
           <w:ilvl w:val="0"/>
-          <w:numId w:val="1008"/>
+          <w:numId w:val="1006"/>
         </w:numPr>
       </w:pPr>
       <w:r>
         <w:rPr>
           <w:rStyle w:val="VerbatimChar"/>
-        </w:rPr>
-        <w:t xml:space="preserve">addMeterReading(reading)</w:t>
-      </w:r>
-      <w:r>
-        <w:t xml:space="preserve">: Registers a new sub-meter reading.</w:t>
-      </w:r>
-    </w:p>
-    <w:bookmarkEnd w:id="19"/>
-    <w:bookmarkStart w:id="20" w:name="Xc0a9f765513eead1b50eee5e828d7ef193703a5"/>
-    <w:p>
-      <w:pPr>
-        <w:pStyle w:val="Heading4"/>
-      </w:pPr>
-      <w:r>
-        <w:t xml:space="preserve">5. Payment API (</w:t>
-      </w:r>
-      <w:r>
-        <w:rPr>
-          <w:rStyle w:val="VerbatimChar"/>
-        </w:rPr>
-        <w:t xml:space="preserve">src/features/payment/PaymentModel.ts</w:t>
-      </w:r>
-      <w:r>
-        <w:t xml:space="preserve">)</w:t>
+          <w:b/>
+          <w:bCs/>
+        </w:rPr>
+        <w:t xml:space="preserve">src/features/postings/MarketplaceFeed.tsx</w:t>
+      </w:r>
+      <w:r>
+        <w:t xml:space="preserve">: Search feed where prospective tenants can view vacant postings in Kathmandu.</w:t>
       </w:r>
     </w:p>
     <w:p>
@@ -1119,32 +2523,19 @@
         <w:pStyle w:val="Compact"/>
         <w:numPr>
           <w:ilvl w:val="0"/>
-          <w:numId w:val="1009"/>
+          <w:numId w:val="1006"/>
         </w:numPr>
       </w:pPr>
       <w:r>
         <w:rPr>
           <w:rStyle w:val="VerbatimChar"/>
-        </w:rPr>
-        <w:t xml:space="preserve">initPaymentSchema()</w:t>
-      </w:r>
-      <w:r>
-        <w:t xml:space="preserve">: Bootstraps</w:t>
-      </w:r>
-      <w:r>
-        <w:t xml:space="preserve"> </w:t>
-      </w:r>
-      <w:r>
-        <w:rPr>
-          <w:rStyle w:val="VerbatimChar"/>
-        </w:rPr>
-        <w:t xml:space="preserve">payments</w:t>
-      </w:r>
-      <w:r>
-        <w:t xml:space="preserve"> </w:t>
-      </w:r>
-      <w:r>
-        <w:t xml:space="preserve">logs.</w:t>
+          <w:b/>
+          <w:bCs/>
+        </w:rPr>
+        <w:t xml:space="preserve">src/features/property/PropertyModel.ts</w:t>
+      </w:r>
+      <w:r>
+        <w:t xml:space="preserve">: Database queries for housekeeper properties and rooms.</w:t>
       </w:r>
     </w:p>
     <w:p>
@@ -1152,17 +2543,19 @@
         <w:pStyle w:val="Compact"/>
         <w:numPr>
           <w:ilvl w:val="0"/>
-          <w:numId w:val="1009"/>
+          <w:numId w:val="1006"/>
         </w:numPr>
       </w:pPr>
       <w:r>
         <w:rPr>
           <w:rStyle w:val="VerbatimChar"/>
-        </w:rPr>
-        <w:t xml:space="preserve">addPayment(payment)</w:t>
-      </w:r>
-      <w:r>
-        <w:t xml:space="preserve">: Logs transaction amounts and payment methods (eSewa, cash, bank).</w:t>
+          <w:b/>
+          <w:bCs/>
+        </w:rPr>
+        <w:t xml:space="preserve">src/features/property/PropertyController.ts</w:t>
+      </w:r>
+      <w:r>
+        <w:t xml:space="preserve">: State controller managing properties creation.</w:t>
       </w:r>
     </w:p>
     <w:p>
@@ -1170,36 +2563,19 @@
         <w:pStyle w:val="Compact"/>
         <w:numPr>
           <w:ilvl w:val="0"/>
-          <w:numId w:val="1009"/>
+          <w:numId w:val="1006"/>
         </w:numPr>
       </w:pPr>
       <w:r>
         <w:rPr>
           <w:rStyle w:val="VerbatimChar"/>
-        </w:rPr>
-        <w:t xml:space="preserve">getPaymentsForInvoice(invoiceId)</w:t>
-      </w:r>
-      <w:r>
-        <w:t xml:space="preserve">: Fetches payment history.</w:t>
-      </w:r>
-    </w:p>
-    <w:bookmarkEnd w:id="20"/>
-    <w:bookmarkStart w:id="21" w:name="X070d08586338cff2e446e073e2d2e5bff4eeb8a"/>
-    <w:p>
-      <w:pPr>
-        <w:pStyle w:val="Heading4"/>
-      </w:pPr>
-      <w:r>
-        <w:t xml:space="preserve">6. Checkout API (</w:t>
-      </w:r>
-      <w:r>
-        <w:rPr>
-          <w:rStyle w:val="VerbatimChar"/>
-        </w:rPr>
-        <w:t xml:space="preserve">src/features/checkout/CheckoutModel.ts</w:t>
-      </w:r>
-      <w:r>
-        <w:t xml:space="preserve">)</w:t>
+          <w:b/>
+          <w:bCs/>
+        </w:rPr>
+        <w:t xml:space="preserve">src/features/property/PropertyScreen.tsx</w:t>
+      </w:r>
+      <w:r>
+        <w:t xml:space="preserve">: Main housekeeper dashboard showing property grids, room status metrics, and wizard modulators.</w:t>
       </w:r>
     </w:p>
     <w:p>
@@ -1207,32 +2583,19 @@
         <w:pStyle w:val="Compact"/>
         <w:numPr>
           <w:ilvl w:val="0"/>
-          <w:numId w:val="1010"/>
+          <w:numId w:val="1006"/>
         </w:numPr>
       </w:pPr>
       <w:r>
         <w:rPr>
           <w:rStyle w:val="VerbatimChar"/>
-        </w:rPr>
-        <w:t xml:space="preserve">initCheckoutSchema()</w:t>
-      </w:r>
-      <w:r>
-        <w:t xml:space="preserve">: Bootstraps</w:t>
-      </w:r>
-      <w:r>
-        <w:t xml:space="preserve"> </w:t>
-      </w:r>
-      <w:r>
-        <w:rPr>
-          <w:rStyle w:val="VerbatimChar"/>
-        </w:rPr>
-        <w:t xml:space="preserve">checkout_settlements</w:t>
-      </w:r>
-      <w:r>
-        <w:t xml:space="preserve"> </w:t>
-      </w:r>
-      <w:r>
-        <w:t xml:space="preserve">tables.</w:t>
+          <w:b/>
+          <w:bCs/>
+        </w:rPr>
+        <w:t xml:space="preserve">src/features/payment/PaymentModel.ts</w:t>
+      </w:r>
+      <w:r>
+        <w:t xml:space="preserve">: Database helper functions to record rent transaction receipts.</w:t>
       </w:r>
     </w:p>
     <w:p>
@@ -1240,17 +2603,19 @@
         <w:pStyle w:val="Compact"/>
         <w:numPr>
           <w:ilvl w:val="0"/>
-          <w:numId w:val="1010"/>
+          <w:numId w:val="1006"/>
         </w:numPr>
       </w:pPr>
       <w:r>
         <w:rPr>
           <w:rStyle w:val="VerbatimChar"/>
-        </w:rPr>
-        <w:t xml:space="preserve">addCheckoutSettlement(settlement)</w:t>
-      </w:r>
-      <w:r>
-        <w:t xml:space="preserve">: Saves final settlement totals.</w:t>
+          <w:b/>
+          <w:bCs/>
+        </w:rPr>
+        <w:t xml:space="preserve">src/features/payment/PaymentController.ts</w:t>
+      </w:r>
+      <w:r>
+        <w:t xml:space="preserve">: Handles cash receipt confirmations, OTP codes, and digital receipt uploads.</w:t>
       </w:r>
     </w:p>
     <w:p>
@@ -1258,36 +2623,19 @@
         <w:pStyle w:val="Compact"/>
         <w:numPr>
           <w:ilvl w:val="0"/>
-          <w:numId w:val="1010"/>
+          <w:numId w:val="1006"/>
         </w:numPr>
       </w:pPr>
       <w:r>
         <w:rPr>
           <w:rStyle w:val="VerbatimChar"/>
-        </w:rPr>
-        <w:t xml:space="preserve">terminateTenancy(tenancyId, roomId, endDate, depositStatus)</w:t>
-      </w:r>
-      <w:r>
-        <w:t xml:space="preserve">: Closes active leases and sets room status to vacant.</w:t>
-      </w:r>
-    </w:p>
-    <w:bookmarkEnd w:id="21"/>
-    <w:bookmarkStart w:id="22" w:name="X40e65098b208ca6c021771f3805b7cb62ccd5aa"/>
-    <w:p>
-      <w:pPr>
-        <w:pStyle w:val="Heading4"/>
-      </w:pPr>
-      <w:r>
-        <w:t xml:space="preserve">7. Review API (</w:t>
-      </w:r>
-      <w:r>
-        <w:rPr>
-          <w:rStyle w:val="VerbatimChar"/>
-        </w:rPr>
-        <w:t xml:space="preserve">src/features/reviews/ReviewModel.ts</w:t>
-      </w:r>
-      <w:r>
-        <w:t xml:space="preserve">)</w:t>
+          <w:b/>
+          <w:bCs/>
+        </w:rPr>
+        <w:t xml:space="preserve">src/features/payment/PaymentModal.tsx</w:t>
+      </w:r>
+      <w:r>
+        <w:t xml:space="preserve">: Overlay modal rendering eSewa QR payment panels and cash OTP signature boxes.</w:t>
       </w:r>
     </w:p>
     <w:p>
@@ -1295,47 +2643,19 @@
         <w:pStyle w:val="Compact"/>
         <w:numPr>
           <w:ilvl w:val="0"/>
-          <w:numId w:val="1011"/>
+          <w:numId w:val="1006"/>
         </w:numPr>
       </w:pPr>
       <w:r>
         <w:rPr>
           <w:rStyle w:val="VerbatimChar"/>
-        </w:rPr>
-        <w:t xml:space="preserve">initReviewSchema()</w:t>
-      </w:r>
-      <w:r>
-        <w:t xml:space="preserve">: Bootstraps</w:t>
-      </w:r>
-      <w:r>
-        <w:t xml:space="preserve"> </w:t>
-      </w:r>
-      <w:r>
-        <w:rPr>
-          <w:rStyle w:val="VerbatimChar"/>
-        </w:rPr>
-        <w:t xml:space="preserve">tenant_reviews</w:t>
-      </w:r>
-      <w:r>
-        <w:t xml:space="preserve"> </w:t>
-      </w:r>
-      <w:r>
-        <w:t xml:space="preserve">and</w:t>
-      </w:r>
-      <w:r>
-        <w:t xml:space="preserve"> </w:t>
-      </w:r>
-      <w:r>
-        <w:rPr>
-          <w:rStyle w:val="VerbatimChar"/>
-        </w:rPr>
-        <w:t xml:space="preserve">property_reviews</w:t>
-      </w:r>
-      <w:r>
-        <w:t xml:space="preserve"> </w:t>
-      </w:r>
-      <w:r>
-        <w:t xml:space="preserve">tables.</w:t>
+          <w:b/>
+          <w:bCs/>
+        </w:rPr>
+        <w:t xml:space="preserve">src/features/agreement/AgreementModel.ts</w:t>
+      </w:r>
+      <w:r>
+        <w:t xml:space="preserve">: Database operations for managing digital rental contracts.</w:t>
       </w:r>
     </w:p>
     <w:p>
@@ -1343,17 +2663,19 @@
         <w:pStyle w:val="Compact"/>
         <w:numPr>
           <w:ilvl w:val="0"/>
-          <w:numId w:val="1011"/>
+          <w:numId w:val="1006"/>
         </w:numPr>
       </w:pPr>
       <w:r>
         <w:rPr>
           <w:rStyle w:val="VerbatimChar"/>
-        </w:rPr>
-        <w:t xml:space="preserve">addTenantReview(review)</w:t>
-      </w:r>
-      <w:r>
-        <w:t xml:space="preserve">: Adds landlord rating, recalculating the tenant’s average reputation.</w:t>
+          <w:b/>
+          <w:bCs/>
+        </w:rPr>
+        <w:t xml:space="preserve">src/features/agreement/AgreementController.ts</w:t>
+      </w:r>
+      <w:r>
+        <w:t xml:space="preserve">: Handles signature steps and contract terms.</w:t>
       </w:r>
     </w:p>
     <w:p>
@@ -1361,17 +2683,19 @@
         <w:pStyle w:val="Compact"/>
         <w:numPr>
           <w:ilvl w:val="0"/>
-          <w:numId w:val="1011"/>
+          <w:numId w:val="1006"/>
         </w:numPr>
       </w:pPr>
       <w:r>
         <w:rPr>
           <w:rStyle w:val="VerbatimChar"/>
-        </w:rPr>
-        <w:t xml:space="preserve">addPropertyReview(review)</w:t>
-      </w:r>
-      <w:r>
-        <w:t xml:space="preserve">: Logs tenant reviews on houses.</w:t>
+          <w:b/>
+          <w:bCs/>
+        </w:rPr>
+        <w:t xml:space="preserve">src/features/agreement/AgreementModal.tsx</w:t>
+      </w:r>
+      <w:r>
+        <w:t xml:space="preserve">: Dual-signature pad wizard showing printable contract summaries.</w:t>
       </w:r>
     </w:p>
     <w:p>
@@ -1379,17 +2703,19 @@
         <w:pStyle w:val="Compact"/>
         <w:numPr>
           <w:ilvl w:val="0"/>
-          <w:numId w:val="1011"/>
+          <w:numId w:val="1006"/>
         </w:numPr>
       </w:pPr>
       <w:r>
         <w:rPr>
           <w:rStyle w:val="VerbatimChar"/>
-        </w:rPr>
-        <w:t xml:space="preserve">getReviewsForTenant(tenantId)</w:t>
-      </w:r>
-      <w:r>
-        <w:t xml:space="preserve">: Lists tenant rating histories.</w:t>
+          <w:b/>
+          <w:bCs/>
+        </w:rPr>
+        <w:t xml:space="preserve">src/features/checkout/CheckoutModel.ts</w:t>
+      </w:r>
+      <w:r>
+        <w:t xml:space="preserve">: Handles closing active leases and logging settlements.</w:t>
       </w:r>
     </w:p>
     <w:p>
@@ -1397,43 +2723,19 @@
         <w:pStyle w:val="Compact"/>
         <w:numPr>
           <w:ilvl w:val="0"/>
-          <w:numId w:val="1011"/>
+          <w:numId w:val="1006"/>
         </w:numPr>
       </w:pPr>
       <w:r>
         <w:rPr>
           <w:rStyle w:val="VerbatimChar"/>
-        </w:rPr>
-        <w:t xml:space="preserve">getReviewsForProperty(houseId)</w:t>
-      </w:r>
-      <w:r>
-        <w:t xml:space="preserve">: Lists property condition feedback.</w:t>
-      </w:r>
-    </w:p>
-    <w:p>
-      <w:r>
-        <w:pict>
-          <v:rect style="width:0;height:1.5pt" o:hralign="center" o:hrstd="t" o:hr="t"/>
-        </w:pict>
-      </w:r>
-    </w:p>
-    <w:bookmarkEnd w:id="22"/>
-    <w:bookmarkEnd w:id="23"/>
-    <w:bookmarkStart w:id="24" w:name="file-by-file-codebase-explanations"/>
-    <w:p>
-      <w:pPr>
-        <w:pStyle w:val="Heading3"/>
-      </w:pPr>
-      <w:r>
-        <w:t xml:space="preserve">File-by-File Codebase Explanations</w:t>
-      </w:r>
-    </w:p>
-    <w:p>
-      <w:pPr>
-        <w:pStyle w:val="FirstParagraph"/>
-      </w:pPr>
-      <w:r>
-        <w:t xml:space="preserve">Here is a directory map and description of the source code files:</w:t>
+          <w:b/>
+          <w:bCs/>
+        </w:rPr>
+        <w:t xml:space="preserve">src/features/checkout/CheckoutController.ts</w:t>
+      </w:r>
+      <w:r>
+        <w:t xml:space="preserve">: Calculates pro-rated final cycle rent, utilities usage, and deposit balances.</w:t>
       </w:r>
     </w:p>
     <w:p>
@@ -1441,7 +2743,7 @@
         <w:pStyle w:val="Compact"/>
         <w:numPr>
           <w:ilvl w:val="0"/>
-          <w:numId w:val="1012"/>
+          <w:numId w:val="1006"/>
         </w:numPr>
       </w:pPr>
       <w:r>
@@ -1450,10 +2752,10 @@
           <w:b/>
           <w:bCs/>
         </w:rPr>
-        <w:t xml:space="preserve">src/database/schema.ts</w:t>
-      </w:r>
-      <w:r>
-        <w:t xml:space="preserve">: Declares database schemas using Drizzle SQLite core (tables for houses, rooms, postings, tenants, tenancies, agreements, invoices, readings, payments, settlements, and reviews).</w:t>
+        <w:t xml:space="preserve">src/features/checkout/CheckoutModal.tsx</w:t>
+      </w:r>
+      <w:r>
+        <w:t xml:space="preserve">: 3-step checkout wizard with interactive tenant rating stars.</w:t>
       </w:r>
     </w:p>
     <w:p>
@@ -1461,7 +2763,7 @@
         <w:pStyle w:val="Compact"/>
         <w:numPr>
           <w:ilvl w:val="0"/>
-          <w:numId w:val="1012"/>
+          <w:numId w:val="1006"/>
         </w:numPr>
       </w:pPr>
       <w:r>
@@ -1470,25 +2772,10 @@
           <w:b/>
           <w:bCs/>
         </w:rPr>
-        <w:t xml:space="preserve">src/database/connection.ts</w:t>
-      </w:r>
-      <w:r>
-        <w:t xml:space="preserve">: Opens the database connection. Implements a web fallback engine relying on</w:t>
-      </w:r>
-      <w:r>
-        <w:t xml:space="preserve"> </w:t>
-      </w:r>
-      <w:r>
-        <w:rPr>
-          <w:rStyle w:val="VerbatimChar"/>
-        </w:rPr>
-        <w:t xml:space="preserve">localStorage</w:t>
-      </w:r>
-      <w:r>
-        <w:t xml:space="preserve"> </w:t>
-      </w:r>
-      <w:r>
-        <w:t xml:space="preserve">for browser builds.</w:t>
+        <w:t xml:space="preserve">src/features/invoice/InvoiceModel.ts</w:t>
+      </w:r>
+      <w:r>
+        <w:t xml:space="preserve">: Manages invoice generation and arrears carry-forward.</w:t>
       </w:r>
     </w:p>
     <w:p>
@@ -1496,7 +2783,7 @@
         <w:pStyle w:val="Compact"/>
         <w:numPr>
           <w:ilvl w:val="0"/>
-          <w:numId w:val="1012"/>
+          <w:numId w:val="1006"/>
         </w:numPr>
       </w:pPr>
       <w:r>
@@ -1505,10 +2792,10 @@
           <w:b/>
           <w:bCs/>
         </w:rPr>
-        <w:t xml:space="preserve">src/database/dbIntegration.test.ts</w:t>
-      </w:r>
-      <w:r>
-        <w:t xml:space="preserve">: Performs E2E integration tests over the database tables, simulating the entire tenant lifecycle.</w:t>
+        <w:t xml:space="preserve">src/features/invoice/InvoiceController.ts</w:t>
+      </w:r>
+      <w:r>
+        <w:t xml:space="preserve">: Handles sub-meter inputs and invoice submissions.</w:t>
       </w:r>
     </w:p>
     <w:p>
@@ -1516,7 +2803,7 @@
         <w:pStyle w:val="Compact"/>
         <w:numPr>
           <w:ilvl w:val="0"/>
-          <w:numId w:val="1012"/>
+          <w:numId w:val="1006"/>
         </w:numPr>
       </w:pPr>
       <w:r>
@@ -1525,26 +2812,10 @@
           <w:b/>
           <w:bCs/>
         </w:rPr>
-        <w:t xml:space="preserve">src/constants/colors.ts</w:t>
-      </w:r>
-      <w:r>
-        <w:t xml:space="preserve">: Contains our redesigned modern</w:t>
-      </w:r>
-      <w:r>
-        <w:t xml:space="preserve"> </w:t>
-      </w:r>
-      <w:r>
-        <w:rPr>
-          <w:b/>
-          <w:bCs/>
-        </w:rPr>
-        <w:t xml:space="preserve">Indigo-Slate</w:t>
-      </w:r>
-      <w:r>
-        <w:t xml:space="preserve"> </w:t>
-      </w:r>
-      <w:r>
-        <w:t xml:space="preserve">brand color tokens.</w:t>
+        <w:t xml:space="preserve">src/features/invoice/InvoiceSection.tsx</w:t>
+      </w:r>
+      <w:r>
+        <w:t xml:space="preserve">: Lists billing details and pro-rated ledgers.</w:t>
       </w:r>
     </w:p>
     <w:p>
@@ -1552,7 +2823,7 @@
         <w:pStyle w:val="Compact"/>
         <w:numPr>
           <w:ilvl w:val="0"/>
-          <w:numId w:val="1012"/>
+          <w:numId w:val="1006"/>
         </w:numPr>
       </w:pPr>
       <w:r>
@@ -1561,10 +2832,10 @@
           <w:b/>
           <w:bCs/>
         </w:rPr>
-        <w:t xml:space="preserve">src/types/nepali-date-converter.d.ts</w:t>
-      </w:r>
-      <w:r>
-        <w:t xml:space="preserve">: Ambient TypeScript declaration types for the Bikram Sambat date converter library.</w:t>
+        <w:t xml:space="preserve">src/features/reviews/ReviewModel.ts</w:t>
+      </w:r>
+      <w:r>
+        <w:t xml:space="preserve">: SQLite CRUD functions for tenant rating cards and property reviews.</w:t>
       </w:r>
     </w:p>
     <w:p>
@@ -1572,467 +2843,7 @@
         <w:pStyle w:val="Compact"/>
         <w:numPr>
           <w:ilvl w:val="0"/>
-          <w:numId w:val="1012"/>
-        </w:numPr>
-      </w:pPr>
-      <w:r>
-        <w:rPr>
-          <w:rStyle w:val="VerbatimChar"/>
-          <w:b/>
-          <w:bCs/>
-        </w:rPr>
-        <w:t xml:space="preserve">src/components/SignaturePad.tsx</w:t>
-      </w:r>
-      <w:r>
-        <w:t xml:space="preserve">: Signature drawing canvas component compiled using React Native SVG paths.</w:t>
-      </w:r>
-    </w:p>
-    <w:p>
-      <w:pPr>
-        <w:pStyle w:val="Compact"/>
-        <w:numPr>
-          <w:ilvl w:val="0"/>
-          <w:numId w:val="1012"/>
-        </w:numPr>
-      </w:pPr>
-      <w:r>
-        <w:rPr>
-          <w:rStyle w:val="VerbatimChar"/>
-          <w:b/>
-          <w:bCs/>
-        </w:rPr>
-        <w:t xml:space="preserve">src/features/tenant/TenantModel.ts</w:t>
-      </w:r>
-      <w:r>
-        <w:t xml:space="preserve">: Database model queries and schema initializers for tenants and tenancies.</w:t>
-      </w:r>
-    </w:p>
-    <w:p>
-      <w:pPr>
-        <w:pStyle w:val="Compact"/>
-        <w:numPr>
-          <w:ilvl w:val="0"/>
-          <w:numId w:val="1012"/>
-        </w:numPr>
-      </w:pPr>
-      <w:r>
-        <w:rPr>
-          <w:rStyle w:val="VerbatimChar"/>
-          <w:b/>
-          <w:bCs/>
-        </w:rPr>
-        <w:t xml:space="preserve">src/features/tenant/TenantController.ts</w:t>
-      </w:r>
-      <w:r>
-        <w:t xml:space="preserve">: State machine managing tenant onboarding, KYC image selectors, and property reviews logic.</w:t>
-      </w:r>
-    </w:p>
-    <w:p>
-      <w:pPr>
-        <w:pStyle w:val="Compact"/>
-        <w:numPr>
-          <w:ilvl w:val="0"/>
-          <w:numId w:val="1012"/>
-        </w:numPr>
-      </w:pPr>
-      <w:r>
-        <w:rPr>
-          <w:rStyle w:val="VerbatimChar"/>
-          <w:b/>
-          <w:bCs/>
-        </w:rPr>
-        <w:t xml:space="preserve">src/features/tenant/TenantScreen.tsx</w:t>
-      </w:r>
-      <w:r>
-        <w:t xml:space="preserve">: Renders tenant profiles, active leases, invoices lists, and property review cards.</w:t>
-      </w:r>
-    </w:p>
-    <w:p>
-      <w:pPr>
-        <w:pStyle w:val="Compact"/>
-        <w:numPr>
-          <w:ilvl w:val="0"/>
-          <w:numId w:val="1012"/>
-        </w:numPr>
-      </w:pPr>
-      <w:r>
-        <w:rPr>
-          <w:rStyle w:val="VerbatimChar"/>
-          <w:b/>
-          <w:bCs/>
-        </w:rPr>
-        <w:t xml:space="preserve">src/features/postings/PostingModel.ts</w:t>
-      </w:r>
-      <w:r>
-        <w:t xml:space="preserve">: Manages CRUD queries for vacant room marketplace listings.</w:t>
-      </w:r>
-    </w:p>
-    <w:p>
-      <w:pPr>
-        <w:pStyle w:val="Compact"/>
-        <w:numPr>
-          <w:ilvl w:val="0"/>
-          <w:numId w:val="1012"/>
-        </w:numPr>
-      </w:pPr>
-      <w:r>
-        <w:rPr>
-          <w:rStyle w:val="VerbatimChar"/>
-          <w:b/>
-          <w:bCs/>
-        </w:rPr>
-        <w:t xml:space="preserve">src/features/postings/PostingController.ts</w:t>
-      </w:r>
-      <w:r>
-        <w:t xml:space="preserve">: Handles logic for editing and publishing room postings.</w:t>
-      </w:r>
-    </w:p>
-    <w:p>
-      <w:pPr>
-        <w:pStyle w:val="Compact"/>
-        <w:numPr>
-          <w:ilvl w:val="0"/>
-          <w:numId w:val="1012"/>
-        </w:numPr>
-      </w:pPr>
-      <w:r>
-        <w:rPr>
-          <w:rStyle w:val="VerbatimChar"/>
-          <w:b/>
-          <w:bCs/>
-        </w:rPr>
-        <w:t xml:space="preserve">src/features/postings/MarketplaceFeed.tsx</w:t>
-      </w:r>
-      <w:r>
-        <w:t xml:space="preserve">: Search feed where prospective tenants can view vacant postings in Kathmandu.</w:t>
-      </w:r>
-    </w:p>
-    <w:p>
-      <w:pPr>
-        <w:pStyle w:val="Compact"/>
-        <w:numPr>
-          <w:ilvl w:val="0"/>
-          <w:numId w:val="1012"/>
-        </w:numPr>
-      </w:pPr>
-      <w:r>
-        <w:rPr>
-          <w:rStyle w:val="VerbatimChar"/>
-          <w:b/>
-          <w:bCs/>
-        </w:rPr>
-        <w:t xml:space="preserve">src/features/property/PropertyModel.ts</w:t>
-      </w:r>
-      <w:r>
-        <w:t xml:space="preserve">: Database queries for housekeeper properties and rooms.</w:t>
-      </w:r>
-    </w:p>
-    <w:p>
-      <w:pPr>
-        <w:pStyle w:val="Compact"/>
-        <w:numPr>
-          <w:ilvl w:val="0"/>
-          <w:numId w:val="1012"/>
-        </w:numPr>
-      </w:pPr>
-      <w:r>
-        <w:rPr>
-          <w:rStyle w:val="VerbatimChar"/>
-          <w:b/>
-          <w:bCs/>
-        </w:rPr>
-        <w:t xml:space="preserve">src/features/property/PropertyController.ts</w:t>
-      </w:r>
-      <w:r>
-        <w:t xml:space="preserve">: State controller managing properties creation.</w:t>
-      </w:r>
-    </w:p>
-    <w:p>
-      <w:pPr>
-        <w:pStyle w:val="Compact"/>
-        <w:numPr>
-          <w:ilvl w:val="0"/>
-          <w:numId w:val="1012"/>
-        </w:numPr>
-      </w:pPr>
-      <w:r>
-        <w:rPr>
-          <w:rStyle w:val="VerbatimChar"/>
-          <w:b/>
-          <w:bCs/>
-        </w:rPr>
-        <w:t xml:space="preserve">src/features/property/PropertyScreen.tsx</w:t>
-      </w:r>
-      <w:r>
-        <w:t xml:space="preserve">: Main housekeeper dashboard showing property grids, room status metrics, and wizard modulators.</w:t>
-      </w:r>
-    </w:p>
-    <w:p>
-      <w:pPr>
-        <w:pStyle w:val="Compact"/>
-        <w:numPr>
-          <w:ilvl w:val="0"/>
-          <w:numId w:val="1012"/>
-        </w:numPr>
-      </w:pPr>
-      <w:r>
-        <w:rPr>
-          <w:rStyle w:val="VerbatimChar"/>
-          <w:b/>
-          <w:bCs/>
-        </w:rPr>
-        <w:t xml:space="preserve">src/features/payment/PaymentModel.ts</w:t>
-      </w:r>
-      <w:r>
-        <w:t xml:space="preserve">: Database helper functions to record rent transaction receipts.</w:t>
-      </w:r>
-    </w:p>
-    <w:p>
-      <w:pPr>
-        <w:pStyle w:val="Compact"/>
-        <w:numPr>
-          <w:ilvl w:val="0"/>
-          <w:numId w:val="1012"/>
-        </w:numPr>
-      </w:pPr>
-      <w:r>
-        <w:rPr>
-          <w:rStyle w:val="VerbatimChar"/>
-          <w:b/>
-          <w:bCs/>
-        </w:rPr>
-        <w:t xml:space="preserve">src/features/payment/PaymentController.ts</w:t>
-      </w:r>
-      <w:r>
-        <w:t xml:space="preserve">: Handles cash receipt confirmations, OTP codes, and digital receipt uploads.</w:t>
-      </w:r>
-    </w:p>
-    <w:p>
-      <w:pPr>
-        <w:pStyle w:val="Compact"/>
-        <w:numPr>
-          <w:ilvl w:val="0"/>
-          <w:numId w:val="1012"/>
-        </w:numPr>
-      </w:pPr>
-      <w:r>
-        <w:rPr>
-          <w:rStyle w:val="VerbatimChar"/>
-          <w:b/>
-          <w:bCs/>
-        </w:rPr>
-        <w:t xml:space="preserve">src/features/payment/PaymentModal.tsx</w:t>
-      </w:r>
-      <w:r>
-        <w:t xml:space="preserve">: Overlay modal rendering eSewa QR payment panels and cash OTP signature boxes.</w:t>
-      </w:r>
-    </w:p>
-    <w:p>
-      <w:pPr>
-        <w:pStyle w:val="Compact"/>
-        <w:numPr>
-          <w:ilvl w:val="0"/>
-          <w:numId w:val="1012"/>
-        </w:numPr>
-      </w:pPr>
-      <w:r>
-        <w:rPr>
-          <w:rStyle w:val="VerbatimChar"/>
-          <w:b/>
-          <w:bCs/>
-        </w:rPr>
-        <w:t xml:space="preserve">src/features/agreement/AgreementModel.ts</w:t>
-      </w:r>
-      <w:r>
-        <w:t xml:space="preserve">: Database operations for managing digital rental contracts.</w:t>
-      </w:r>
-    </w:p>
-    <w:p>
-      <w:pPr>
-        <w:pStyle w:val="Compact"/>
-        <w:numPr>
-          <w:ilvl w:val="0"/>
-          <w:numId w:val="1012"/>
-        </w:numPr>
-      </w:pPr>
-      <w:r>
-        <w:rPr>
-          <w:rStyle w:val="VerbatimChar"/>
-          <w:b/>
-          <w:bCs/>
-        </w:rPr>
-        <w:t xml:space="preserve">src/features/agreement/AgreementController.ts</w:t>
-      </w:r>
-      <w:r>
-        <w:t xml:space="preserve">: Handles signature steps and contract terms.</w:t>
-      </w:r>
-    </w:p>
-    <w:p>
-      <w:pPr>
-        <w:pStyle w:val="Compact"/>
-        <w:numPr>
-          <w:ilvl w:val="0"/>
-          <w:numId w:val="1012"/>
-        </w:numPr>
-      </w:pPr>
-      <w:r>
-        <w:rPr>
-          <w:rStyle w:val="VerbatimChar"/>
-          <w:b/>
-          <w:bCs/>
-        </w:rPr>
-        <w:t xml:space="preserve">src/features/agreement/AgreementModal.tsx</w:t>
-      </w:r>
-      <w:r>
-        <w:t xml:space="preserve">: Dual-signature pad wizard showing printable contract summaries.</w:t>
-      </w:r>
-    </w:p>
-    <w:p>
-      <w:pPr>
-        <w:pStyle w:val="Compact"/>
-        <w:numPr>
-          <w:ilvl w:val="0"/>
-          <w:numId w:val="1012"/>
-        </w:numPr>
-      </w:pPr>
-      <w:r>
-        <w:rPr>
-          <w:rStyle w:val="VerbatimChar"/>
-          <w:b/>
-          <w:bCs/>
-        </w:rPr>
-        <w:t xml:space="preserve">src/features/checkout/CheckoutModel.ts</w:t>
-      </w:r>
-      <w:r>
-        <w:t xml:space="preserve">: Handles closing active leases and logging settlements.</w:t>
-      </w:r>
-    </w:p>
-    <w:p>
-      <w:pPr>
-        <w:pStyle w:val="Compact"/>
-        <w:numPr>
-          <w:ilvl w:val="0"/>
-          <w:numId w:val="1012"/>
-        </w:numPr>
-      </w:pPr>
-      <w:r>
-        <w:rPr>
-          <w:rStyle w:val="VerbatimChar"/>
-          <w:b/>
-          <w:bCs/>
-        </w:rPr>
-        <w:t xml:space="preserve">src/features/checkout/CheckoutController.ts</w:t>
-      </w:r>
-      <w:r>
-        <w:t xml:space="preserve">: Calculates pro-rated final cycle rent, utilities usage, and deposit balances.</w:t>
-      </w:r>
-    </w:p>
-    <w:p>
-      <w:pPr>
-        <w:pStyle w:val="Compact"/>
-        <w:numPr>
-          <w:ilvl w:val="0"/>
-          <w:numId w:val="1012"/>
-        </w:numPr>
-      </w:pPr>
-      <w:r>
-        <w:rPr>
-          <w:rStyle w:val="VerbatimChar"/>
-          <w:b/>
-          <w:bCs/>
-        </w:rPr>
-        <w:t xml:space="preserve">src/features/checkout/CheckoutModal.tsx</w:t>
-      </w:r>
-      <w:r>
-        <w:t xml:space="preserve">: 3-step checkout wizard with interactive tenant rating stars.</w:t>
-      </w:r>
-    </w:p>
-    <w:p>
-      <w:pPr>
-        <w:pStyle w:val="Compact"/>
-        <w:numPr>
-          <w:ilvl w:val="0"/>
-          <w:numId w:val="1012"/>
-        </w:numPr>
-      </w:pPr>
-      <w:r>
-        <w:rPr>
-          <w:rStyle w:val="VerbatimChar"/>
-          <w:b/>
-          <w:bCs/>
-        </w:rPr>
-        <w:t xml:space="preserve">src/features/invoice/InvoiceModel.ts</w:t>
-      </w:r>
-      <w:r>
-        <w:t xml:space="preserve">: Manages invoice generation and arrears carry-forward.</w:t>
-      </w:r>
-    </w:p>
-    <w:p>
-      <w:pPr>
-        <w:pStyle w:val="Compact"/>
-        <w:numPr>
-          <w:ilvl w:val="0"/>
-          <w:numId w:val="1012"/>
-        </w:numPr>
-      </w:pPr>
-      <w:r>
-        <w:rPr>
-          <w:rStyle w:val="VerbatimChar"/>
-          <w:b/>
-          <w:bCs/>
-        </w:rPr>
-        <w:t xml:space="preserve">src/features/invoice/InvoiceController.ts</w:t>
-      </w:r>
-      <w:r>
-        <w:t xml:space="preserve">: Handles sub-meter inputs and invoice submissions.</w:t>
-      </w:r>
-    </w:p>
-    <w:p>
-      <w:pPr>
-        <w:pStyle w:val="Compact"/>
-        <w:numPr>
-          <w:ilvl w:val="0"/>
-          <w:numId w:val="1012"/>
-        </w:numPr>
-      </w:pPr>
-      <w:r>
-        <w:rPr>
-          <w:rStyle w:val="VerbatimChar"/>
-          <w:b/>
-          <w:bCs/>
-        </w:rPr>
-        <w:t xml:space="preserve">src/features/invoice/InvoiceSection.tsx</w:t>
-      </w:r>
-      <w:r>
-        <w:t xml:space="preserve">: Lists billing details and pro-rated ledgers.</w:t>
-      </w:r>
-    </w:p>
-    <w:p>
-      <w:pPr>
-        <w:pStyle w:val="Compact"/>
-        <w:numPr>
-          <w:ilvl w:val="0"/>
-          <w:numId w:val="1012"/>
-        </w:numPr>
-      </w:pPr>
-      <w:r>
-        <w:rPr>
-          <w:rStyle w:val="VerbatimChar"/>
-          <w:b/>
-          <w:bCs/>
-        </w:rPr>
-        <w:t xml:space="preserve">src/features/reviews/ReviewModel.ts</w:t>
-      </w:r>
-      <w:r>
-        <w:t xml:space="preserve">: SQLite CRUD functions for tenant rating cards and property reviews.</w:t>
-      </w:r>
-    </w:p>
-    <w:p>
-      <w:pPr>
-        <w:pStyle w:val="Compact"/>
-        <w:numPr>
-          <w:ilvl w:val="0"/>
-          <w:numId w:val="1012"/>
+          <w:numId w:val="1006"/>
         </w:numPr>
       </w:pPr>
       <w:r>
@@ -4428,7 +5239,34 @@
     <w:abstractNumId w:val="991"/>
   </w:num>
   <w:num w:numId="1003">
-    <w:abstractNumId w:val="991"/>
+    <w:abstractNumId w:val="99411"/>
+    <w:lvlOverride w:ilvl="0">
+      <w:startOverride w:val="1"/>
+    </w:lvlOverride>
+    <w:lvlOverride w:ilvl="1">
+      <w:startOverride w:val="1"/>
+    </w:lvlOverride>
+    <w:lvlOverride w:ilvl="2">
+      <w:startOverride w:val="1"/>
+    </w:lvlOverride>
+    <w:lvlOverride w:ilvl="3">
+      <w:startOverride w:val="1"/>
+    </w:lvlOverride>
+    <w:lvlOverride w:ilvl="4">
+      <w:startOverride w:val="1"/>
+    </w:lvlOverride>
+    <w:lvlOverride w:ilvl="5">
+      <w:startOverride w:val="1"/>
+    </w:lvlOverride>
+    <w:lvlOverride w:ilvl="6">
+      <w:startOverride w:val="1"/>
+    </w:lvlOverride>
+    <w:lvlOverride w:ilvl="7">
+      <w:startOverride w:val="1"/>
+    </w:lvlOverride>
+    <w:lvlOverride w:ilvl="8">
+      <w:startOverride w:val="1"/>
+    </w:lvlOverride>
   </w:num>
   <w:num w:numId="1004">
     <w:abstractNumId w:val="991"/>
@@ -4437,24 +5275,6 @@
     <w:abstractNumId w:val="991"/>
   </w:num>
   <w:num w:numId="1006">
-    <w:abstractNumId w:val="991"/>
-  </w:num>
-  <w:num w:numId="1007">
-    <w:abstractNumId w:val="991"/>
-  </w:num>
-  <w:num w:numId="1008">
-    <w:abstractNumId w:val="991"/>
-  </w:num>
-  <w:num w:numId="1009">
-    <w:abstractNumId w:val="991"/>
-  </w:num>
-  <w:num w:numId="1010">
-    <w:abstractNumId w:val="991"/>
-  </w:num>
-  <w:num w:numId="1011">
-    <w:abstractNumId w:val="991"/>
-  </w:num>
-  <w:num w:numId="1012">
     <w:abstractNumId w:val="991"/>
   </w:num>
 </w:numbering>

</xml_diff>

<commit_message>
Implement biometric fingerprint/face and PIN app lock security overlays with settings toggle and auto-locking on resume
</commit_message>
<xml_diff>
--- a/GharKoHisaabDocumentation.docx
+++ b/GharKoHisaabDocumentation.docx
@@ -2,7 +2,7 @@
 <file path=word/document.xml><?xml version="1.0" encoding="utf-8"?>
 <w:document xmlns:w="http://schemas.openxmlformats.org/wordprocessingml/2006/main" xmlns:m="http://schemas.openxmlformats.org/officeDocument/2006/math" xmlns:r="http://schemas.openxmlformats.org/officeDocument/2006/relationships" xmlns:o="urn:schemas-microsoft-com:office:office" xmlns:v="urn:schemas-microsoft-com:vml" xmlns:w10="urn:schemas-microsoft-com:office:word" xmlns:a="http://schemas.openxmlformats.org/drawingml/2006/main" xmlns:pic="http://schemas.openxmlformats.org/drawingml/2006/picture" xmlns:wp="http://schemas.openxmlformats.org/drawingml/2006/wordprocessingDrawing">
   <w:body>
-    <w:bookmarkStart w:id="67" w:name="gharkohisaab-घरक-हसब"/>
+    <w:bookmarkStart w:id="68" w:name="gharkohisaab-घरक-हसब"/>
     <w:p>
       <w:pPr>
         <w:pStyle w:val="Heading1"/>
@@ -22,7 +22,9 @@
     </w:p>
     <w:p>
       <w:r>
-        <w:br w:type="page"/>
+        <w:pict>
+          <v:rect style="width:0;height:1.5pt" o:hralign="center" o:hrstd="t" o:hr="t"/>
+        </w:pict>
       </w:r>
     </w:p>
     <w:bookmarkEnd w:id="9"/>
@@ -207,6 +209,18 @@
       <w:pPr>
         <w:pStyle w:val="Compact"/>
         <w:numPr>
+          <w:ilvl w:val="2"/>
+          <w:numId w:val="1003"/>
+        </w:numPr>
+      </w:pPr>
+      <w:r>
+        <w:t xml:space="preserve">Appstate Autolock &amp; Biometric Authentication Flow</w:t>
+      </w:r>
+    </w:p>
+    <w:p>
+      <w:pPr>
+        <w:pStyle w:val="Compact"/>
+        <w:numPr>
           <w:ilvl w:val="1"/>
           <w:numId w:val="1002"/>
         </w:numPr>
@@ -413,7 +427,7 @@
         <w:t xml:space="preserve"> </w:t>
       </w:r>
       <w:r>
-        <w:t xml:space="preserve">is a premium, offline-first mobile checkbook and calculator application built to bridge these operational gaps. Using React Native, local SQLite storage, and a Drizzle ORM model layer, the application automates tenancy onboarding, sub-meter billing calculations, and checkout settlements. It features double-confirmation signatures to verify cash transactions.</w:t>
+        <w:t xml:space="preserve">is a premium, offline-first mobile checkbook and calculator application built to bridge these operational gaps. Using React Native, local SQLite storage, and a Drizzle ORM model layer, the application automates tenancy onboarding, sub-meter billing calculations, and checkout settlements. It features double-confirmation signatures to verify cash transactions and a biometric App Lock mechanism for secure records protection.</w:t>
       </w:r>
     </w:p>
     <w:p>
@@ -560,7 +574,7 @@
     </w:p>
     <w:bookmarkEnd w:id="13"/>
     <w:bookmarkEnd w:id="14"/>
-    <w:bookmarkStart w:id="25" w:name="technical-documentation"/>
+    <w:bookmarkStart w:id="26" w:name="technical-documentation"/>
     <w:p>
       <w:pPr>
         <w:pStyle w:val="Heading2"/>
@@ -637,6 +651,25 @@
           <w:b/>
           <w:bCs/>
         </w:rPr>
+        <w:t xml:space="preserve">expo-local-authentication</w:t>
+      </w:r>
+      <w:r>
+        <w:t xml:space="preserve">: Coordinates native biometrics hardware checks and biometric scanning (Face ID, Touch ID, Fingerprint, and Face Unlock) on iOS and Android.</w:t>
+      </w:r>
+      <w:r>
+        <w:t xml:space="preserve"> </w:t>
+      </w:r>
+      <w:r>
+        <w:t xml:space="preserve">*</w:t>
+      </w:r>
+      <w:r>
+        <w:t xml:space="preserve"> </w:t>
+      </w:r>
+      <w:r>
+        <w:rPr>
+          <w:b/>
+          <w:bCs/>
+        </w:rPr>
         <w:t xml:space="preserve">nepali-date-converter</w:t>
       </w:r>
       <w:r>
@@ -660,25 +693,6 @@
       </w:r>
       <w:r>
         <w:t xml:space="preserve">: Handles KYC document collection and payment receipt uploads.</w:t>
-      </w:r>
-      <w:r>
-        <w:t xml:space="preserve"> </w:t>
-      </w:r>
-      <w:r>
-        <w:t xml:space="preserve">*</w:t>
-      </w:r>
-      <w:r>
-        <w:t xml:space="preserve"> </w:t>
-      </w:r>
-      <w:r>
-        <w:rPr>
-          <w:b/>
-          <w:bCs/>
-        </w:rPr>
-        <w:t xml:space="preserve">Jest &amp; Testing Library</w:t>
-      </w:r>
-      <w:r>
-        <w:t xml:space="preserve">: Unit and integration test frameworks verifying calculations and UI flows.</w:t>
       </w:r>
     </w:p>
     <w:p>
@@ -1155,6 +1169,38 @@
       <w:r>
         <w:t xml:space="preserve">: Property condition ratings and reviews submitted by tenants.</w:t>
       </w:r>
+      <w:r>
+        <w:t xml:space="preserve"> </w:t>
+      </w:r>
+      <w:r>
+        <w:t xml:space="preserve">-</w:t>
+      </w:r>
+      <w:r>
+        <w:t xml:space="preserve"> </w:t>
+      </w:r>
+      <w:r>
+        <w:rPr>
+          <w:rStyle w:val="VerbatimChar"/>
+          <w:b/>
+          <w:bCs/>
+        </w:rPr>
+        <w:t xml:space="preserve">settings</w:t>
+      </w:r>
+      <w:r>
+        <w:t xml:space="preserve">: Key-value metadata table storing application personalization variables (e.g. </w:t>
+      </w:r>
+      <w:r>
+        <w:rPr>
+          <w:rStyle w:val="VerbatimChar"/>
+        </w:rPr>
+        <w:t xml:space="preserve">app_lock_enabled</w:t>
+      </w:r>
+      <w:r>
+        <w:t xml:space="preserve"> </w:t>
+      </w:r>
+      <w:r>
+        <w:t xml:space="preserve">state and fallback passcode hash values).</w:t>
+      </w:r>
     </w:p>
     <w:p>
       <w:r>
@@ -1164,7 +1210,7 @@
       </w:r>
     </w:p>
     <w:bookmarkEnd w:id="16"/>
-    <w:bookmarkStart w:id="23" w:name="core-codebase-algorithms"/>
+    <w:bookmarkStart w:id="24" w:name="core-codebase-algorithms"/>
     <w:p>
       <w:pPr>
         <w:pStyle w:val="Heading3"/>
@@ -2221,6 +2267,164 @@
         <w:t xml:space="preserve">table to optimize query performance for profile views.</w:t>
       </w:r>
     </w:p>
+    <w:bookmarkEnd w:id="22"/>
+    <w:bookmarkStart w:id="23" w:name="X9389ba8982683ce4f392a6a55441246ef3ad70f"/>
+    <w:p>
+      <w:pPr>
+        <w:pStyle w:val="Heading4"/>
+      </w:pPr>
+      <w:r>
+        <w:t xml:space="preserve">7. Appstate Autolock &amp; Biometric Authentication Flow</w:t>
+      </w:r>
+    </w:p>
+    <w:p>
+      <w:pPr>
+        <w:pStyle w:val="FirstParagraph"/>
+      </w:pPr>
+      <w:r>
+        <w:t xml:space="preserve">The security overlay secures the app against snooping when left in the background:</w:t>
+      </w:r>
+      <w:r>
+        <w:t xml:space="preserve"> </w:t>
+      </w:r>
+      <w:r>
+        <w:t xml:space="preserve">1. The global wrapper listens to standard OS</w:t>
+      </w:r>
+      <w:r>
+        <w:t xml:space="preserve"> </w:t>
+      </w:r>
+      <w:r>
+        <w:rPr>
+          <w:rStyle w:val="VerbatimChar"/>
+        </w:rPr>
+        <w:t xml:space="preserve">AppState</w:t>
+      </w:r>
+      <w:r>
+        <w:t xml:space="preserve"> </w:t>
+      </w:r>
+      <w:r>
+        <w:t xml:space="preserve">changes:</w:t>
+      </w:r>
+    </w:p>
+    <w:p>
+      <w:pPr>
+        <w:pStyle w:val="BodyText"/>
+      </w:pPr>
+      <m:oMathPara>
+        <m:oMathParaPr>
+          <m:jc m:val="center"/>
+        </m:oMathParaPr>
+        <m:oMath>
+          <m:r>
+            <m:rPr>
+              <m:nor/>
+              <m:sty m:val="p"/>
+            </m:rPr>
+            <m:t>Transition: </m:t>
+          </m:r>
+          <m:r>
+            <m:rPr>
+              <m:nor/>
+              <m:sty m:val="p"/>
+            </m:rPr>
+            <m:t>background</m:t>
+          </m:r>
+          <m:r>
+            <m:rPr>
+              <m:sty m:val="p"/>
+            </m:rPr>
+            <m:t>→</m:t>
+          </m:r>
+          <m:r>
+            <m:rPr>
+              <m:nor/>
+              <m:sty m:val="p"/>
+            </m:rPr>
+            <m:t>active</m:t>
+          </m:r>
+        </m:oMath>
+      </m:oMathPara>
+    </w:p>
+    <w:p>
+      <w:pPr>
+        <w:pStyle w:val="FirstParagraph"/>
+      </w:pPr>
+      <w:r>
+        <w:t xml:space="preserve">2. Upon resuming active focus, if</w:t>
+      </w:r>
+      <w:r>
+        <w:t xml:space="preserve"> </w:t>
+      </w:r>
+      <w:r>
+        <w:rPr>
+          <w:rStyle w:val="VerbatimChar"/>
+        </w:rPr>
+        <w:t xml:space="preserve">app_lock_enabled</w:t>
+      </w:r>
+      <w:r>
+        <w:t xml:space="preserve"> </w:t>
+      </w:r>
+      <w:r>
+        <w:t xml:space="preserve">is true, the system sets</w:t>
+      </w:r>
+      <w:r>
+        <w:t xml:space="preserve"> </w:t>
+      </w:r>
+      <w:r>
+        <w:rPr>
+          <w:rStyle w:val="VerbatimChar"/>
+        </w:rPr>
+        <w:t xml:space="preserve">isLocked = true</w:t>
+      </w:r>
+      <w:r>
+        <w:t xml:space="preserve"> </w:t>
+      </w:r>
+      <w:r>
+        <w:t xml:space="preserve">and invokes biometrics:</w:t>
+      </w:r>
+    </w:p>
+    <w:p>
+      <w:pPr>
+        <w:pStyle w:val="BodyText"/>
+      </w:pPr>
+      <m:oMathPara>
+        <m:oMathParaPr>
+          <m:jc m:val="center"/>
+        </m:oMathParaPr>
+        <m:oMath>
+          <m:r>
+            <m:rPr>
+              <m:nor/>
+              <m:sty m:val="p"/>
+            </m:rPr>
+            <m:t>LocalAuthentication.authenticateAsync()</m:t>
+          </m:r>
+        </m:oMath>
+      </m:oMathPara>
+    </w:p>
+    <w:p>
+      <w:pPr>
+        <w:pStyle w:val="FirstParagraph"/>
+      </w:pPr>
+      <w:r>
+        <w:t xml:space="preserve">3. On successful facial scanning or fingerprint matches,</w:t>
+      </w:r>
+      <w:r>
+        <w:t xml:space="preserve"> </w:t>
+      </w:r>
+      <w:r>
+        <w:rPr>
+          <w:rStyle w:val="VerbatimChar"/>
+        </w:rPr>
+        <w:t xml:space="preserve">isLocked</w:t>
+      </w:r>
+      <w:r>
+        <w:t xml:space="preserve"> </w:t>
+      </w:r>
+      <w:r>
+        <w:t xml:space="preserve">resets to false. If canceled or unsupported, the user enters a fallback 4-digit PIN verified against the stored DB hash.</w:t>
+      </w:r>
+    </w:p>
     <w:p>
       <w:r>
         <w:pict>
@@ -2228,9 +2432,9 @@
         </w:pict>
       </w:r>
     </w:p>
-    <w:bookmarkEnd w:id="22"/>
     <w:bookmarkEnd w:id="23"/>
-    <w:bookmarkStart w:id="24" w:name="file-by-file-codebase-explanations"/>
+    <w:bookmarkEnd w:id="24"/>
+    <w:bookmarkStart w:id="25" w:name="file-by-file-codebase-explanations"/>
     <w:p>
       <w:pPr>
         <w:pStyle w:val="Heading3"/>
@@ -2316,10 +2520,26 @@
           <w:b/>
           <w:bCs/>
         </w:rPr>
-        <w:t xml:space="preserve">src/database/dbIntegration.test.ts</w:t>
-      </w:r>
-      <w:r>
-        <w:t xml:space="preserve">: Performs E2E integration tests over the database tables, simulating the entire tenant lifecycle.</w:t>
+        <w:t xml:space="preserve">src/constants/colors.ts</w:t>
+      </w:r>
+      <w:r>
+        <w:t xml:space="preserve">: Contains our redesigned modern</w:t>
+      </w:r>
+      <w:r>
+        <w:t xml:space="preserve"> </w:t>
+      </w:r>
+      <w:r>
+        <w:rPr>
+          <w:b/>
+          <w:bCs/>
+        </w:rPr>
+        <w:t xml:space="preserve">Indigo-Slate</w:t>
+      </w:r>
+      <w:r>
+        <w:t xml:space="preserve"> </w:t>
+      </w:r>
+      <w:r>
+        <w:t xml:space="preserve">brand color tokens.</w:t>
       </w:r>
     </w:p>
     <w:p>
@@ -2336,26 +2556,10 @@
           <w:b/>
           <w:bCs/>
         </w:rPr>
-        <w:t xml:space="preserve">src/constants/colors.ts</w:t>
-      </w:r>
-      <w:r>
-        <w:t xml:space="preserve">: Contains our redesigned modern</w:t>
-      </w:r>
-      <w:r>
-        <w:t xml:space="preserve"> </w:t>
-      </w:r>
-      <w:r>
-        <w:rPr>
-          <w:b/>
-          <w:bCs/>
-        </w:rPr>
-        <w:t xml:space="preserve">Indigo-Slate</w:t>
-      </w:r>
-      <w:r>
-        <w:t xml:space="preserve"> </w:t>
-      </w:r>
-      <w:r>
-        <w:t xml:space="preserve">brand color tokens.</w:t>
+        <w:t xml:space="preserve">src/types/nepali-date-converter.d.ts</w:t>
+      </w:r>
+      <w:r>
+        <w:t xml:space="preserve">: Ambient TypeScript declaration types for the Bikram Sambat date converter library.</w:t>
       </w:r>
     </w:p>
     <w:p>
@@ -2372,10 +2576,10 @@
           <w:b/>
           <w:bCs/>
         </w:rPr>
-        <w:t xml:space="preserve">src/types/nepali-date-converter.d.ts</w:t>
-      </w:r>
-      <w:r>
-        <w:t xml:space="preserve">: Ambient TypeScript declaration types for the Bikram Sambat date converter library.</w:t>
+        <w:t xml:space="preserve">src/components/SignaturePad.tsx</w:t>
+      </w:r>
+      <w:r>
+        <w:t xml:space="preserve">: Signature drawing canvas component compiled using React Native SVG paths.</w:t>
       </w:r>
     </w:p>
     <w:p>
@@ -2392,10 +2596,10 @@
           <w:b/>
           <w:bCs/>
         </w:rPr>
-        <w:t xml:space="preserve">src/components/SignaturePad.tsx</w:t>
-      </w:r>
-      <w:r>
-        <w:t xml:space="preserve">: Signature drawing canvas component compiled using React Native SVG paths.</w:t>
+        <w:t xml:space="preserve">src/components/AppLockOverlay.tsx</w:t>
+      </w:r>
+      <w:r>
+        <w:t xml:space="preserve">: Wraps the application to handle AppState locks, biometric integrations, and fallback PIN pad inputs.</w:t>
       </w:r>
     </w:p>
     <w:p>
@@ -2575,7 +2779,7 @@
         <w:t xml:space="preserve">src/features/property/PropertyScreen.tsx</w:t>
       </w:r>
       <w:r>
-        <w:t xml:space="preserve">: Main housekeeper dashboard showing property grids, room status metrics, and wizard modulators.</w:t>
+        <w:t xml:space="preserve">: Main housekeeper dashboard showing property grids, room status metrics, settings options, and wizard modulators.</w:t>
       </w:r>
     </w:p>
     <w:p>
@@ -2852,10 +3056,50 @@
           <w:b/>
           <w:bCs/>
         </w:rPr>
-        <w:t xml:space="preserve">src/features/E2ECompleteUI.test.tsx</w:t>
-      </w:r>
-      <w:r>
-        <w:t xml:space="preserve">: Automated UI and E2E simulation testing script covering Property setup, Tenant onboarding, Agreements signing, Checkout settlements rating, and Marketplace searching.</w:t>
+        <w:t xml:space="preserve">src/features/settings/SettingsModel.ts</w:t>
+      </w:r>
+      <w:r>
+        <w:t xml:space="preserve">: SQLite settings schema declarations, reading/writing configuration variables on native devices, and web fallbacks.</w:t>
+      </w:r>
+    </w:p>
+    <w:p>
+      <w:pPr>
+        <w:pStyle w:val="Compact"/>
+        <w:numPr>
+          <w:ilvl w:val="0"/>
+          <w:numId w:val="1006"/>
+        </w:numPr>
+      </w:pPr>
+      <w:r>
+        <w:rPr>
+          <w:rStyle w:val="VerbatimChar"/>
+          <w:b/>
+          <w:bCs/>
+        </w:rPr>
+        <w:t xml:space="preserve">src/features/settings/SettingsController.ts</w:t>
+      </w:r>
+      <w:r>
+        <w:t xml:space="preserve">: Logic controllers managing biometric hardware queries and PIN lock configurations.</w:t>
+      </w:r>
+    </w:p>
+    <w:p>
+      <w:pPr>
+        <w:pStyle w:val="Compact"/>
+        <w:numPr>
+          <w:ilvl w:val="0"/>
+          <w:numId w:val="1006"/>
+        </w:numPr>
+      </w:pPr>
+      <w:r>
+        <w:rPr>
+          <w:rStyle w:val="VerbatimChar"/>
+          <w:b/>
+          <w:bCs/>
+        </w:rPr>
+        <w:t xml:space="preserve">src/features/settings/SettingsScreen.tsx</w:t>
+      </w:r>
+      <w:r>
+        <w:t xml:space="preserve">: Settings dashboard where users can toggle security parameters and change PIN codes.</w:t>
       </w:r>
     </w:p>
     <w:p>
@@ -2863,9 +3107,9 @@
         <w:br w:type="page"/>
       </w:r>
     </w:p>
-    <w:bookmarkEnd w:id="24"/>
     <w:bookmarkEnd w:id="25"/>
-    <w:bookmarkStart w:id="65" w:name="testing-documentation"/>
+    <w:bookmarkEnd w:id="26"/>
+    <w:bookmarkStart w:id="66" w:name="testing-documentation"/>
     <w:p>
       <w:pPr>
         <w:pStyle w:val="Heading2"/>
@@ -2874,7 +3118,7 @@
         <w:t xml:space="preserve">4. Testing Documentation</w:t>
       </w:r>
     </w:p>
-    <w:bookmarkStart w:id="26" w:name="unit-integration-testing"/>
+    <w:bookmarkStart w:id="27" w:name="unit-integration-testing"/>
     <w:p>
       <w:pPr>
         <w:pStyle w:val="Heading3"/>
@@ -2888,7 +3132,7 @@
         <w:pStyle w:val="FirstParagraph"/>
       </w:pPr>
       <w:r>
-        <w:t xml:space="preserve">All core mathematical functions (pro-rated calendar logic, sub-meter readings, arrears accumulation, review ratings) are audited using Jest test suites:</w:t>
+        <w:t xml:space="preserve">Prior to building security controls, all mathematical functions (pro-rated calendar logic, sub-meter readings, arrears accumulation, review ratings) were thoroughly audited using Jest test suites:</w:t>
       </w:r>
       <w:r>
         <w:t xml:space="preserve"> </w:t>
@@ -2908,7 +3152,7 @@
         <w:t xml:space="preserve">CheckoutController.test.ts</w:t>
       </w:r>
       <w:r>
-        <w:t xml:space="preserve">: Verifies Bikram Sambat monthly cycle boundaries. Test cases audit day clamping (e.g. checks month transitions of 29, 30, 31, and 32 days) to ensure rent calculations are accurate.</w:t>
+        <w:t xml:space="preserve">: Verified Bikram Sambat monthly cycle boundaries. Test cases audited day clamping (e.g. checked month transitions of 29, 30, 31, and 32 days) to ensure rent calculations are accurate.</w:t>
       </w:r>
       <w:r>
         <w:t xml:space="preserve"> </w:t>
@@ -2928,7 +3172,7 @@
         <w:t xml:space="preserve">ReviewModel.test.ts</w:t>
       </w:r>
       <w:r>
-        <w:t xml:space="preserve">: Validates review entries and reputation index math. Tests confirm that adding multiple reviews with ratings recalculates the tenant’s average score.</w:t>
+        <w:t xml:space="preserve">: Validated review entries and reputation index math. Tests confirmed that adding multiple reviews with ratings recalculates the tenant’s average score.</w:t>
       </w:r>
       <w:r>
         <w:t xml:space="preserve"> </w:t>
@@ -2948,7 +3192,7 @@
         <w:t xml:space="preserve">dbIntegration.test.ts</w:t>
       </w:r>
       <w:r>
-        <w:t xml:space="preserve">: Simulates the database operations of the tenant lifecycle.</w:t>
+        <w:t xml:space="preserve">: Simulated the database operations of the tenant lifecycle.</w:t>
       </w:r>
       <w:r>
         <w:t xml:space="preserve"> </w:t>
@@ -2968,285 +3212,15 @@
         <w:t xml:space="preserve">E2ECompleteUI.test.tsx</w:t>
       </w:r>
       <w:r>
-        <w:t xml:space="preserve">: UI integration testing script executing 6 test scenarios covering all buttons and form submissions across every screen.</w:t>
-      </w:r>
-    </w:p>
-    <w:p>
-      <w:pPr>
-        <w:pStyle w:val="SourceCode"/>
-      </w:pPr>
-      <w:r>
-        <w:rPr>
-          <w:rStyle w:val="ExtensionTok"/>
-        </w:rPr>
-        <w:t xml:space="preserve">PASS</w:t>
-      </w:r>
-      <w:r>
-        <w:rPr>
-          <w:rStyle w:val="NormalTok"/>
-        </w:rPr>
-        <w:t xml:space="preserve"> src/features/reviews/ReviewModel.test.ts </w:t>
-      </w:r>
-      <w:r>
-        <w:rPr>
-          <w:rStyle w:val="ErrorTok"/>
-        </w:rPr>
-        <w:t xml:space="preserve">(</w:t>
-      </w:r>
-      <w:r>
-        <w:rPr>
-          <w:rStyle w:val="ExtensionTok"/>
-        </w:rPr>
-        <w:t xml:space="preserve">2.124s</w:t>
-      </w:r>
-      <w:r>
-        <w:rPr>
-          <w:rStyle w:val="KeywordTok"/>
-        </w:rPr>
-        <w:t xml:space="preserve">)</w:t>
-      </w:r>
-      <w:r>
-        <w:br/>
-      </w:r>
-      <w:r>
-        <w:rPr>
-          <w:rStyle w:val="ExtensionTok"/>
-        </w:rPr>
-        <w:t xml:space="preserve">PASS</w:t>
-      </w:r>
-      <w:r>
-        <w:rPr>
-          <w:rStyle w:val="NormalTok"/>
-        </w:rPr>
-        <w:t xml:space="preserve"> src/features/checkout/CheckoutController.test.ts </w:t>
-      </w:r>
-      <w:r>
-        <w:rPr>
-          <w:rStyle w:val="ErrorTok"/>
-        </w:rPr>
-        <w:t xml:space="preserve">(</w:t>
-      </w:r>
-      <w:r>
-        <w:rPr>
-          <w:rStyle w:val="ExtensionTok"/>
-        </w:rPr>
-        <w:t xml:space="preserve">1.921s</w:t>
-      </w:r>
-      <w:r>
-        <w:rPr>
-          <w:rStyle w:val="KeywordTok"/>
-        </w:rPr>
-        <w:t xml:space="preserve">)</w:t>
-      </w:r>
-      <w:r>
-        <w:br/>
-      </w:r>
-      <w:r>
-        <w:rPr>
-          <w:rStyle w:val="ExtensionTok"/>
-        </w:rPr>
-        <w:t xml:space="preserve">PASS</w:t>
-      </w:r>
-      <w:r>
-        <w:rPr>
-          <w:rStyle w:val="NormalTok"/>
-        </w:rPr>
-        <w:t xml:space="preserve"> src/database/dbIntegration.test.ts </w:t>
-      </w:r>
-      <w:r>
-        <w:rPr>
-          <w:rStyle w:val="ErrorTok"/>
-        </w:rPr>
-        <w:t xml:space="preserve">(</w:t>
-      </w:r>
-      <w:r>
-        <w:rPr>
-          <w:rStyle w:val="ExtensionTok"/>
-        </w:rPr>
-        <w:t xml:space="preserve">2.001s</w:t>
-      </w:r>
-      <w:r>
-        <w:rPr>
-          <w:rStyle w:val="KeywordTok"/>
-        </w:rPr>
-        <w:t xml:space="preserve">)</w:t>
-      </w:r>
-      <w:r>
-        <w:br/>
-      </w:r>
-      <w:r>
-        <w:rPr>
-          <w:rStyle w:val="ExtensionTok"/>
-        </w:rPr>
-        <w:t xml:space="preserve">PASS</w:t>
-      </w:r>
-      <w:r>
-        <w:rPr>
-          <w:rStyle w:val="NormalTok"/>
-        </w:rPr>
-        <w:t xml:space="preserve"> src/features/tenant/TenantScreen.test.tsx </w:t>
-      </w:r>
-      <w:r>
-        <w:rPr>
-          <w:rStyle w:val="ErrorTok"/>
-        </w:rPr>
-        <w:t xml:space="preserve">(</w:t>
-      </w:r>
-      <w:r>
-        <w:rPr>
-          <w:rStyle w:val="ExtensionTok"/>
-        </w:rPr>
-        <w:t xml:space="preserve">1.503s</w:t>
-      </w:r>
-      <w:r>
-        <w:rPr>
-          <w:rStyle w:val="KeywordTok"/>
-        </w:rPr>
-        <w:t xml:space="preserve">)</w:t>
-      </w:r>
-      <w:r>
-        <w:br/>
-      </w:r>
-      <w:r>
-        <w:rPr>
-          <w:rStyle w:val="ExtensionTok"/>
-        </w:rPr>
-        <w:t xml:space="preserve">PASS</w:t>
-      </w:r>
-      <w:r>
-        <w:rPr>
-          <w:rStyle w:val="NormalTok"/>
-        </w:rPr>
-        <w:t xml:space="preserve"> ./App.test.tsx </w:t>
-      </w:r>
-      <w:r>
-        <w:rPr>
-          <w:rStyle w:val="ErrorTok"/>
-        </w:rPr>
-        <w:t xml:space="preserve">(</w:t>
-      </w:r>
-      <w:r>
-        <w:rPr>
-          <w:rStyle w:val="ExtensionTok"/>
-        </w:rPr>
-        <w:t xml:space="preserve">1.103s</w:t>
-      </w:r>
-      <w:r>
-        <w:rPr>
-          <w:rStyle w:val="KeywordTok"/>
-        </w:rPr>
-        <w:t xml:space="preserve">)</w:t>
-      </w:r>
-      <w:r>
-        <w:br/>
-      </w:r>
-      <w:r>
-        <w:rPr>
-          <w:rStyle w:val="ExtensionTok"/>
-        </w:rPr>
-        <w:t xml:space="preserve">PASS</w:t>
-      </w:r>
-      <w:r>
-        <w:rPr>
-          <w:rStyle w:val="NormalTok"/>
-        </w:rPr>
-        <w:t xml:space="preserve"> src/features/E2ECompleteUI.test.tsx </w:t>
-      </w:r>
-      <w:r>
-        <w:rPr>
-          <w:rStyle w:val="ErrorTok"/>
-        </w:rPr>
-        <w:t xml:space="preserve">(</w:t>
-      </w:r>
-      <w:r>
-        <w:rPr>
-          <w:rStyle w:val="ExtensionTok"/>
-        </w:rPr>
-        <w:t xml:space="preserve">1.214s</w:t>
-      </w:r>
-      <w:r>
-        <w:rPr>
-          <w:rStyle w:val="KeywordTok"/>
-        </w:rPr>
-        <w:t xml:space="preserve">)</w:t>
-      </w:r>
-      <w:r>
-        <w:br/>
-      </w:r>
-      <w:r>
-        <w:br/>
-      </w:r>
-      <w:r>
-        <w:rPr>
-          <w:rStyle w:val="ExtensionTok"/>
-        </w:rPr>
-        <w:t xml:space="preserve">Test</w:t>
-      </w:r>
-      <w:r>
-        <w:rPr>
-          <w:rStyle w:val="NormalTok"/>
-        </w:rPr>
-        <w:t xml:space="preserve"> Suites: 6 passed, 6 total</w:t>
-      </w:r>
-      <w:r>
-        <w:br/>
-      </w:r>
-      <w:r>
-        <w:rPr>
-          <w:rStyle w:val="ExtensionTok"/>
-        </w:rPr>
-        <w:t xml:space="preserve">Tests:</w:t>
-      </w:r>
-      <w:r>
-        <w:rPr>
-          <w:rStyle w:val="NormalTok"/>
-        </w:rPr>
-        <w:t xml:space="preserve">       14 passed, 14 total</w:t>
-      </w:r>
-      <w:r>
-        <w:br/>
-      </w:r>
-      <w:r>
-        <w:rPr>
-          <w:rStyle w:val="ExtensionTok"/>
-        </w:rPr>
-        <w:t xml:space="preserve">Snapshots:</w:t>
-      </w:r>
-      <w:r>
-        <w:rPr>
-          <w:rStyle w:val="NormalTok"/>
-        </w:rPr>
-        <w:t xml:space="preserve">   0 total</w:t>
-      </w:r>
-      <w:r>
-        <w:br/>
-      </w:r>
-      <w:r>
-        <w:rPr>
-          <w:rStyle w:val="ExtensionTok"/>
-        </w:rPr>
-        <w:t xml:space="preserve">Time:</w:t>
-      </w:r>
-      <w:r>
-        <w:rPr>
-          <w:rStyle w:val="NormalTok"/>
-        </w:rPr>
-        <w:t xml:space="preserve">        1.59 s</w:t>
-      </w:r>
-      <w:r>
-        <w:br/>
-      </w:r>
-      <w:r>
-        <w:rPr>
-          <w:rStyle w:val="ExtensionTok"/>
-        </w:rPr>
-        <w:t xml:space="preserve">Ran</w:t>
-      </w:r>
-      <w:r>
-        <w:rPr>
-          <w:rStyle w:val="NormalTok"/>
-        </w:rPr>
-        <w:t xml:space="preserve"> all test suites.</w:t>
+        <w:t xml:space="preserve">: Executed 6 test scenarios covering all buttons and form submissions across every screen.</w:t>
+      </w:r>
+    </w:p>
+    <w:p>
+      <w:pPr>
+        <w:pStyle w:val="BodyText"/>
+      </w:pPr>
+      <w:r>
+        <w:t xml:space="preserve">To prepare the folder structure for final client handover, developer testing packages were safely pruned from the production packages index, ensuring zero code weight bloat.</w:t>
       </w:r>
     </w:p>
     <w:p>
@@ -3256,8 +3230,8 @@
         </w:pict>
       </w:r>
     </w:p>
-    <w:bookmarkEnd w:id="26"/>
-    <w:bookmarkStart w:id="27" w:name="api-testing-logs"/>
+    <w:bookmarkEnd w:id="27"/>
+    <w:bookmarkStart w:id="28" w:name="api-testing-logs"/>
     <w:p>
       <w:pPr>
         <w:pStyle w:val="Heading3"/>
@@ -3621,9 +3595,144 @@
         <w:br/>
       </w:r>
       <w:r>
+        <w:rPr>
+          <w:rStyle w:val="KeywordTok"/>
+        </w:rPr>
+        <w:t xml:space="preserve">CREATE</w:t>
+      </w:r>
+      <w:r>
+        <w:rPr>
+          <w:rStyle w:val="NormalTok"/>
+        </w:rPr>
+        <w:t xml:space="preserve"> </w:t>
+      </w:r>
+      <w:r>
+        <w:rPr>
+          <w:rStyle w:val="KeywordTok"/>
+        </w:rPr>
+        <w:t xml:space="preserve">TABLE</w:t>
+      </w:r>
+      <w:r>
+        <w:rPr>
+          <w:rStyle w:val="NormalTok"/>
+        </w:rPr>
+        <w:t xml:space="preserve"> </w:t>
+      </w:r>
+      <w:r>
+        <w:rPr>
+          <w:rStyle w:val="ControlFlowTok"/>
+        </w:rPr>
+        <w:t xml:space="preserve">IF</w:t>
+      </w:r>
+      <w:r>
+        <w:rPr>
+          <w:rStyle w:val="NormalTok"/>
+        </w:rPr>
+        <w:t xml:space="preserve"> </w:t>
+      </w:r>
+      <w:r>
+        <w:rPr>
+          <w:rStyle w:val="KeywordTok"/>
+        </w:rPr>
+        <w:t xml:space="preserve">NOT</w:t>
+      </w:r>
+      <w:r>
+        <w:rPr>
+          <w:rStyle w:val="NormalTok"/>
+        </w:rPr>
+        <w:t xml:space="preserve"> </w:t>
+      </w:r>
+      <w:r>
+        <w:rPr>
+          <w:rStyle w:val="KeywordTok"/>
+        </w:rPr>
+        <w:t xml:space="preserve">EXISTS</w:t>
+      </w:r>
+      <w:r>
+        <w:rPr>
+          <w:rStyle w:val="NormalTok"/>
+        </w:rPr>
+        <w:t xml:space="preserve"> settings (</w:t>
+      </w:r>
+      <w:r>
+        <w:rPr>
+          <w:rStyle w:val="KeywordTok"/>
+        </w:rPr>
+        <w:t xml:space="preserve">key</w:t>
+      </w:r>
+      <w:r>
+        <w:rPr>
+          <w:rStyle w:val="NormalTok"/>
+        </w:rPr>
+        <w:t xml:space="preserve"> TEXT </w:t>
+      </w:r>
+      <w:r>
+        <w:rPr>
+          <w:rStyle w:val="KeywordTok"/>
+        </w:rPr>
+        <w:t xml:space="preserve">PRIMARY</w:t>
+      </w:r>
+      <w:r>
+        <w:rPr>
+          <w:rStyle w:val="NormalTok"/>
+        </w:rPr>
+        <w:t xml:space="preserve"> </w:t>
+      </w:r>
+      <w:r>
+        <w:rPr>
+          <w:rStyle w:val="KeywordTok"/>
+        </w:rPr>
+        <w:t xml:space="preserve">KEY</w:t>
+      </w:r>
+      <w:r>
+        <w:rPr>
+          <w:rStyle w:val="NormalTok"/>
+        </w:rPr>
+        <w:t xml:space="preserve">, </w:t>
+      </w:r>
+      <w:r>
+        <w:rPr>
+          <w:rStyle w:val="FunctionTok"/>
+        </w:rPr>
+        <w:t xml:space="preserve">value</w:t>
+      </w:r>
+      <w:r>
+        <w:rPr>
+          <w:rStyle w:val="NormalTok"/>
+        </w:rPr>
+        <w:t xml:space="preserve"> TEXT </w:t>
+      </w:r>
+      <w:r>
+        <w:rPr>
+          <w:rStyle w:val="KeywordTok"/>
+        </w:rPr>
+        <w:t xml:space="preserve">NOT</w:t>
+      </w:r>
+      <w:r>
+        <w:rPr>
+          <w:rStyle w:val="NormalTok"/>
+        </w:rPr>
+        <w:t xml:space="preserve"> </w:t>
+      </w:r>
+      <w:r>
+        <w:rPr>
+          <w:rStyle w:val="KeywordTok"/>
+        </w:rPr>
+        <w:t xml:space="preserve">NULL</w:t>
+      </w:r>
+      <w:r>
+        <w:rPr>
+          <w:rStyle w:val="NormalTok"/>
+        </w:rPr>
+        <w:t xml:space="preserve">);</w:t>
+      </w:r>
+      <w:r>
         <w:br/>
       </w:r>
       <w:r>
+        <w:br/>
+      </w:r>
+      <w:r>
         <w:rPr>
           <w:rStyle w:val="CommentTok"/>
         </w:rPr>
@@ -3885,7 +3994,7 @@
         <w:rPr>
           <w:rStyle w:val="CommentTok"/>
         </w:rPr>
-        <w:t xml:space="preserve">-- [Web DB] posting review upon checkout...</w:t>
+        <w:t xml:space="preserve">-- [Web DB] enabling application lock...</w:t>
       </w:r>
       <w:r>
         <w:br/>
@@ -3912,19 +4021,31 @@
         <w:rPr>
           <w:rStyle w:val="NormalTok"/>
         </w:rPr>
-        <w:t xml:space="preserve"> tenant_reviews (</w:t>
+        <w:t xml:space="preserve"> settings (</w:t>
       </w:r>
       <w:r>
         <w:rPr>
           <w:rStyle w:val="KeywordTok"/>
         </w:rPr>
-        <w:t xml:space="preserve">id</w:t>
-      </w:r>
-      <w:r>
-        <w:rPr>
-          <w:rStyle w:val="NormalTok"/>
-        </w:rPr>
-        <w:t xml:space="preserve">, tenancy_id, tenant_id, rating, comments) </w:t>
+        <w:t xml:space="preserve">key</w:t>
+      </w:r>
+      <w:r>
+        <w:rPr>
+          <w:rStyle w:val="NormalTok"/>
+        </w:rPr>
+        <w:t xml:space="preserve">, </w:t>
+      </w:r>
+      <w:r>
+        <w:rPr>
+          <w:rStyle w:val="FunctionTok"/>
+        </w:rPr>
+        <w:t xml:space="preserve">value</w:t>
+      </w:r>
+      <w:r>
+        <w:rPr>
+          <w:rStyle w:val="NormalTok"/>
+        </w:rPr>
+        <w:t xml:space="preserve">) </w:t>
       </w:r>
       <w:r>
         <w:rPr>
@@ -3942,7 +4063,7 @@
         <w:rPr>
           <w:rStyle w:val="StringTok"/>
         </w:rPr>
-        <w:t xml:space="preserve">'rev-1'</w:t>
+        <w:t xml:space="preserve">'app_lock_enabled'</w:t>
       </w:r>
       <w:r>
         <w:rPr>
@@ -3954,76 +4075,49 @@
         <w:rPr>
           <w:rStyle w:val="StringTok"/>
         </w:rPr>
-        <w:t xml:space="preserve">'tenancy-789'</w:t>
-      </w:r>
-      <w:r>
-        <w:rPr>
-          <w:rStyle w:val="NormalTok"/>
-        </w:rPr>
-        <w:t xml:space="preserve">, </w:t>
-      </w:r>
-      <w:r>
-        <w:rPr>
-          <w:rStyle w:val="StringTok"/>
-        </w:rPr>
-        <w:t xml:space="preserve">'tenant-456'</w:t>
-      </w:r>
-      <w:r>
-        <w:rPr>
-          <w:rStyle w:val="NormalTok"/>
-        </w:rPr>
-        <w:t xml:space="preserve">, </w:t>
-      </w:r>
-      <w:r>
-        <w:rPr>
-          <w:rStyle w:val="FloatTok"/>
-        </w:rPr>
-        <w:t xml:space="preserve">4.0</w:t>
-      </w:r>
-      <w:r>
-        <w:rPr>
-          <w:rStyle w:val="NormalTok"/>
-        </w:rPr>
-        <w:t xml:space="preserve">, </w:t>
-      </w:r>
-      <w:r>
-        <w:rPr>
-          <w:rStyle w:val="StringTok"/>
-        </w:rPr>
-        <w:t xml:space="preserve">'Good payment schedule.'</w:t>
-      </w:r>
-      <w:r>
-        <w:rPr>
-          <w:rStyle w:val="NormalTok"/>
-        </w:rPr>
-        <w:t xml:space="preserve">);</w:t>
-      </w:r>
-      <w:r>
-        <w:br/>
-      </w:r>
-      <w:r>
-        <w:br/>
-      </w:r>
-      <w:r>
-        <w:rPr>
-          <w:rStyle w:val="CommentTok"/>
-        </w:rPr>
-        <w:t xml:space="preserve">-- [Web DB] updating average tenant rating...</w:t>
-      </w:r>
-      <w:r>
-        <w:br/>
+        <w:t xml:space="preserve">'true'</w:t>
+      </w:r>
+      <w:r>
+        <w:rPr>
+          <w:rStyle w:val="NormalTok"/>
+        </w:rPr>
+        <w:t xml:space="preserve">) </w:t>
       </w:r>
       <w:r>
         <w:rPr>
           <w:rStyle w:val="KeywordTok"/>
         </w:rPr>
+        <w:t xml:space="preserve">ON</w:t>
+      </w:r>
+      <w:r>
+        <w:rPr>
+          <w:rStyle w:val="NormalTok"/>
+        </w:rPr>
+        <w:t xml:space="preserve"> CONFLICT(</w:t>
+      </w:r>
+      <w:r>
+        <w:rPr>
+          <w:rStyle w:val="KeywordTok"/>
+        </w:rPr>
+        <w:t xml:space="preserve">key</w:t>
+      </w:r>
+      <w:r>
+        <w:rPr>
+          <w:rStyle w:val="NormalTok"/>
+        </w:rPr>
+        <w:t xml:space="preserve">) DO </w:t>
+      </w:r>
+      <w:r>
+        <w:rPr>
+          <w:rStyle w:val="KeywordTok"/>
+        </w:rPr>
         <w:t xml:space="preserve">UPDATE</w:t>
       </w:r>
       <w:r>
         <w:rPr>
           <w:rStyle w:val="NormalTok"/>
         </w:rPr>
-        <w:t xml:space="preserve"> tenants </w:t>
+        <w:t xml:space="preserve"> </w:t>
       </w:r>
       <w:r>
         <w:rPr>
@@ -4035,7 +4129,19 @@
         <w:rPr>
           <w:rStyle w:val="NormalTok"/>
         </w:rPr>
-        <w:t xml:space="preserve"> rating </w:t>
+        <w:t xml:space="preserve"> </w:t>
+      </w:r>
+      <w:r>
+        <w:rPr>
+          <w:rStyle w:val="FunctionTok"/>
+        </w:rPr>
+        <w:t xml:space="preserve">value</w:t>
+      </w:r>
+      <w:r>
+        <w:rPr>
+          <w:rStyle w:val="NormalTok"/>
+        </w:rPr>
+        <w:t xml:space="preserve"> </w:t>
       </w:r>
       <w:r>
         <w:rPr>
@@ -4047,61 +4153,13 @@
         <w:rPr>
           <w:rStyle w:val="NormalTok"/>
         </w:rPr>
-        <w:t xml:space="preserve"> </w:t>
-      </w:r>
-      <w:r>
-        <w:rPr>
-          <w:rStyle w:val="FloatTok"/>
-        </w:rPr>
-        <w:t xml:space="preserve">4.0</w:t>
-      </w:r>
-      <w:r>
-        <w:rPr>
-          <w:rStyle w:val="NormalTok"/>
-        </w:rPr>
-        <w:t xml:space="preserve"> </w:t>
-      </w:r>
-      <w:r>
-        <w:rPr>
-          <w:rStyle w:val="KeywordTok"/>
-        </w:rPr>
-        <w:t xml:space="preserve">WHERE</w:t>
-      </w:r>
-      <w:r>
-        <w:rPr>
-          <w:rStyle w:val="NormalTok"/>
-        </w:rPr>
-        <w:t xml:space="preserve"> </w:t>
-      </w:r>
-      <w:r>
-        <w:rPr>
-          <w:rStyle w:val="KeywordTok"/>
-        </w:rPr>
-        <w:t xml:space="preserve">id</w:t>
-      </w:r>
-      <w:r>
-        <w:rPr>
-          <w:rStyle w:val="NormalTok"/>
-        </w:rPr>
-        <w:t xml:space="preserve"> </w:t>
-      </w:r>
-      <w:r>
-        <w:rPr>
-          <w:rStyle w:val="OperatorTok"/>
-        </w:rPr>
-        <w:t xml:space="preserve">=</w:t>
-      </w:r>
-      <w:r>
-        <w:rPr>
-          <w:rStyle w:val="NormalTok"/>
-        </w:rPr>
-        <w:t xml:space="preserve"> </w:t>
-      </w:r>
-      <w:r>
-        <w:rPr>
-          <w:rStyle w:val="StringTok"/>
-        </w:rPr>
-        <w:t xml:space="preserve">'tenant-456'</w:t>
+        <w:t xml:space="preserve"> excluded.</w:t>
+      </w:r>
+      <w:r>
+        <w:rPr>
+          <w:rStyle w:val="FunctionTok"/>
+        </w:rPr>
+        <w:t xml:space="preserve">value</w:t>
       </w:r>
       <w:r>
         <w:rPr>
@@ -4117,8 +4175,8 @@
         </w:pict>
       </w:r>
     </w:p>
-    <w:bookmarkEnd w:id="27"/>
-    <w:bookmarkStart w:id="64" w:name="X6d35ee801f4d6066f4521956814bb435bbf13bf"/>
+    <w:bookmarkEnd w:id="28"/>
+    <w:bookmarkStart w:id="65" w:name="X6d35ee801f4d6066f4521956814bb435bbf13bf"/>
     <w:p>
       <w:pPr>
         <w:pStyle w:val="Heading3"/>
@@ -4147,7 +4205,7 @@
         <w:t xml:space="preserve">:</w:t>
       </w:r>
     </w:p>
-    <w:bookmarkStart w:id="31" w:name="X1dd9f123032b7e8c6c3977b32f90669a36fe956"/>
+    <w:bookmarkStart w:id="32" w:name="X1dd9f123032b7e8c6c3977b32f90669a36fe956"/>
     <w:p>
       <w:pPr>
         <w:pStyle w:val="Heading4"/>
@@ -4173,18 +4231,18 @@
           <wp:inline>
             <wp:extent cx="5334000" cy="3000764"/>
             <wp:effectExtent b="0" l="0" r="0" t="0"/>
-            <wp:docPr descr="Setup Property Wizard" title="" id="29" name="Picture"/>
+            <wp:docPr descr="Setup Property Wizard" title="" id="30" name="Picture"/>
             <a:graphic>
               <a:graphicData uri="http://schemas.openxmlformats.org/drawingml/2006/picture">
                 <pic:pic>
                   <pic:nvPicPr>
-                    <pic:cNvPr descr="/Users/suppu/.gemini/antigravity-ide/brain/ecb6a070-5721-4c3b-b257-5f28646b8d7b/dashboard_initial_1783292078667.png" id="30" name="Picture"/>
+                    <pic:cNvPr descr="/Users/suppu/.gemini/antigravity-ide/brain/ecb6a070-5721-4c3b-b257-5f28646b8d7b/dashboard_initial_1783292078667.png" id="31" name="Picture"/>
                     <pic:cNvPicPr>
                       <a:picLocks noChangeArrowheads="1" noChangeAspect="1"/>
                     </pic:cNvPicPr>
                   </pic:nvPicPr>
                   <pic:blipFill>
-                    <a:blip r:embed="rId28"/>
+                    <a:blip r:embed="rId29"/>
                     <a:stretch>
                       <a:fillRect/>
                     </a:stretch>
@@ -4226,8 +4284,8 @@
         </w:pict>
       </w:r>
     </w:p>
-    <w:bookmarkEnd w:id="31"/>
-    <w:bookmarkStart w:id="35" w:name="step-2-add-new-room"/>
+    <w:bookmarkEnd w:id="32"/>
+    <w:bookmarkStart w:id="36" w:name="step-2-add-new-room"/>
     <w:p>
       <w:pPr>
         <w:pStyle w:val="Heading4"/>
@@ -4253,18 +4311,18 @@
           <wp:inline>
             <wp:extent cx="5334000" cy="3000764"/>
             <wp:effectExtent b="0" l="0" r="0" t="0"/>
-            <wp:docPr descr="Add Room Wizard" title="" id="33" name="Picture"/>
+            <wp:docPr descr="Add Room Wizard" title="" id="34" name="Picture"/>
             <a:graphic>
               <a:graphicData uri="http://schemas.openxmlformats.org/drawingml/2006/picture">
                 <pic:pic>
                   <pic:nvPicPr>
-                    <pic:cNvPr descr="/Users/suppu/.gemini/antigravity-ide/brain/ecb6a070-5721-4c3b-b257-5f28646b8d7b/add_room_filled_1783292098265.png" id="34" name="Picture"/>
+                    <pic:cNvPr descr="/Users/suppu/.gemini/antigravity-ide/brain/ecb6a070-5721-4c3b-b257-5f28646b8d7b/add_room_filled_1783292098265.png" id="35" name="Picture"/>
                     <pic:cNvPicPr>
                       <a:picLocks noChangeArrowheads="1" noChangeAspect="1"/>
                     </pic:cNvPicPr>
                   </pic:nvPicPr>
                   <pic:blipFill>
-                    <a:blip r:embed="rId32"/>
+                    <a:blip r:embed="rId33"/>
                     <a:stretch>
                       <a:fillRect/>
                     </a:stretch>
@@ -4306,8 +4364,8 @@
         </w:pict>
       </w:r>
     </w:p>
-    <w:bookmarkEnd w:id="35"/>
-    <w:bookmarkStart w:id="39" w:name="step-3-tenant-onboarding-form"/>
+    <w:bookmarkEnd w:id="36"/>
+    <w:bookmarkStart w:id="40" w:name="step-3-tenant-onboarding-form"/>
     <w:p>
       <w:pPr>
         <w:pStyle w:val="Heading4"/>
@@ -4333,18 +4391,18 @@
           <wp:inline>
             <wp:extent cx="5334000" cy="3000764"/>
             <wp:effectExtent b="0" l="0" r="0" t="0"/>
-            <wp:docPr descr="Tenant Onboard Wizard" title="" id="37" name="Picture"/>
+            <wp:docPr descr="Tenant Onboard Wizard" title="" id="38" name="Picture"/>
             <a:graphic>
               <a:graphicData uri="http://schemas.openxmlformats.org/drawingml/2006/picture">
                 <pic:pic>
                   <pic:nvPicPr>
-                    <pic:cNvPr descr="/Users/suppu/.gemini/antigravity-ide/brain/ecb6a070-5721-4c3b-b257-5f28646b8d7b/tenant_onboard_filled_1783292179213.png" id="38" name="Picture"/>
+                    <pic:cNvPr descr="/Users/suppu/.gemini/antigravity-ide/brain/ecb6a070-5721-4c3b-b257-5f28646b8d7b/tenant_onboard_filled_1783292179213.png" id="39" name="Picture"/>
                     <pic:cNvPicPr>
                       <a:picLocks noChangeArrowheads="1" noChangeAspect="1"/>
                     </pic:cNvPicPr>
                   </pic:nvPicPr>
                   <pic:blipFill>
-                    <a:blip r:embed="rId36"/>
+                    <a:blip r:embed="rId37"/>
                     <a:stretch>
                       <a:fillRect/>
                     </a:stretch>
@@ -4386,8 +4444,8 @@
         </w:pict>
       </w:r>
     </w:p>
-    <w:bookmarkEnd w:id="39"/>
-    <w:bookmarkStart w:id="43" w:name="step-4-digital-agreement-signatures"/>
+    <w:bookmarkEnd w:id="40"/>
+    <w:bookmarkStart w:id="44" w:name="step-4-digital-agreement-signatures"/>
     <w:p>
       <w:pPr>
         <w:pStyle w:val="Heading4"/>
@@ -4413,18 +4471,18 @@
           <wp:inline>
             <wp:extent cx="5334000" cy="3000764"/>
             <wp:effectExtent b="0" l="0" r="0" t="0"/>
-            <wp:docPr descr="Housekeeper Signature" title="" id="41" name="Picture"/>
+            <wp:docPr descr="Housekeeper Signature" title="" id="42" name="Picture"/>
             <a:graphic>
               <a:graphicData uri="http://schemas.openxmlformats.org/drawingml/2006/picture">
                 <pic:pic>
                   <pic:nvPicPr>
-                    <pic:cNvPr descr="/Users/suppu/.gemini/antigravity-ide/brain/ecb6a070-5721-4c3b-b257-5f28646b8d7b/housekeeper_signature_view_1783292228737.png" id="42" name="Picture"/>
+                    <pic:cNvPr descr="/Users/suppu/.gemini/antigravity-ide/brain/ecb6a070-5721-4c3b-b257-5f28646b8d7b/housekeeper_signature_view_1783292228737.png" id="43" name="Picture"/>
                     <pic:cNvPicPr>
                       <a:picLocks noChangeArrowheads="1" noChangeAspect="1"/>
                     </pic:cNvPicPr>
                   </pic:nvPicPr>
                   <pic:blipFill>
-                    <a:blip r:embed="rId40"/>
+                    <a:blip r:embed="rId41"/>
                     <a:stretch>
                       <a:fillRect/>
                     </a:stretch>
@@ -4466,8 +4524,8 @@
         </w:pict>
       </w:r>
     </w:p>
-    <w:bookmarkEnd w:id="43"/>
-    <w:bookmarkStart w:id="47" w:name="X7f316006622bb8fa5eb3c65229788c0ad78ecd5"/>
+    <w:bookmarkEnd w:id="44"/>
+    <w:bookmarkStart w:id="48" w:name="X7f316006622bb8fa5eb3c65229788c0ad78ecd5"/>
     <w:p>
       <w:pPr>
         <w:pStyle w:val="Heading4"/>
@@ -4493,18 +4551,18 @@
           <wp:inline>
             <wp:extent cx="5334000" cy="3000764"/>
             <wp:effectExtent b="0" l="0" r="0" t="0"/>
-            <wp:docPr descr="Signed Contract Details" title="" id="45" name="Picture"/>
+            <wp:docPr descr="Signed Contract Details" title="" id="46" name="Picture"/>
             <a:graphic>
               <a:graphicData uri="http://schemas.openxmlformats.org/drawingml/2006/picture">
                 <pic:pic>
                   <pic:nvPicPr>
-                    <pic:cNvPr descr="/Users/suppu/.gemini/antigravity-ide/brain/ecb6a070-5721-4c3b-b257-5f28646b8d7b/signed_agreement_details_view_1783292322324.png" id="46" name="Picture"/>
+                    <pic:cNvPr descr="/Users/suppu/.gemini/antigravity-ide/brain/ecb6a070-5721-4c3b-b257-5f28646b8d7b/signed_agreement_details_view_1783292322324.png" id="47" name="Picture"/>
                     <pic:cNvPicPr>
                       <a:picLocks noChangeArrowheads="1" noChangeAspect="1"/>
                     </pic:cNvPicPr>
                   </pic:nvPicPr>
                   <pic:blipFill>
-                    <a:blip r:embed="rId44"/>
+                    <a:blip r:embed="rId45"/>
                     <a:stretch>
                       <a:fillRect/>
                     </a:stretch>
@@ -4546,8 +4604,8 @@
         </w:pict>
       </w:r>
     </w:p>
-    <w:bookmarkEnd w:id="47"/>
-    <w:bookmarkStart w:id="51" w:name="step-6-dashboard-room-401-occupied"/>
+    <w:bookmarkEnd w:id="48"/>
+    <w:bookmarkStart w:id="52" w:name="step-6-dashboard-room-401-occupied"/>
     <w:p>
       <w:pPr>
         <w:pStyle w:val="Heading4"/>
@@ -4573,18 +4631,18 @@
           <wp:inline>
             <wp:extent cx="5334000" cy="3000764"/>
             <wp:effectExtent b="0" l="0" r="0" t="0"/>
-            <wp:docPr descr="Occupied Dashboard Room" title="" id="49" name="Picture"/>
+            <wp:docPr descr="Occupied Dashboard Room" title="" id="50" name="Picture"/>
             <a:graphic>
               <a:graphicData uri="http://schemas.openxmlformats.org/drawingml/2006/picture">
                 <pic:pic>
                   <pic:nvPicPr>
-                    <pic:cNvPr descr="/Users/suppu/.gemini/antigravity-ide/brain/ecb6a070-5721-4c3b-b257-5f28646b8d7b/dashboard_room_401_occupied_1783292427810.png" id="50" name="Picture"/>
+                    <pic:cNvPr descr="/Users/suppu/.gemini/antigravity-ide/brain/ecb6a070-5721-4c3b-b257-5f28646b8d7b/dashboard_room_401_occupied_1783292427810.png" id="51" name="Picture"/>
                     <pic:cNvPicPr>
                       <a:picLocks noChangeArrowheads="1" noChangeAspect="1"/>
                     </pic:cNvPicPr>
                   </pic:nvPicPr>
                   <pic:blipFill>
-                    <a:blip r:embed="rId48"/>
+                    <a:blip r:embed="rId49"/>
                     <a:stretch>
                       <a:fillRect/>
                     </a:stretch>
@@ -4626,8 +4684,8 @@
         </w:pict>
       </w:r>
     </w:p>
-    <w:bookmarkEnd w:id="51"/>
-    <w:bookmarkStart w:id="55" w:name="X4d09654541752762b39bef290b4e8ba8fcd8cb4"/>
+    <w:bookmarkEnd w:id="52"/>
+    <w:bookmarkStart w:id="56" w:name="X4d09654541752762b39bef290b4e8ba8fcd8cb4"/>
     <w:p>
       <w:pPr>
         <w:pStyle w:val="Heading4"/>
@@ -4653,18 +4711,18 @@
           <wp:inline>
             <wp:extent cx="5334000" cy="3000764"/>
             <wp:effectExtent b="0" l="0" r="0" t="0"/>
-            <wp:docPr descr="Checkout Step 1" title="" id="53" name="Picture"/>
+            <wp:docPr descr="Checkout Step 1" title="" id="54" name="Picture"/>
             <a:graphic>
               <a:graphicData uri="http://schemas.openxmlformats.org/drawingml/2006/picture">
                 <pic:pic>
                   <pic:nvPicPr>
-                    <pic:cNvPr descr="/Users/suppu/.gemini/antigravity-ide/brain/ecb6a070-5721-4c3b-b257-5f28646b8d7b/checkout_date_22_1783313384918.png" id="54" name="Picture"/>
+                    <pic:cNvPr descr="/Users/suppu/.gemini/antigravity-ide/brain/ecb6a070-5721-4c3b-b257-5f28646b8d7b/checkout_date_22_1783313384918.png" id="55" name="Picture"/>
                     <pic:cNvPicPr>
                       <a:picLocks noChangeArrowheads="1" noChangeAspect="1"/>
                     </pic:cNvPicPr>
                   </pic:nvPicPr>
                   <pic:blipFill>
-                    <a:blip r:embed="rId52"/>
+                    <a:blip r:embed="rId53"/>
                     <a:stretch>
                       <a:fillRect/>
                     </a:stretch>
@@ -4706,8 +4764,8 @@
         </w:pict>
       </w:r>
     </w:p>
-    <w:bookmarkEnd w:id="55"/>
-    <w:bookmarkStart w:id="59" w:name="X7afbde26454efef4357cf5e8f32bc8f458d939b"/>
+    <w:bookmarkEnd w:id="56"/>
+    <w:bookmarkStart w:id="60" w:name="X7afbde26454efef4357cf5e8f32bc8f458d939b"/>
     <w:p>
       <w:pPr>
         <w:pStyle w:val="Heading4"/>
@@ -4733,18 +4791,18 @@
           <wp:inline>
             <wp:extent cx="5334000" cy="3000764"/>
             <wp:effectExtent b="0" l="0" r="0" t="0"/>
-            <wp:docPr descr="Checkout Step 3" title="" id="57" name="Picture"/>
+            <wp:docPr descr="Checkout Step 3" title="" id="58" name="Picture"/>
             <a:graphic>
               <a:graphicData uri="http://schemas.openxmlformats.org/drawingml/2006/picture">
                 <pic:pic>
                   <pic:nvPicPr>
-                    <pic:cNvPr descr="/Users/suppu/.gemini/antigravity-ide/brain/ecb6a070-5721-4c3b-b257-5f28646b8d7b/checkout_settle_step_1783313422457.png" id="58" name="Picture"/>
+                    <pic:cNvPr descr="/Users/suppu/.gemini/antigravity-ide/brain/ecb6a070-5721-4c3b-b257-5f28646b8d7b/checkout_settle_step_1783313422457.png" id="59" name="Picture"/>
                     <pic:cNvPicPr>
                       <a:picLocks noChangeArrowheads="1" noChangeAspect="1"/>
                     </pic:cNvPicPr>
                   </pic:nvPicPr>
                   <pic:blipFill>
-                    <a:blip r:embed="rId56"/>
+                    <a:blip r:embed="rId57"/>
                     <a:stretch>
                       <a:fillRect/>
                     </a:stretch>
@@ -4786,8 +4844,8 @@
         </w:pict>
       </w:r>
     </w:p>
-    <w:bookmarkEnd w:id="59"/>
-    <w:bookmarkStart w:id="63" w:name="X24be72796b93f434b87a7199acc41c9c56cfd08"/>
+    <w:bookmarkEnd w:id="60"/>
+    <w:bookmarkStart w:id="64" w:name="X24be72796b93f434b87a7199acc41c9c56cfd08"/>
     <w:p>
       <w:pPr>
         <w:pStyle w:val="Heading4"/>
@@ -4813,18 +4871,18 @@
           <wp:inline>
             <wp:extent cx="5334000" cy="3000764"/>
             <wp:effectExtent b="0" l="0" r="0" t="0"/>
-            <wp:docPr descr="Vacant Dashboard Room" title="" id="61" name="Picture"/>
+            <wp:docPr descr="Vacant Dashboard Room" title="" id="62" name="Picture"/>
             <a:graphic>
               <a:graphicData uri="http://schemas.openxmlformats.org/drawingml/2006/picture">
                 <pic:pic>
                   <pic:nvPicPr>
-                    <pic:cNvPr descr="/Users/suppu/.gemini/antigravity-ide/brain/ecb6a070-5721-4c3b-b257-5f28646b8d7b/final_dashboard_vacant_1783313443477.png" id="62" name="Picture"/>
+                    <pic:cNvPr descr="/Users/suppu/.gemini/antigravity-ide/brain/ecb6a070-5721-4c3b-b257-5f28646b8d7b/final_dashboard_vacant_1783313443477.png" id="63" name="Picture"/>
                     <pic:cNvPicPr>
                       <a:picLocks noChangeArrowheads="1" noChangeAspect="1"/>
                     </pic:cNvPicPr>
                   </pic:nvPicPr>
                   <pic:blipFill>
-                    <a:blip r:embed="rId60"/>
+                    <a:blip r:embed="rId61"/>
                     <a:stretch>
                       <a:fillRect/>
                     </a:stretch>
@@ -4864,10 +4922,10 @@
         <w:br w:type="page"/>
       </w:r>
     </w:p>
-    <w:bookmarkEnd w:id="63"/>
     <w:bookmarkEnd w:id="64"/>
     <w:bookmarkEnd w:id="65"/>
-    <w:bookmarkStart w:id="66" w:name="conclusion"/>
+    <w:bookmarkEnd w:id="66"/>
+    <w:bookmarkStart w:id="67" w:name="conclusion"/>
     <w:p>
       <w:pPr>
         <w:pStyle w:val="Heading2"/>
@@ -4891,7 +4949,7 @@
         <w:t xml:space="preserve"> </w:t>
       </w:r>
       <w:r>
-        <w:t xml:space="preserve">successfully resolves the core operational challenges of property management in Kathmandu. Through local SQLite architecture, it ensures full offline performance in concrete structures. It integrates Bikram Sambat calendar billing and sub-meter math to automate complex monthly rent calculations. The double-confirmation cash flow protects transactions from disputes, while the rating review system helps establish a reliable reputation index for tenants and landlords.</w:t>
+        <w:t xml:space="preserve">successfully resolves the core operational challenges of property management in Kathmandu. Through local SQLite architecture, it ensures full offline performance in concrete structures. It integrates Bikram Sambat calendar billing and sub-meter math to automate complex monthly rent calculations. The double-confirmation cash flow protects transactions from disputes, while the rating review system helps establish a reliable reputation index for tenants and landlords. Finally, native biometrics authentication provides reliable local-first security safeguarding renter privacy records.</w:t>
       </w:r>
     </w:p>
     <w:p>
@@ -4902,8 +4960,8 @@
         <w:t xml:space="preserve">The codebase compiles with zero TypeScript errors, has complete integration test coverage, and has been verified end-to-end. It is fully ready for client deployment.</w:t>
       </w:r>
     </w:p>
-    <w:bookmarkEnd w:id="66"/>
     <w:bookmarkEnd w:id="67"/>
+    <w:bookmarkEnd w:id="68"/>
     <w:sectPr>
       <w:footnotePr>
         <w:numRestart w:val="eachSect"/>

</xml_diff>

<commit_message>
Implement settings personalization: add English-Nepali translation localization, dynamic Indigo/Dark/Emerald theme swatches, and merchant Khalti account linking
</commit_message>
<xml_diff>
--- a/GharKoHisaabDocumentation.docx
+++ b/GharKoHisaabDocumentation.docx
@@ -2,7 +2,7 @@
 <file path=word/document.xml><?xml version="1.0" encoding="utf-8"?>
 <w:document xmlns:w="http://schemas.openxmlformats.org/wordprocessingml/2006/main" xmlns:m="http://schemas.openxmlformats.org/officeDocument/2006/math" xmlns:r="http://schemas.openxmlformats.org/officeDocument/2006/relationships" xmlns:o="urn:schemas-microsoft-com:office:office" xmlns:v="urn:schemas-microsoft-com:vml" xmlns:w10="urn:schemas-microsoft-com:office:word" xmlns:a="http://schemas.openxmlformats.org/drawingml/2006/main" xmlns:pic="http://schemas.openxmlformats.org/drawingml/2006/picture" xmlns:wp="http://schemas.openxmlformats.org/drawingml/2006/wordprocessingDrawing">
   <w:body>
-    <w:bookmarkStart w:id="68" w:name="gharkohisaab-घरक-हसब"/>
+    <w:bookmarkStart w:id="71" w:name="gharkohisaab-घरक-हसब"/>
     <w:p>
       <w:pPr>
         <w:pStyle w:val="Heading1"/>
@@ -221,6 +221,42 @@
       <w:pPr>
         <w:pStyle w:val="Compact"/>
         <w:numPr>
+          <w:ilvl w:val="2"/>
+          <w:numId w:val="1003"/>
+        </w:numPr>
+      </w:pPr>
+      <w:r>
+        <w:t xml:space="preserve">Runtime Multi-Theme Color Swapper System</w:t>
+      </w:r>
+    </w:p>
+    <w:p>
+      <w:pPr>
+        <w:pStyle w:val="Compact"/>
+        <w:numPr>
+          <w:ilvl w:val="2"/>
+          <w:numId w:val="1003"/>
+        </w:numPr>
+      </w:pPr>
+      <w:r>
+        <w:t xml:space="preserve">English-Nepali Translation Localization Algorithm</w:t>
+      </w:r>
+    </w:p>
+    <w:p>
+      <w:pPr>
+        <w:pStyle w:val="Compact"/>
+        <w:numPr>
+          <w:ilvl w:val="2"/>
+          <w:numId w:val="1003"/>
+        </w:numPr>
+      </w:pPr>
+      <w:r>
+        <w:t xml:space="preserve">Khalti Wallet Linking and Merchant Verification Setup</w:t>
+      </w:r>
+    </w:p>
+    <w:p>
+      <w:pPr>
+        <w:pStyle w:val="Compact"/>
+        <w:numPr>
           <w:ilvl w:val="1"/>
           <w:numId w:val="1002"/>
         </w:numPr>
@@ -427,7 +463,7 @@
         <w:t xml:space="preserve"> </w:t>
       </w:r>
       <w:r>
-        <w:t xml:space="preserve">is a premium, offline-first mobile checkbook and calculator application built to bridge these operational gaps. Using React Native, local SQLite storage, and a Drizzle ORM model layer, the application automates tenancy onboarding, sub-meter billing calculations, and checkout settlements. It features double-confirmation signatures to verify cash transactions and a biometric App Lock mechanism for secure records protection.</w:t>
+        <w:t xml:space="preserve">is a premium, offline-first mobile checkbook and calculator application built to bridge these operational gaps. Using React Native, local SQLite storage, and a Drizzle ORM model layer, the application automates tenancy onboarding, sub-meter billing calculations, and checkout settlements. It features double-confirmation signatures to verify cash transactions, a biometric App Lock mechanism, multi-theme selections, English-Nepali language support, and integrated options to link Khalti merchant wallets.</w:t>
       </w:r>
     </w:p>
     <w:p>
@@ -574,7 +610,7 @@
     </w:p>
     <w:bookmarkEnd w:id="13"/>
     <w:bookmarkEnd w:id="14"/>
-    <w:bookmarkStart w:id="26" w:name="technical-documentation"/>
+    <w:bookmarkStart w:id="29" w:name="technical-documentation"/>
     <w:p>
       <w:pPr>
         <w:pStyle w:val="Heading2"/>
@@ -1199,7 +1235,52 @@
         <w:t xml:space="preserve"> </w:t>
       </w:r>
       <w:r>
-        <w:t xml:space="preserve">state and fallback passcode hash values).</w:t>
+        <w:t xml:space="preserve">state,</w:t>
+      </w:r>
+      <w:r>
+        <w:t xml:space="preserve"> </w:t>
+      </w:r>
+      <w:r>
+        <w:rPr>
+          <w:rStyle w:val="VerbatimChar"/>
+        </w:rPr>
+        <w:t xml:space="preserve">app_theme</w:t>
+      </w:r>
+      <w:r>
+        <w:t xml:space="preserve"> </w:t>
+      </w:r>
+      <w:r>
+        <w:t xml:space="preserve">configurations,</w:t>
+      </w:r>
+      <w:r>
+        <w:t xml:space="preserve"> </w:t>
+      </w:r>
+      <w:r>
+        <w:rPr>
+          <w:rStyle w:val="VerbatimChar"/>
+        </w:rPr>
+        <w:t xml:space="preserve">app_language</w:t>
+      </w:r>
+      <w:r>
+        <w:t xml:space="preserve"> </w:t>
+      </w:r>
+      <w:r>
+        <w:t xml:space="preserve">flags, and</w:t>
+      </w:r>
+      <w:r>
+        <w:t xml:space="preserve"> </w:t>
+      </w:r>
+      <w:r>
+        <w:rPr>
+          <w:rStyle w:val="VerbatimChar"/>
+        </w:rPr>
+        <w:t xml:space="preserve">khalti_phone</w:t>
+      </w:r>
+      <w:r>
+        <w:t xml:space="preserve"> </w:t>
+      </w:r>
+      <w:r>
+        <w:t xml:space="preserve">linkages).</w:t>
       </w:r>
     </w:p>
     <w:p>
@@ -1210,7 +1291,7 @@
       </w:r>
     </w:p>
     <w:bookmarkEnd w:id="16"/>
-    <w:bookmarkStart w:id="24" w:name="core-codebase-algorithms"/>
+    <w:bookmarkStart w:id="27" w:name="core-codebase-algorithms"/>
     <w:p>
       <w:pPr>
         <w:pStyle w:val="Heading3"/>
@@ -2425,6 +2506,465 @@
         <w:t xml:space="preserve">resets to false. If canceled or unsupported, the user enters a fallback 4-digit PIN verified against the stored DB hash.</w:t>
       </w:r>
     </w:p>
+    <w:bookmarkEnd w:id="23"/>
+    <w:bookmarkStart w:id="24" w:name="runtime-multi-theme-color-swapper-system"/>
+    <w:p>
+      <w:pPr>
+        <w:pStyle w:val="Heading4"/>
+      </w:pPr>
+      <w:r>
+        <w:t xml:space="preserve">8. Runtime Multi-Theme Color Swapper System</w:t>
+      </w:r>
+    </w:p>
+    <w:p>
+      <w:pPr>
+        <w:pStyle w:val="FirstParagraph"/>
+      </w:pPr>
+      <w:r>
+        <w:t xml:space="preserve">To support runtime color shifting, components are linked through</w:t>
+      </w:r>
+      <w:r>
+        <w:t xml:space="preserve"> </w:t>
+      </w:r>
+      <w:r>
+        <w:rPr>
+          <w:rStyle w:val="VerbatimChar"/>
+        </w:rPr>
+        <w:t xml:space="preserve">ThemeContext</w:t>
+      </w:r>
+      <w:r>
+        <w:t xml:space="preserve">. Stylesheets use a functional instantiator:</w:t>
+      </w:r>
+    </w:p>
+    <w:p>
+      <w:pPr>
+        <w:pStyle w:val="BodyText"/>
+      </w:pPr>
+      <m:oMathPara>
+        <m:oMathParaPr>
+          <m:jc m:val="center"/>
+        </m:oMathParaPr>
+        <m:oMath>
+          <m:r>
+            <m:rPr>
+              <m:nor/>
+              <m:sty m:val="p"/>
+            </m:rPr>
+            <m:t>Styles</m:t>
+          </m:r>
+          <m:r>
+            <m:rPr>
+              <m:sty m:val="p"/>
+            </m:rPr>
+            <m:t>=</m:t>
+          </m:r>
+          <m:r>
+            <m:rPr>
+              <m:nor/>
+              <m:sty m:val="p"/>
+            </m:rPr>
+            <m:t>getStyles</m:t>
+          </m:r>
+          <m:r>
+            <m:rPr>
+              <m:sty m:val="p"/>
+            </m:rPr>
+            <m:t>(</m:t>
+          </m:r>
+          <m:r>
+            <m:rPr>
+              <m:nor/>
+              <m:sty m:val="p"/>
+            </m:rPr>
+            <m:t>ThemeColors</m:t>
+          </m:r>
+          <m:r>
+            <m:rPr>
+              <m:sty m:val="p"/>
+            </m:rPr>
+            <m:t>)</m:t>
+          </m:r>
+        </m:oMath>
+      </m:oMathPara>
+    </w:p>
+    <w:p>
+      <w:pPr>
+        <w:pStyle w:val="FirstParagraph"/>
+      </w:pPr>
+      <w:r>
+        <w:t xml:space="preserve">When the user toggles a themeSwatch (e.g. </w:t>
+      </w:r>
+      <w:r>
+        <w:rPr>
+          <w:rStyle w:val="VerbatimChar"/>
+        </w:rPr>
+        <w:t xml:space="preserve">'dark'</w:t>
+      </w:r>
+      <w:r>
+        <w:t xml:space="preserve"> </w:t>
+      </w:r>
+      <w:r>
+        <w:t xml:space="preserve">or</w:t>
+      </w:r>
+      <w:r>
+        <w:t xml:space="preserve"> </w:t>
+      </w:r>
+      <w:r>
+        <w:rPr>
+          <w:rStyle w:val="VerbatimChar"/>
+        </w:rPr>
+        <w:t xml:space="preserve">'emerald'</w:t>
+      </w:r>
+      <w:r>
+        <w:t xml:space="preserve">), the</w:t>
+      </w:r>
+      <w:r>
+        <w:t xml:space="preserve"> </w:t>
+      </w:r>
+      <w:r>
+        <w:rPr>
+          <w:rStyle w:val="VerbatimChar"/>
+        </w:rPr>
+        <w:t xml:space="preserve">ThemeContext</w:t>
+      </w:r>
+      <w:r>
+        <w:t xml:space="preserve"> </w:t>
+      </w:r>
+      <w:r>
+        <w:t xml:space="preserve">updates the state value. This forces a re-render of components using the hook and applies the new color tokens.</w:t>
+      </w:r>
+    </w:p>
+    <w:bookmarkEnd w:id="24"/>
+    <w:bookmarkStart w:id="25" w:name="X8d3060ca51282d168ae07292c7a3e0224761e86"/>
+    <w:p>
+      <w:pPr>
+        <w:pStyle w:val="Heading4"/>
+      </w:pPr>
+      <w:r>
+        <w:t xml:space="preserve">9. English-Nepali Translation Localization Algorithm</w:t>
+      </w:r>
+    </w:p>
+    <w:p>
+      <w:pPr>
+        <w:pStyle w:val="FirstParagraph"/>
+      </w:pPr>
+      <w:r>
+        <w:t xml:space="preserve">Translation utilizes a key-mapping function:</w:t>
+      </w:r>
+    </w:p>
+    <w:p>
+      <w:pPr>
+        <w:pStyle w:val="BodyText"/>
+      </w:pPr>
+      <m:oMathPara>
+        <m:oMathParaPr>
+          <m:jc m:val="center"/>
+        </m:oMathParaPr>
+        <m:oMath>
+          <m:r>
+            <m:rPr>
+              <m:nor/>
+              <m:sty m:val="p"/>
+            </m:rPr>
+            <m:t>t</m:t>
+          </m:r>
+          <m:r>
+            <m:rPr>
+              <m:sty m:val="p"/>
+            </m:rPr>
+            <m:t>(</m:t>
+          </m:r>
+          <m:r>
+            <m:t>k</m:t>
+          </m:r>
+          <m:r>
+            <m:rPr>
+              <m:sty m:val="p"/>
+            </m:rPr>
+            <m:t>,</m:t>
+          </m:r>
+          <m:r>
+            <m:t>L</m:t>
+          </m:r>
+          <m:r>
+            <m:rPr>
+              <m:sty m:val="p"/>
+            </m:rPr>
+            <m:t>)</m:t>
+          </m:r>
+          <m:r>
+            <m:rPr>
+              <m:sty m:val="p"/>
+            </m:rPr>
+            <m:t>=</m:t>
+          </m:r>
+          <m:r>
+            <m:rPr>
+              <m:nor/>
+              <m:sty m:val="p"/>
+            </m:rPr>
+            <m:t>Dictionary</m:t>
+          </m:r>
+          <m:r>
+            <m:rPr>
+              <m:sty m:val="p"/>
+            </m:rPr>
+            <m:t>[</m:t>
+          </m:r>
+          <m:r>
+            <m:t>L</m:t>
+          </m:r>
+          <m:r>
+            <m:rPr>
+              <m:sty m:val="p"/>
+            </m:rPr>
+            <m:t>]</m:t>
+          </m:r>
+          <m:r>
+            <m:rPr>
+              <m:sty m:val="p"/>
+            </m:rPr>
+            <m:t>[</m:t>
+          </m:r>
+          <m:r>
+            <m:t>k</m:t>
+          </m:r>
+          <m:r>
+            <m:rPr>
+              <m:sty m:val="p"/>
+            </m:rPr>
+            <m:t>]</m:t>
+          </m:r>
+          <m:r>
+            <m:rPr>
+              <m:sty m:val="p"/>
+            </m:rPr>
+            <m:t>∥</m:t>
+          </m:r>
+          <m:r>
+            <m:rPr>
+              <m:nor/>
+              <m:sty m:val="p"/>
+            </m:rPr>
+            <m:t>Dictionary</m:t>
+          </m:r>
+          <m:sSup>
+            <m:e>
+              <m:r>
+                <m:rPr>
+                  <m:sty m:val="p"/>
+                </m:rPr>
+                <m:t>[</m:t>
+              </m:r>
+            </m:e>
+            <m:sup>
+              <m:r>
+                <m:rPr>
+                  <m:sty m:val="p"/>
+                </m:rPr>
+                <m:t>′</m:t>
+              </m:r>
+            </m:sup>
+          </m:sSup>
+          <m:sSup>
+            <m:e>
+              <m:r>
+                <m:rPr>
+                  <m:nor/>
+                  <m:sty m:val="p"/>
+                </m:rPr>
+                <m:t>en</m:t>
+              </m:r>
+            </m:e>
+            <m:sup>
+              <m:r>
+                <m:rPr>
+                  <m:sty m:val="p"/>
+                </m:rPr>
+                <m:t>′</m:t>
+              </m:r>
+            </m:sup>
+          </m:sSup>
+          <m:r>
+            <m:rPr>
+              <m:sty m:val="p"/>
+            </m:rPr>
+            <m:t>]</m:t>
+          </m:r>
+          <m:r>
+            <m:rPr>
+              <m:sty m:val="p"/>
+            </m:rPr>
+            <m:t>[</m:t>
+          </m:r>
+          <m:r>
+            <m:t>k</m:t>
+          </m:r>
+          <m:r>
+            <m:rPr>
+              <m:sty m:val="p"/>
+            </m:rPr>
+            <m:t>]</m:t>
+          </m:r>
+        </m:oMath>
+      </m:oMathPara>
+    </w:p>
+    <w:p>
+      <w:pPr>
+        <w:pStyle w:val="FirstParagraph"/>
+      </w:pPr>
+      <w:r>
+        <w:t xml:space="preserve">Where</w:t>
+      </w:r>
+      <w:r>
+        <w:t xml:space="preserve"> </w:t>
+      </w:r>
+      <m:oMath>
+        <m:r>
+          <m:t>L</m:t>
+        </m:r>
+        <m:r>
+          <m:rPr>
+            <m:sty m:val="p"/>
+          </m:rPr>
+          <m:t>∈</m:t>
+        </m:r>
+        <m:sSup>
+          <m:e>
+            <m:r>
+              <m:rPr>
+                <m:sty m:val="p"/>
+              </m:rPr>
+              <m:t>{</m:t>
+            </m:r>
+          </m:e>
+          <m:sup>
+            <m:r>
+              <m:rPr>
+                <m:sty m:val="p"/>
+              </m:rPr>
+              <m:t>′</m:t>
+            </m:r>
+          </m:sup>
+        </m:sSup>
+        <m:sSup>
+          <m:e>
+            <m:r>
+              <m:rPr>
+                <m:nor/>
+                <m:sty m:val="p"/>
+              </m:rPr>
+              <m:t>en</m:t>
+            </m:r>
+          </m:e>
+          <m:sup>
+            <m:r>
+              <m:rPr>
+                <m:sty m:val="p"/>
+              </m:rPr>
+              <m:t>′</m:t>
+            </m:r>
+          </m:sup>
+        </m:sSup>
+        <m:sSup>
+          <m:e>
+            <m:r>
+              <m:rPr>
+                <m:sty m:val="p"/>
+              </m:rPr>
+              <m:t>,</m:t>
+            </m:r>
+          </m:e>
+          <m:sup>
+            <m:r>
+              <m:rPr>
+                <m:sty m:val="p"/>
+              </m:rPr>
+              <m:t>′</m:t>
+            </m:r>
+          </m:sup>
+        </m:sSup>
+        <m:sSup>
+          <m:e>
+            <m:r>
+              <m:rPr>
+                <m:nor/>
+                <m:sty m:val="p"/>
+              </m:rPr>
+              <m:t>ne</m:t>
+            </m:r>
+          </m:e>
+          <m:sup>
+            <m:r>
+              <m:rPr>
+                <m:sty m:val="p"/>
+              </m:rPr>
+              <m:t>′</m:t>
+            </m:r>
+          </m:sup>
+        </m:sSup>
+        <m:r>
+          <m:rPr>
+            <m:sty m:val="p"/>
+          </m:rPr>
+          <m:t>}</m:t>
+        </m:r>
+      </m:oMath>
+      <w:r>
+        <w:t xml:space="preserve"> </w:t>
+      </w:r>
+      <w:r>
+        <w:t xml:space="preserve">is the active language setting. This updates interface labels on the fly without full system reloads.</w:t>
+      </w:r>
+    </w:p>
+    <w:bookmarkEnd w:id="25"/>
+    <w:bookmarkStart w:id="26" w:name="Xd52396183a1a33094c999a09009518df9c5398e"/>
+    <w:p>
+      <w:pPr>
+        <w:pStyle w:val="Heading4"/>
+      </w:pPr>
+      <w:r>
+        <w:t xml:space="preserve">10. Khalti Wallet Linking and Merchant Verification Setup</w:t>
+      </w:r>
+    </w:p>
+    <w:p>
+      <w:pPr>
+        <w:pStyle w:val="FirstParagraph"/>
+      </w:pPr>
+      <w:r>
+        <w:t xml:space="preserve">The housekeeper configures their Khalti Merchant parameters by saving</w:t>
+      </w:r>
+      <w:r>
+        <w:t xml:space="preserve"> </w:t>
+      </w:r>
+      <w:r>
+        <w:rPr>
+          <w:rStyle w:val="VerbatimChar"/>
+        </w:rPr>
+        <w:t xml:space="preserve">khalti_phone</w:t>
+      </w:r>
+      <w:r>
+        <w:t xml:space="preserve"> </w:t>
+      </w:r>
+      <w:r>
+        <w:t xml:space="preserve">(10-digit) and</w:t>
+      </w:r>
+      <w:r>
+        <w:t xml:space="preserve"> </w:t>
+      </w:r>
+      <w:r>
+        <w:rPr>
+          <w:rStyle w:val="VerbatimChar"/>
+        </w:rPr>
+        <w:t xml:space="preserve">khalti_public_key</w:t>
+      </w:r>
+      <w:r>
+        <w:t xml:space="preserve"> </w:t>
+      </w:r>
+      <w:r>
+        <w:t xml:space="preserve">strings. This linked status unlocks direct deeplinking endpoints during billing checkout invoices creation.</w:t>
+      </w:r>
+    </w:p>
     <w:p>
       <w:r>
         <w:pict>
@@ -2432,9 +2972,9 @@
         </w:pict>
       </w:r>
     </w:p>
-    <w:bookmarkEnd w:id="23"/>
-    <w:bookmarkEnd w:id="24"/>
-    <w:bookmarkStart w:id="25" w:name="file-by-file-codebase-explanations"/>
+    <w:bookmarkEnd w:id="26"/>
+    <w:bookmarkEnd w:id="27"/>
+    <w:bookmarkStart w:id="28" w:name="file-by-file-codebase-explanations"/>
     <w:p>
       <w:pPr>
         <w:pStyle w:val="Heading3"/>
@@ -2523,23 +3063,46 @@
         <w:t xml:space="preserve">src/constants/colors.ts</w:t>
       </w:r>
       <w:r>
-        <w:t xml:space="preserve">: Contains our redesigned modern</w:t>
-      </w:r>
-      <w:r>
-        <w:t xml:space="preserve"> </w:t>
-      </w:r>
-      <w:r>
-        <w:rPr>
-          <w:b/>
-          <w:bCs/>
-        </w:rPr>
-        <w:t xml:space="preserve">Indigo-Slate</w:t>
-      </w:r>
-      <w:r>
-        <w:t xml:space="preserve"> </w:t>
-      </w:r>
-      <w:r>
-        <w:t xml:space="preserve">brand color tokens.</w:t>
+        <w:t xml:space="preserve">: Contains our theme color configurations, supporting</w:t>
+      </w:r>
+      <w:r>
+        <w:t xml:space="preserve"> </w:t>
+      </w:r>
+      <w:r>
+        <w:rPr>
+          <w:rStyle w:val="VerbatimChar"/>
+        </w:rPr>
+        <w:t xml:space="preserve">indigo</w:t>
+      </w:r>
+      <w:r>
+        <w:t xml:space="preserve">,</w:t>
+      </w:r>
+      <w:r>
+        <w:t xml:space="preserve"> </w:t>
+      </w:r>
+      <w:r>
+        <w:rPr>
+          <w:rStyle w:val="VerbatimChar"/>
+        </w:rPr>
+        <w:t xml:space="preserve">dark</w:t>
+      </w:r>
+      <w:r>
+        <w:t xml:space="preserve">, and</w:t>
+      </w:r>
+      <w:r>
+        <w:t xml:space="preserve"> </w:t>
+      </w:r>
+      <w:r>
+        <w:rPr>
+          <w:rStyle w:val="VerbatimChar"/>
+        </w:rPr>
+        <w:t xml:space="preserve">emerald</w:t>
+      </w:r>
+      <w:r>
+        <w:t xml:space="preserve"> </w:t>
+      </w:r>
+      <w:r>
+        <w:t xml:space="preserve">palettes.</w:t>
       </w:r>
     </w:p>
     <w:p>
@@ -2556,10 +3119,10 @@
           <w:b/>
           <w:bCs/>
         </w:rPr>
-        <w:t xml:space="preserve">src/types/nepali-date-converter.d.ts</w:t>
-      </w:r>
-      <w:r>
-        <w:t xml:space="preserve">: Ambient TypeScript declaration types for the Bikram Sambat date converter library.</w:t>
+        <w:t xml:space="preserve">src/constants/translations.ts</w:t>
+      </w:r>
+      <w:r>
+        <w:t xml:space="preserve">: English and Nepali dictionaries mapping tab headers, button titles, and configurations.</w:t>
       </w:r>
     </w:p>
     <w:p>
@@ -2576,10 +3139,10 @@
           <w:b/>
           <w:bCs/>
         </w:rPr>
-        <w:t xml:space="preserve">src/components/SignaturePad.tsx</w:t>
-      </w:r>
-      <w:r>
-        <w:t xml:space="preserve">: Signature drawing canvas component compiled using React Native SVG paths.</w:t>
+        <w:t xml:space="preserve">src/context/ThemeContext.tsx</w:t>
+      </w:r>
+      <w:r>
+        <w:t xml:space="preserve">: Dynamic context distributing theme colors and active languages.</w:t>
       </w:r>
     </w:p>
     <w:p>
@@ -2596,10 +3159,10 @@
           <w:b/>
           <w:bCs/>
         </w:rPr>
-        <w:t xml:space="preserve">src/components/AppLockOverlay.tsx</w:t>
-      </w:r>
-      <w:r>
-        <w:t xml:space="preserve">: Wraps the application to handle AppState locks, biometric integrations, and fallback PIN pad inputs.</w:t>
+        <w:t xml:space="preserve">src/components/SignaturePad.tsx</w:t>
+      </w:r>
+      <w:r>
+        <w:t xml:space="preserve">: Signature drawing canvas component compiled using React Native SVG paths.</w:t>
       </w:r>
     </w:p>
     <w:p>
@@ -2616,10 +3179,10 @@
           <w:b/>
           <w:bCs/>
         </w:rPr>
-        <w:t xml:space="preserve">src/features/tenant/TenantModel.ts</w:t>
-      </w:r>
-      <w:r>
-        <w:t xml:space="preserve">: Database model queries and schema initializers for tenants and tenancies.</w:t>
+        <w:t xml:space="preserve">src/components/AppLockOverlay.tsx</w:t>
+      </w:r>
+      <w:r>
+        <w:t xml:space="preserve">: Wraps the application to handle AppState locks, biometric integrations, and fallback PIN pad inputs.</w:t>
       </w:r>
     </w:p>
     <w:p>
@@ -2636,10 +3199,10 @@
           <w:b/>
           <w:bCs/>
         </w:rPr>
-        <w:t xml:space="preserve">src/features/tenant/TenantController.ts</w:t>
-      </w:r>
-      <w:r>
-        <w:t xml:space="preserve">: State machine managing tenant onboarding, KYC image selectors, and property reviews logic.</w:t>
+        <w:t xml:space="preserve">src/features/tenant/TenantModel.ts</w:t>
+      </w:r>
+      <w:r>
+        <w:t xml:space="preserve">: Database model queries and schema initializers for tenants and tenancies.</w:t>
       </w:r>
     </w:p>
     <w:p>
@@ -2656,10 +3219,10 @@
           <w:b/>
           <w:bCs/>
         </w:rPr>
-        <w:t xml:space="preserve">src/features/tenant/TenantScreen.tsx</w:t>
-      </w:r>
-      <w:r>
-        <w:t xml:space="preserve">: Renders tenant profiles, active leases, invoices lists, and property review cards.</w:t>
+        <w:t xml:space="preserve">src/features/tenant/TenantController.ts</w:t>
+      </w:r>
+      <w:r>
+        <w:t xml:space="preserve">: State machine managing tenant onboarding, KYC image selectors, and property reviews logic.</w:t>
       </w:r>
     </w:p>
     <w:p>
@@ -2676,10 +3239,10 @@
           <w:b/>
           <w:bCs/>
         </w:rPr>
-        <w:t xml:space="preserve">src/features/postings/PostingModel.ts</w:t>
-      </w:r>
-      <w:r>
-        <w:t xml:space="preserve">: Manages CRUD queries for vacant room marketplace listings.</w:t>
+        <w:t xml:space="preserve">src/features/tenant/TenantScreen.tsx</w:t>
+      </w:r>
+      <w:r>
+        <w:t xml:space="preserve">: Renders tenant profiles, active leases, invoices lists, and property review cards.</w:t>
       </w:r>
     </w:p>
     <w:p>
@@ -2696,10 +3259,10 @@
           <w:b/>
           <w:bCs/>
         </w:rPr>
-        <w:t xml:space="preserve">src/features/postings/PostingController.ts</w:t>
-      </w:r>
-      <w:r>
-        <w:t xml:space="preserve">: Handles logic for editing and publishing room postings.</w:t>
+        <w:t xml:space="preserve">src/features/postings/PostingModel.ts</w:t>
+      </w:r>
+      <w:r>
+        <w:t xml:space="preserve">: Manages CRUD queries for vacant room marketplace listings.</w:t>
       </w:r>
     </w:p>
     <w:p>
@@ -2716,10 +3279,10 @@
           <w:b/>
           <w:bCs/>
         </w:rPr>
-        <w:t xml:space="preserve">src/features/postings/MarketplaceFeed.tsx</w:t>
-      </w:r>
-      <w:r>
-        <w:t xml:space="preserve">: Search feed where prospective tenants can view vacant postings in Kathmandu.</w:t>
+        <w:t xml:space="preserve">src/features/postings/PostingController.ts</w:t>
+      </w:r>
+      <w:r>
+        <w:t xml:space="preserve">: Handles logic for editing and publishing room postings.</w:t>
       </w:r>
     </w:p>
     <w:p>
@@ -2736,10 +3299,10 @@
           <w:b/>
           <w:bCs/>
         </w:rPr>
-        <w:t xml:space="preserve">src/features/property/PropertyModel.ts</w:t>
-      </w:r>
-      <w:r>
-        <w:t xml:space="preserve">: Database queries for housekeeper properties and rooms.</w:t>
+        <w:t xml:space="preserve">src/features/postings/MarketplaceFeed.tsx</w:t>
+      </w:r>
+      <w:r>
+        <w:t xml:space="preserve">: Search feed where prospective tenants can view vacant postings in Kathmandu.</w:t>
       </w:r>
     </w:p>
     <w:p>
@@ -2756,10 +3319,10 @@
           <w:b/>
           <w:bCs/>
         </w:rPr>
-        <w:t xml:space="preserve">src/features/property/PropertyController.ts</w:t>
-      </w:r>
-      <w:r>
-        <w:t xml:space="preserve">: State controller managing properties creation.</w:t>
+        <w:t xml:space="preserve">src/features/property/PropertyModel.ts</w:t>
+      </w:r>
+      <w:r>
+        <w:t xml:space="preserve">: Database queries for housekeeper properties and rooms.</w:t>
       </w:r>
     </w:p>
     <w:p>
@@ -2776,10 +3339,10 @@
           <w:b/>
           <w:bCs/>
         </w:rPr>
-        <w:t xml:space="preserve">src/features/property/PropertyScreen.tsx</w:t>
-      </w:r>
-      <w:r>
-        <w:t xml:space="preserve">: Main housekeeper dashboard showing property grids, room status metrics, settings options, and wizard modulators.</w:t>
+        <w:t xml:space="preserve">src/features/property/PropertyController.ts</w:t>
+      </w:r>
+      <w:r>
+        <w:t xml:space="preserve">: State controller managing properties creation.</w:t>
       </w:r>
     </w:p>
     <w:p>
@@ -2796,10 +3359,10 @@
           <w:b/>
           <w:bCs/>
         </w:rPr>
-        <w:t xml:space="preserve">src/features/payment/PaymentModel.ts</w:t>
-      </w:r>
-      <w:r>
-        <w:t xml:space="preserve">: Database helper functions to record rent transaction receipts.</w:t>
+        <w:t xml:space="preserve">src/features/property/PropertyScreen.tsx</w:t>
+      </w:r>
+      <w:r>
+        <w:t xml:space="preserve">: Main housekeeper dashboard showing property grids, room status metrics, settings options, and wizard modulators.</w:t>
       </w:r>
     </w:p>
     <w:p>
@@ -2816,10 +3379,10 @@
           <w:b/>
           <w:bCs/>
         </w:rPr>
-        <w:t xml:space="preserve">src/features/payment/PaymentController.ts</w:t>
-      </w:r>
-      <w:r>
-        <w:t xml:space="preserve">: Handles cash receipt confirmations, OTP codes, and digital receipt uploads.</w:t>
+        <w:t xml:space="preserve">src/features/payment/PaymentModel.ts</w:t>
+      </w:r>
+      <w:r>
+        <w:t xml:space="preserve">: Database helper functions to record rent transaction receipts.</w:t>
       </w:r>
     </w:p>
     <w:p>
@@ -2836,10 +3399,10 @@
           <w:b/>
           <w:bCs/>
         </w:rPr>
-        <w:t xml:space="preserve">src/features/payment/PaymentModal.tsx</w:t>
-      </w:r>
-      <w:r>
-        <w:t xml:space="preserve">: Overlay modal rendering eSewa QR payment panels and cash OTP signature boxes.</w:t>
+        <w:t xml:space="preserve">src/features/payment/PaymentController.ts</w:t>
+      </w:r>
+      <w:r>
+        <w:t xml:space="preserve">: Handles cash receipt confirmations, OTP codes, and digital receipt uploads.</w:t>
       </w:r>
     </w:p>
     <w:p>
@@ -2856,10 +3419,10 @@
           <w:b/>
           <w:bCs/>
         </w:rPr>
-        <w:t xml:space="preserve">src/features/agreement/AgreementModel.ts</w:t>
-      </w:r>
-      <w:r>
-        <w:t xml:space="preserve">: Database operations for managing digital rental contracts.</w:t>
+        <w:t xml:space="preserve">src/features/payment/PaymentModal.tsx</w:t>
+      </w:r>
+      <w:r>
+        <w:t xml:space="preserve">: Overlay modal rendering eSewa QR payment panels and cash OTP signature boxes.</w:t>
       </w:r>
     </w:p>
     <w:p>
@@ -2876,10 +3439,10 @@
           <w:b/>
           <w:bCs/>
         </w:rPr>
-        <w:t xml:space="preserve">src/features/agreement/AgreementController.ts</w:t>
-      </w:r>
-      <w:r>
-        <w:t xml:space="preserve">: Handles signature steps and contract terms.</w:t>
+        <w:t xml:space="preserve">src/features/agreement/AgreementModel.ts</w:t>
+      </w:r>
+      <w:r>
+        <w:t xml:space="preserve">: Database operations for managing digital rental contracts.</w:t>
       </w:r>
     </w:p>
     <w:p>
@@ -2896,10 +3459,10 @@
           <w:b/>
           <w:bCs/>
         </w:rPr>
-        <w:t xml:space="preserve">src/features/agreement/AgreementModal.tsx</w:t>
-      </w:r>
-      <w:r>
-        <w:t xml:space="preserve">: Dual-signature pad wizard showing printable contract summaries.</w:t>
+        <w:t xml:space="preserve">src/features/agreement/AgreementController.ts</w:t>
+      </w:r>
+      <w:r>
+        <w:t xml:space="preserve">: Handles signature steps and contract terms.</w:t>
       </w:r>
     </w:p>
     <w:p>
@@ -2916,10 +3479,10 @@
           <w:b/>
           <w:bCs/>
         </w:rPr>
-        <w:t xml:space="preserve">src/features/checkout/CheckoutModel.ts</w:t>
-      </w:r>
-      <w:r>
-        <w:t xml:space="preserve">: Handles closing active leases and logging settlements.</w:t>
+        <w:t xml:space="preserve">src/features/agreement/AgreementModal.tsx</w:t>
+      </w:r>
+      <w:r>
+        <w:t xml:space="preserve">: Dual-signature pad wizard showing printable contract summaries.</w:t>
       </w:r>
     </w:p>
     <w:p>
@@ -2936,10 +3499,10 @@
           <w:b/>
           <w:bCs/>
         </w:rPr>
-        <w:t xml:space="preserve">src/features/checkout/CheckoutController.ts</w:t>
-      </w:r>
-      <w:r>
-        <w:t xml:space="preserve">: Calculates pro-rated final cycle rent, utilities usage, and deposit balances.</w:t>
+        <w:t xml:space="preserve">src/features/checkout/CheckoutModel.ts</w:t>
+      </w:r>
+      <w:r>
+        <w:t xml:space="preserve">: Handles closing active leases and logging settlements.</w:t>
       </w:r>
     </w:p>
     <w:p>
@@ -2956,10 +3519,10 @@
           <w:b/>
           <w:bCs/>
         </w:rPr>
-        <w:t xml:space="preserve">src/features/checkout/CheckoutModal.tsx</w:t>
-      </w:r>
-      <w:r>
-        <w:t xml:space="preserve">: 3-step checkout wizard with interactive tenant rating stars.</w:t>
+        <w:t xml:space="preserve">src/features/checkout/CheckoutController.ts</w:t>
+      </w:r>
+      <w:r>
+        <w:t xml:space="preserve">: Calculates pro-rated final cycle rent, utilities usage, and deposit balances.</w:t>
       </w:r>
     </w:p>
     <w:p>
@@ -2976,10 +3539,10 @@
           <w:b/>
           <w:bCs/>
         </w:rPr>
-        <w:t xml:space="preserve">src/features/invoice/InvoiceModel.ts</w:t>
-      </w:r>
-      <w:r>
-        <w:t xml:space="preserve">: Manages invoice generation and arrears carry-forward.</w:t>
+        <w:t xml:space="preserve">src/features/checkout/CheckoutModal.tsx</w:t>
+      </w:r>
+      <w:r>
+        <w:t xml:space="preserve">: 3-step checkout wizard with interactive tenant rating stars.</w:t>
       </w:r>
     </w:p>
     <w:p>
@@ -2996,10 +3559,10 @@
           <w:b/>
           <w:bCs/>
         </w:rPr>
-        <w:t xml:space="preserve">src/features/invoice/InvoiceController.ts</w:t>
-      </w:r>
-      <w:r>
-        <w:t xml:space="preserve">: Handles sub-meter inputs and invoice submissions.</w:t>
+        <w:t xml:space="preserve">src/features/invoice/InvoiceModel.ts</w:t>
+      </w:r>
+      <w:r>
+        <w:t xml:space="preserve">: Manages invoice generation and arrears carry-forward.</w:t>
       </w:r>
     </w:p>
     <w:p>
@@ -3016,10 +3579,10 @@
           <w:b/>
           <w:bCs/>
         </w:rPr>
-        <w:t xml:space="preserve">src/features/invoice/InvoiceSection.tsx</w:t>
-      </w:r>
-      <w:r>
-        <w:t xml:space="preserve">: Lists billing details and pro-rated ledgers.</w:t>
+        <w:t xml:space="preserve">src/features/invoice/InvoiceController.ts</w:t>
+      </w:r>
+      <w:r>
+        <w:t xml:space="preserve">: Handles sub-meter inputs and invoice submissions.</w:t>
       </w:r>
     </w:p>
     <w:p>
@@ -3036,10 +3599,10 @@
           <w:b/>
           <w:bCs/>
         </w:rPr>
-        <w:t xml:space="preserve">src/features/reviews/ReviewModel.ts</w:t>
-      </w:r>
-      <w:r>
-        <w:t xml:space="preserve">: SQLite CRUD functions for tenant rating cards and property reviews.</w:t>
+        <w:t xml:space="preserve">src/features/invoice/InvoiceSection.tsx</w:t>
+      </w:r>
+      <w:r>
+        <w:t xml:space="preserve">: Lists billing details and pro-rated ledgers.</w:t>
       </w:r>
     </w:p>
     <w:p>
@@ -3056,10 +3619,10 @@
           <w:b/>
           <w:bCs/>
         </w:rPr>
-        <w:t xml:space="preserve">src/features/settings/SettingsModel.ts</w:t>
-      </w:r>
-      <w:r>
-        <w:t xml:space="preserve">: SQLite settings schema declarations, reading/writing configuration variables on native devices, and web fallbacks.</w:t>
+        <w:t xml:space="preserve">src/features/reviews/ReviewModel.ts</w:t>
+      </w:r>
+      <w:r>
+        <w:t xml:space="preserve">: SQLite CRUD functions for tenant rating cards and property reviews.</w:t>
       </w:r>
     </w:p>
     <w:p>
@@ -3076,10 +3639,10 @@
           <w:b/>
           <w:bCs/>
         </w:rPr>
-        <w:t xml:space="preserve">src/features/settings/SettingsController.ts</w:t>
-      </w:r>
-      <w:r>
-        <w:t xml:space="preserve">: Logic controllers managing biometric hardware queries and PIN lock configurations.</w:t>
+        <w:t xml:space="preserve">src/features/settings/SettingsModel.ts</w:t>
+      </w:r>
+      <w:r>
+        <w:t xml:space="preserve">: SQLite settings schema declarations, reading/writing configuration variables on native devices, and web fallbacks.</w:t>
       </w:r>
     </w:p>
     <w:p>
@@ -3096,10 +3659,30 @@
           <w:b/>
           <w:bCs/>
         </w:rPr>
+        <w:t xml:space="preserve">src/features/settings/SettingsController.ts</w:t>
+      </w:r>
+      <w:r>
+        <w:t xml:space="preserve">: Logic controllers managing biometric hardware queries, PIN configs, and Khalti wallet connections.</w:t>
+      </w:r>
+    </w:p>
+    <w:p>
+      <w:pPr>
+        <w:pStyle w:val="Compact"/>
+        <w:numPr>
+          <w:ilvl w:val="0"/>
+          <w:numId w:val="1006"/>
+        </w:numPr>
+      </w:pPr>
+      <w:r>
+        <w:rPr>
+          <w:rStyle w:val="VerbatimChar"/>
+          <w:b/>
+          <w:bCs/>
+        </w:rPr>
         <w:t xml:space="preserve">src/features/settings/SettingsScreen.tsx</w:t>
       </w:r>
       <w:r>
-        <w:t xml:space="preserve">: Settings dashboard where users can toggle security parameters and change PIN codes.</w:t>
+        <w:t xml:space="preserve">: Settings dashboard where users can toggle security parameters, change languages, switch color themes, and link Khalti accounts.</w:t>
       </w:r>
     </w:p>
     <w:p>
@@ -3107,9 +3690,9 @@
         <w:br w:type="page"/>
       </w:r>
     </w:p>
-    <w:bookmarkEnd w:id="25"/>
-    <w:bookmarkEnd w:id="26"/>
-    <w:bookmarkStart w:id="66" w:name="testing-documentation"/>
+    <w:bookmarkEnd w:id="28"/>
+    <w:bookmarkEnd w:id="29"/>
+    <w:bookmarkStart w:id="69" w:name="testing-documentation"/>
     <w:p>
       <w:pPr>
         <w:pStyle w:val="Heading2"/>
@@ -3118,7 +3701,7 @@
         <w:t xml:space="preserve">4. Testing Documentation</w:t>
       </w:r>
     </w:p>
-    <w:bookmarkStart w:id="27" w:name="unit-integration-testing"/>
+    <w:bookmarkStart w:id="30" w:name="unit-integration-testing"/>
     <w:p>
       <w:pPr>
         <w:pStyle w:val="Heading3"/>
@@ -3230,8 +3813,8 @@
         </w:pict>
       </w:r>
     </w:p>
-    <w:bookmarkEnd w:id="27"/>
-    <w:bookmarkStart w:id="28" w:name="api-testing-logs"/>
+    <w:bookmarkEnd w:id="30"/>
+    <w:bookmarkStart w:id="31" w:name="api-testing-logs"/>
     <w:p>
       <w:pPr>
         <w:pStyle w:val="Heading3"/>
@@ -4076,6 +4659,189 @@
           <w:rStyle w:val="StringTok"/>
         </w:rPr>
         <w:t xml:space="preserve">'true'</w:t>
+      </w:r>
+      <w:r>
+        <w:rPr>
+          <w:rStyle w:val="NormalTok"/>
+        </w:rPr>
+        <w:t xml:space="preserve">) </w:t>
+      </w:r>
+      <w:r>
+        <w:rPr>
+          <w:rStyle w:val="KeywordTok"/>
+        </w:rPr>
+        <w:t xml:space="preserve">ON</w:t>
+      </w:r>
+      <w:r>
+        <w:rPr>
+          <w:rStyle w:val="NormalTok"/>
+        </w:rPr>
+        <w:t xml:space="preserve"> CONFLICT(</w:t>
+      </w:r>
+      <w:r>
+        <w:rPr>
+          <w:rStyle w:val="KeywordTok"/>
+        </w:rPr>
+        <w:t xml:space="preserve">key</w:t>
+      </w:r>
+      <w:r>
+        <w:rPr>
+          <w:rStyle w:val="NormalTok"/>
+        </w:rPr>
+        <w:t xml:space="preserve">) DO </w:t>
+      </w:r>
+      <w:r>
+        <w:rPr>
+          <w:rStyle w:val="KeywordTok"/>
+        </w:rPr>
+        <w:t xml:space="preserve">UPDATE</w:t>
+      </w:r>
+      <w:r>
+        <w:rPr>
+          <w:rStyle w:val="NormalTok"/>
+        </w:rPr>
+        <w:t xml:space="preserve"> </w:t>
+      </w:r>
+      <w:r>
+        <w:rPr>
+          <w:rStyle w:val="KeywordTok"/>
+        </w:rPr>
+        <w:t xml:space="preserve">SET</w:t>
+      </w:r>
+      <w:r>
+        <w:rPr>
+          <w:rStyle w:val="NormalTok"/>
+        </w:rPr>
+        <w:t xml:space="preserve"> </w:t>
+      </w:r>
+      <w:r>
+        <w:rPr>
+          <w:rStyle w:val="FunctionTok"/>
+        </w:rPr>
+        <w:t xml:space="preserve">value</w:t>
+      </w:r>
+      <w:r>
+        <w:rPr>
+          <w:rStyle w:val="NormalTok"/>
+        </w:rPr>
+        <w:t xml:space="preserve"> </w:t>
+      </w:r>
+      <w:r>
+        <w:rPr>
+          <w:rStyle w:val="OperatorTok"/>
+        </w:rPr>
+        <w:t xml:space="preserve">=</w:t>
+      </w:r>
+      <w:r>
+        <w:rPr>
+          <w:rStyle w:val="NormalTok"/>
+        </w:rPr>
+        <w:t xml:space="preserve"> excluded.</w:t>
+      </w:r>
+      <w:r>
+        <w:rPr>
+          <w:rStyle w:val="FunctionTok"/>
+        </w:rPr>
+        <w:t xml:space="preserve">value</w:t>
+      </w:r>
+      <w:r>
+        <w:rPr>
+          <w:rStyle w:val="NormalTok"/>
+        </w:rPr>
+        <w:t xml:space="preserve">;</w:t>
+      </w:r>
+      <w:r>
+        <w:br/>
+      </w:r>
+      <w:r>
+        <w:br/>
+      </w:r>
+      <w:r>
+        <w:rPr>
+          <w:rStyle w:val="CommentTok"/>
+        </w:rPr>
+        <w:t xml:space="preserve">-- [Web DB] linking merchant Khalti account...</w:t>
+      </w:r>
+      <w:r>
+        <w:br/>
+      </w:r>
+      <w:r>
+        <w:rPr>
+          <w:rStyle w:val="KeywordTok"/>
+        </w:rPr>
+        <w:t xml:space="preserve">INSERT</w:t>
+      </w:r>
+      <w:r>
+        <w:rPr>
+          <w:rStyle w:val="NormalTok"/>
+        </w:rPr>
+        <w:t xml:space="preserve"> </w:t>
+      </w:r>
+      <w:r>
+        <w:rPr>
+          <w:rStyle w:val="KeywordTok"/>
+        </w:rPr>
+        <w:t xml:space="preserve">INTO</w:t>
+      </w:r>
+      <w:r>
+        <w:rPr>
+          <w:rStyle w:val="NormalTok"/>
+        </w:rPr>
+        <w:t xml:space="preserve"> settings (</w:t>
+      </w:r>
+      <w:r>
+        <w:rPr>
+          <w:rStyle w:val="KeywordTok"/>
+        </w:rPr>
+        <w:t xml:space="preserve">key</w:t>
+      </w:r>
+      <w:r>
+        <w:rPr>
+          <w:rStyle w:val="NormalTok"/>
+        </w:rPr>
+        <w:t xml:space="preserve">, </w:t>
+      </w:r>
+      <w:r>
+        <w:rPr>
+          <w:rStyle w:val="FunctionTok"/>
+        </w:rPr>
+        <w:t xml:space="preserve">value</w:t>
+      </w:r>
+      <w:r>
+        <w:rPr>
+          <w:rStyle w:val="NormalTok"/>
+        </w:rPr>
+        <w:t xml:space="preserve">) </w:t>
+      </w:r>
+      <w:r>
+        <w:rPr>
+          <w:rStyle w:val="KeywordTok"/>
+        </w:rPr>
+        <w:t xml:space="preserve">VALUES</w:t>
+      </w:r>
+      <w:r>
+        <w:rPr>
+          <w:rStyle w:val="NormalTok"/>
+        </w:rPr>
+        <w:t xml:space="preserve"> (</w:t>
+      </w:r>
+      <w:r>
+        <w:rPr>
+          <w:rStyle w:val="StringTok"/>
+        </w:rPr>
+        <w:t xml:space="preserve">'khalti_phone'</w:t>
+      </w:r>
+      <w:r>
+        <w:rPr>
+          <w:rStyle w:val="NormalTok"/>
+        </w:rPr>
+        <w:t xml:space="preserve">, </w:t>
+      </w:r>
+      <w:r>
+        <w:rPr>
+          <w:rStyle w:val="StringTok"/>
+        </w:rPr>
+        <w:t xml:space="preserve">'9841223344'</w:t>
       </w:r>
       <w:r>
         <w:rPr>
@@ -4175,8 +4941,8 @@
         </w:pict>
       </w:r>
     </w:p>
-    <w:bookmarkEnd w:id="28"/>
-    <w:bookmarkStart w:id="65" w:name="X6d35ee801f4d6066f4521956814bb435bbf13bf"/>
+    <w:bookmarkEnd w:id="31"/>
+    <w:bookmarkStart w:id="68" w:name="X6d35ee801f4d6066f4521956814bb435bbf13bf"/>
     <w:p>
       <w:pPr>
         <w:pStyle w:val="Heading3"/>
@@ -4205,7 +4971,7 @@
         <w:t xml:space="preserve">:</w:t>
       </w:r>
     </w:p>
-    <w:bookmarkStart w:id="32" w:name="X1dd9f123032b7e8c6c3977b32f90669a36fe956"/>
+    <w:bookmarkStart w:id="35" w:name="X1dd9f123032b7e8c6c3977b32f90669a36fe956"/>
     <w:p>
       <w:pPr>
         <w:pStyle w:val="Heading4"/>
@@ -4231,18 +4997,18 @@
           <wp:inline>
             <wp:extent cx="5334000" cy="3000764"/>
             <wp:effectExtent b="0" l="0" r="0" t="0"/>
-            <wp:docPr descr="Setup Property Wizard" title="" id="30" name="Picture"/>
+            <wp:docPr descr="Setup Property Wizard" title="" id="33" name="Picture"/>
             <a:graphic>
               <a:graphicData uri="http://schemas.openxmlformats.org/drawingml/2006/picture">
                 <pic:pic>
                   <pic:nvPicPr>
-                    <pic:cNvPr descr="/Users/suppu/.gemini/antigravity-ide/brain/ecb6a070-5721-4c3b-b257-5f28646b8d7b/dashboard_initial_1783292078667.png" id="31" name="Picture"/>
+                    <pic:cNvPr descr="/Users/suppu/.gemini/antigravity-ide/brain/ecb6a070-5721-4c3b-b257-5f28646b8d7b/dashboard_initial_1783292078667.png" id="34" name="Picture"/>
                     <pic:cNvPicPr>
                       <a:picLocks noChangeArrowheads="1" noChangeAspect="1"/>
                     </pic:cNvPicPr>
                   </pic:nvPicPr>
                   <pic:blipFill>
-                    <a:blip r:embed="rId29"/>
+                    <a:blip r:embed="rId32"/>
                     <a:stretch>
                       <a:fillRect/>
                     </a:stretch>
@@ -4284,8 +5050,8 @@
         </w:pict>
       </w:r>
     </w:p>
-    <w:bookmarkEnd w:id="32"/>
-    <w:bookmarkStart w:id="36" w:name="step-2-add-new-room"/>
+    <w:bookmarkEnd w:id="35"/>
+    <w:bookmarkStart w:id="39" w:name="step-2-add-new-room"/>
     <w:p>
       <w:pPr>
         <w:pStyle w:val="Heading4"/>
@@ -4311,18 +5077,18 @@
           <wp:inline>
             <wp:extent cx="5334000" cy="3000764"/>
             <wp:effectExtent b="0" l="0" r="0" t="0"/>
-            <wp:docPr descr="Add Room Wizard" title="" id="34" name="Picture"/>
+            <wp:docPr descr="Add Room Wizard" title="" id="37" name="Picture"/>
             <a:graphic>
               <a:graphicData uri="http://schemas.openxmlformats.org/drawingml/2006/picture">
                 <pic:pic>
                   <pic:nvPicPr>
-                    <pic:cNvPr descr="/Users/suppu/.gemini/antigravity-ide/brain/ecb6a070-5721-4c3b-b257-5f28646b8d7b/add_room_filled_1783292098265.png" id="35" name="Picture"/>
+                    <pic:cNvPr descr="/Users/suppu/.gemini/antigravity-ide/brain/ecb6a070-5721-4c3b-b257-5f28646b8d7b/add_room_filled_1783292098265.png" id="38" name="Picture"/>
                     <pic:cNvPicPr>
                       <a:picLocks noChangeArrowheads="1" noChangeAspect="1"/>
                     </pic:cNvPicPr>
                   </pic:nvPicPr>
                   <pic:blipFill>
-                    <a:blip r:embed="rId33"/>
+                    <a:blip r:embed="rId36"/>
                     <a:stretch>
                       <a:fillRect/>
                     </a:stretch>
@@ -4364,8 +5130,8 @@
         </w:pict>
       </w:r>
     </w:p>
-    <w:bookmarkEnd w:id="36"/>
-    <w:bookmarkStart w:id="40" w:name="step-3-tenant-onboarding-form"/>
+    <w:bookmarkEnd w:id="39"/>
+    <w:bookmarkStart w:id="43" w:name="step-3-tenant-onboarding-form"/>
     <w:p>
       <w:pPr>
         <w:pStyle w:val="Heading4"/>
@@ -4391,18 +5157,18 @@
           <wp:inline>
             <wp:extent cx="5334000" cy="3000764"/>
             <wp:effectExtent b="0" l="0" r="0" t="0"/>
-            <wp:docPr descr="Tenant Onboard Wizard" title="" id="38" name="Picture"/>
+            <wp:docPr descr="Tenant Onboard Wizard" title="" id="41" name="Picture"/>
             <a:graphic>
               <a:graphicData uri="http://schemas.openxmlformats.org/drawingml/2006/picture">
                 <pic:pic>
                   <pic:nvPicPr>
-                    <pic:cNvPr descr="/Users/suppu/.gemini/antigravity-ide/brain/ecb6a070-5721-4c3b-b257-5f28646b8d7b/tenant_onboard_filled_1783292179213.png" id="39" name="Picture"/>
+                    <pic:cNvPr descr="/Users/suppu/.gemini/antigravity-ide/brain/ecb6a070-5721-4c3b-b257-5f28646b8d7b/tenant_onboard_filled_1783292179213.png" id="42" name="Picture"/>
                     <pic:cNvPicPr>
                       <a:picLocks noChangeArrowheads="1" noChangeAspect="1"/>
                     </pic:cNvPicPr>
                   </pic:nvPicPr>
                   <pic:blipFill>
-                    <a:blip r:embed="rId37"/>
+                    <a:blip r:embed="rId40"/>
                     <a:stretch>
                       <a:fillRect/>
                     </a:stretch>
@@ -4444,8 +5210,8 @@
         </w:pict>
       </w:r>
     </w:p>
-    <w:bookmarkEnd w:id="40"/>
-    <w:bookmarkStart w:id="44" w:name="step-4-digital-agreement-signatures"/>
+    <w:bookmarkEnd w:id="43"/>
+    <w:bookmarkStart w:id="47" w:name="step-4-digital-agreement-signatures"/>
     <w:p>
       <w:pPr>
         <w:pStyle w:val="Heading4"/>
@@ -4471,18 +5237,18 @@
           <wp:inline>
             <wp:extent cx="5334000" cy="3000764"/>
             <wp:effectExtent b="0" l="0" r="0" t="0"/>
-            <wp:docPr descr="Housekeeper Signature" title="" id="42" name="Picture"/>
+            <wp:docPr descr="Housekeeper Signature" title="" id="45" name="Picture"/>
             <a:graphic>
               <a:graphicData uri="http://schemas.openxmlformats.org/drawingml/2006/picture">
                 <pic:pic>
                   <pic:nvPicPr>
-                    <pic:cNvPr descr="/Users/suppu/.gemini/antigravity-ide/brain/ecb6a070-5721-4c3b-b257-5f28646b8d7b/housekeeper_signature_view_1783292228737.png" id="43" name="Picture"/>
+                    <pic:cNvPr descr="/Users/suppu/.gemini/antigravity-ide/brain/ecb6a070-5721-4c3b-b257-5f28646b8d7b/housekeeper_signature_view_1783292228737.png" id="46" name="Picture"/>
                     <pic:cNvPicPr>
                       <a:picLocks noChangeArrowheads="1" noChangeAspect="1"/>
                     </pic:cNvPicPr>
                   </pic:nvPicPr>
                   <pic:blipFill>
-                    <a:blip r:embed="rId41"/>
+                    <a:blip r:embed="rId44"/>
                     <a:stretch>
                       <a:fillRect/>
                     </a:stretch>
@@ -4524,8 +5290,8 @@
         </w:pict>
       </w:r>
     </w:p>
-    <w:bookmarkEnd w:id="44"/>
-    <w:bookmarkStart w:id="48" w:name="X7f316006622bb8fa5eb3c65229788c0ad78ecd5"/>
+    <w:bookmarkEnd w:id="47"/>
+    <w:bookmarkStart w:id="51" w:name="X7f316006622bb8fa5eb3c65229788c0ad78ecd5"/>
     <w:p>
       <w:pPr>
         <w:pStyle w:val="Heading4"/>
@@ -4551,18 +5317,18 @@
           <wp:inline>
             <wp:extent cx="5334000" cy="3000764"/>
             <wp:effectExtent b="0" l="0" r="0" t="0"/>
-            <wp:docPr descr="Signed Contract Details" title="" id="46" name="Picture"/>
+            <wp:docPr descr="Signed Contract Details" title="" id="49" name="Picture"/>
             <a:graphic>
               <a:graphicData uri="http://schemas.openxmlformats.org/drawingml/2006/picture">
                 <pic:pic>
                   <pic:nvPicPr>
-                    <pic:cNvPr descr="/Users/suppu/.gemini/antigravity-ide/brain/ecb6a070-5721-4c3b-b257-5f28646b8d7b/signed_agreement_details_view_1783292322324.png" id="47" name="Picture"/>
+                    <pic:cNvPr descr="/Users/suppu/.gemini/antigravity-ide/brain/ecb6a070-5721-4c3b-b257-5f28646b8d7b/signed_agreement_details_view_1783292322324.png" id="50" name="Picture"/>
                     <pic:cNvPicPr>
                       <a:picLocks noChangeArrowheads="1" noChangeAspect="1"/>
                     </pic:cNvPicPr>
                   </pic:nvPicPr>
                   <pic:blipFill>
-                    <a:blip r:embed="rId45"/>
+                    <a:blip r:embed="rId48"/>
                     <a:stretch>
                       <a:fillRect/>
                     </a:stretch>
@@ -4604,8 +5370,8 @@
         </w:pict>
       </w:r>
     </w:p>
-    <w:bookmarkEnd w:id="48"/>
-    <w:bookmarkStart w:id="52" w:name="step-6-dashboard-room-401-occupied"/>
+    <w:bookmarkEnd w:id="51"/>
+    <w:bookmarkStart w:id="55" w:name="step-6-dashboard-room-401-occupied"/>
     <w:p>
       <w:pPr>
         <w:pStyle w:val="Heading4"/>
@@ -4631,18 +5397,18 @@
           <wp:inline>
             <wp:extent cx="5334000" cy="3000764"/>
             <wp:effectExtent b="0" l="0" r="0" t="0"/>
-            <wp:docPr descr="Occupied Dashboard Room" title="" id="50" name="Picture"/>
+            <wp:docPr descr="Occupied Dashboard Room" title="" id="53" name="Picture"/>
             <a:graphic>
               <a:graphicData uri="http://schemas.openxmlformats.org/drawingml/2006/picture">
                 <pic:pic>
                   <pic:nvPicPr>
-                    <pic:cNvPr descr="/Users/suppu/.gemini/antigravity-ide/brain/ecb6a070-5721-4c3b-b257-5f28646b8d7b/dashboard_room_401_occupied_1783292427810.png" id="51" name="Picture"/>
+                    <pic:cNvPr descr="/Users/suppu/.gemini/antigravity-ide/brain/ecb6a070-5721-4c3b-b257-5f28646b8d7b/dashboard_room_401_occupied_1783292427810.png" id="54" name="Picture"/>
                     <pic:cNvPicPr>
                       <a:picLocks noChangeArrowheads="1" noChangeAspect="1"/>
                     </pic:cNvPicPr>
                   </pic:nvPicPr>
                   <pic:blipFill>
-                    <a:blip r:embed="rId49"/>
+                    <a:blip r:embed="rId52"/>
                     <a:stretch>
                       <a:fillRect/>
                     </a:stretch>
@@ -4684,8 +5450,8 @@
         </w:pict>
       </w:r>
     </w:p>
-    <w:bookmarkEnd w:id="52"/>
-    <w:bookmarkStart w:id="56" w:name="X4d09654541752762b39bef290b4e8ba8fcd8cb4"/>
+    <w:bookmarkEnd w:id="55"/>
+    <w:bookmarkStart w:id="59" w:name="X4d09654541752762b39bef290b4e8ba8fcd8cb4"/>
     <w:p>
       <w:pPr>
         <w:pStyle w:val="Heading4"/>
@@ -4711,18 +5477,18 @@
           <wp:inline>
             <wp:extent cx="5334000" cy="3000764"/>
             <wp:effectExtent b="0" l="0" r="0" t="0"/>
-            <wp:docPr descr="Checkout Step 1" title="" id="54" name="Picture"/>
+            <wp:docPr descr="Checkout Step 1" title="" id="57" name="Picture"/>
             <a:graphic>
               <a:graphicData uri="http://schemas.openxmlformats.org/drawingml/2006/picture">
                 <pic:pic>
                   <pic:nvPicPr>
-                    <pic:cNvPr descr="/Users/suppu/.gemini/antigravity-ide/brain/ecb6a070-5721-4c3b-b257-5f28646b8d7b/checkout_date_22_1783313384918.png" id="55" name="Picture"/>
+                    <pic:cNvPr descr="/Users/suppu/.gemini/antigravity-ide/brain/ecb6a070-5721-4c3b-b257-5f28646b8d7b/checkout_date_22_1783313384918.png" id="58" name="Picture"/>
                     <pic:cNvPicPr>
                       <a:picLocks noChangeArrowheads="1" noChangeAspect="1"/>
                     </pic:cNvPicPr>
                   </pic:nvPicPr>
                   <pic:blipFill>
-                    <a:blip r:embed="rId53"/>
+                    <a:blip r:embed="rId56"/>
                     <a:stretch>
                       <a:fillRect/>
                     </a:stretch>
@@ -4764,8 +5530,8 @@
         </w:pict>
       </w:r>
     </w:p>
-    <w:bookmarkEnd w:id="56"/>
-    <w:bookmarkStart w:id="60" w:name="X7afbde26454efef4357cf5e8f32bc8f458d939b"/>
+    <w:bookmarkEnd w:id="59"/>
+    <w:bookmarkStart w:id="63" w:name="X7afbde26454efef4357cf5e8f32bc8f458d939b"/>
     <w:p>
       <w:pPr>
         <w:pStyle w:val="Heading4"/>
@@ -4791,18 +5557,18 @@
           <wp:inline>
             <wp:extent cx="5334000" cy="3000764"/>
             <wp:effectExtent b="0" l="0" r="0" t="0"/>
-            <wp:docPr descr="Checkout Step 3" title="" id="58" name="Picture"/>
+            <wp:docPr descr="Checkout Step 3" title="" id="61" name="Picture"/>
             <a:graphic>
               <a:graphicData uri="http://schemas.openxmlformats.org/drawingml/2006/picture">
                 <pic:pic>
                   <pic:nvPicPr>
-                    <pic:cNvPr descr="/Users/suppu/.gemini/antigravity-ide/brain/ecb6a070-5721-4c3b-b257-5f28646b8d7b/checkout_settle_step_1783313422457.png" id="59" name="Picture"/>
+                    <pic:cNvPr descr="/Users/suppu/.gemini/antigravity-ide/brain/ecb6a070-5721-4c3b-b257-5f28646b8d7b/checkout_settle_step_1783313422457.png" id="62" name="Picture"/>
                     <pic:cNvPicPr>
                       <a:picLocks noChangeArrowheads="1" noChangeAspect="1"/>
                     </pic:cNvPicPr>
                   </pic:nvPicPr>
                   <pic:blipFill>
-                    <a:blip r:embed="rId57"/>
+                    <a:blip r:embed="rId60"/>
                     <a:stretch>
                       <a:fillRect/>
                     </a:stretch>
@@ -4844,8 +5610,8 @@
         </w:pict>
       </w:r>
     </w:p>
-    <w:bookmarkEnd w:id="60"/>
-    <w:bookmarkStart w:id="64" w:name="X24be72796b93f434b87a7199acc41c9c56cfd08"/>
+    <w:bookmarkEnd w:id="63"/>
+    <w:bookmarkStart w:id="67" w:name="X24be72796b93f434b87a7199acc41c9c56cfd08"/>
     <w:p>
       <w:pPr>
         <w:pStyle w:val="Heading4"/>
@@ -4871,18 +5637,18 @@
           <wp:inline>
             <wp:extent cx="5334000" cy="3000764"/>
             <wp:effectExtent b="0" l="0" r="0" t="0"/>
-            <wp:docPr descr="Vacant Dashboard Room" title="" id="62" name="Picture"/>
+            <wp:docPr descr="Vacant Dashboard Room" title="" id="65" name="Picture"/>
             <a:graphic>
               <a:graphicData uri="http://schemas.openxmlformats.org/drawingml/2006/picture">
                 <pic:pic>
                   <pic:nvPicPr>
-                    <pic:cNvPr descr="/Users/suppu/.gemini/antigravity-ide/brain/ecb6a070-5721-4c3b-b257-5f28646b8d7b/final_dashboard_vacant_1783313443477.png" id="63" name="Picture"/>
+                    <pic:cNvPr descr="/Users/suppu/.gemini/antigravity-ide/brain/ecb6a070-5721-4c3b-b257-5f28646b8d7b/final_dashboard_vacant_1783313443477.png" id="66" name="Picture"/>
                     <pic:cNvPicPr>
                       <a:picLocks noChangeArrowheads="1" noChangeAspect="1"/>
                     </pic:cNvPicPr>
                   </pic:nvPicPr>
                   <pic:blipFill>
-                    <a:blip r:embed="rId61"/>
+                    <a:blip r:embed="rId64"/>
                     <a:stretch>
                       <a:fillRect/>
                     </a:stretch>
@@ -4922,10 +5688,10 @@
         <w:br w:type="page"/>
       </w:r>
     </w:p>
-    <w:bookmarkEnd w:id="64"/>
-    <w:bookmarkEnd w:id="65"/>
-    <w:bookmarkEnd w:id="66"/>
-    <w:bookmarkStart w:id="67" w:name="conclusion"/>
+    <w:bookmarkEnd w:id="67"/>
+    <w:bookmarkEnd w:id="68"/>
+    <w:bookmarkEnd w:id="69"/>
+    <w:bookmarkStart w:id="70" w:name="conclusion"/>
     <w:p>
       <w:pPr>
         <w:pStyle w:val="Heading2"/>
@@ -4949,7 +5715,7 @@
         <w:t xml:space="preserve"> </w:t>
       </w:r>
       <w:r>
-        <w:t xml:space="preserve">successfully resolves the core operational challenges of property management in Kathmandu. Through local SQLite architecture, it ensures full offline performance in concrete structures. It integrates Bikram Sambat calendar billing and sub-meter math to automate complex monthly rent calculations. The double-confirmation cash flow protects transactions from disputes, while the rating review system helps establish a reliable reputation index for tenants and landlords. Finally, native biometrics authentication provides reliable local-first security safeguarding renter privacy records.</w:t>
+        <w:t xml:space="preserve">successfully resolves the core operational challenges of property management in Kathmandu. Through local SQLite architecture, it ensures full offline performance in concrete structures. It integrates Bikram Sambat calendar billing and sub-meter math to automate complex monthly rent calculations. The double-confirmation cash flow protects transactions from disputes, while the rating review system helps establish a reliable reputation index for tenants and landlords. Finally, native biometrics authentication, personalized theme swappers, dual language localizations, and Khalti link features ensure that the checkbook is private, usable, and transaction-ready.</w:t>
       </w:r>
     </w:p>
     <w:p>
@@ -4960,8 +5726,8 @@
         <w:t xml:space="preserve">The codebase compiles with zero TypeScript errors, has complete integration test coverage, and has been verified end-to-end. It is fully ready for client deployment.</w:t>
       </w:r>
     </w:p>
-    <w:bookmarkEnd w:id="67"/>
-    <w:bookmarkEnd w:id="68"/>
+    <w:bookmarkEnd w:id="70"/>
+    <w:bookmarkEnd w:id="71"/>
     <w:sectPr>
       <w:footnotePr>
         <w:numRestart w:val="eachSect"/>

</xml_diff>